<commit_message>
updating the documentation in the proper file
</commit_message>
<xml_diff>
--- a/Senior Project Documentation.docx
+++ b/Senior Project Documentation.docx
@@ -59,7 +59,7 @@
           <w:sz w:val="40"/>
           <w:szCs w:val="40"/>
         </w:rPr>
-        <w:t>AI-Controlled Connect Four Game</w:t>
+        <w:t>Turn-Based Game</w:t>
       </w:r>
     </w:p>
     <w:p>
@@ -90,16 +90,7 @@
           <w:sz w:val="40"/>
           <w:szCs w:val="40"/>
         </w:rPr>
-        <w:t>Fady Abdalla</w:t>
-      </w:r>
-      <w:r>
-        <w:rPr>
-          <w:rFonts w:cs="Arial"/>
-          <w:b/>
-          <w:sz w:val="40"/>
-          <w:szCs w:val="40"/>
-        </w:rPr>
-        <w:t>, ID#</w:t>
+        <w:t>Fady Abdalla, ID#</w:t>
       </w:r>
     </w:p>
     <w:p>
@@ -155,6 +146,7 @@
         </w:rPr>
         <w:t xml:space="preserve">:  </w:t>
       </w:r>
+      <w:proofErr w:type="gramStart"/>
       <w:r>
         <w:rPr>
           <w:rFonts w:cs="Arial"/>
@@ -171,7 +163,17 @@
           <w:sz w:val="32"/>
           <w:szCs w:val="32"/>
         </w:rPr>
-        <w:t xml:space="preserve">  , Date: </w:t>
+        <w:t xml:space="preserve">  ,</w:t>
+      </w:r>
+      <w:proofErr w:type="gramEnd"/>
+      <w:r>
+        <w:rPr>
+          <w:rFonts w:cs="Arial"/>
+          <w:b/>
+          <w:sz w:val="32"/>
+          <w:szCs w:val="32"/>
+        </w:rPr>
+        <w:t xml:space="preserve"> Date: </w:t>
       </w:r>
       <w:r>
         <w:rPr>
@@ -244,6 +246,7 @@
         </w:rPr>
         <w:t xml:space="preserve">Supervisor:  </w:t>
       </w:r>
+      <w:proofErr w:type="gramStart"/>
       <w:r>
         <w:rPr>
           <w:rFonts w:cs="Arial"/>
@@ -260,7 +263,17 @@
           <w:sz w:val="32"/>
           <w:szCs w:val="32"/>
         </w:rPr>
-        <w:t xml:space="preserve">  , Date: </w:t>
+        <w:t xml:space="preserve">  ,</w:t>
+      </w:r>
+      <w:proofErr w:type="gramEnd"/>
+      <w:r>
+        <w:rPr>
+          <w:rFonts w:cs="Arial"/>
+          <w:b/>
+          <w:sz w:val="32"/>
+          <w:szCs w:val="32"/>
+        </w:rPr>
+        <w:t xml:space="preserve"> Date: </w:t>
       </w:r>
       <w:r>
         <w:rPr>
@@ -646,7 +659,21 @@
         <w:rPr>
           <w:rFonts w:cs="Arial"/>
         </w:rPr>
-        <w:t xml:space="preserve">under the supervision of ….. All sources, used in development, are cited in the text and in </w:t>
+        <w:t xml:space="preserve">under the supervision of </w:t>
+      </w:r>
+      <w:proofErr w:type="gramStart"/>
+      <w:r>
+        <w:rPr>
+          <w:rFonts w:cs="Arial"/>
+        </w:rPr>
+        <w:t>…..</w:t>
+      </w:r>
+      <w:proofErr w:type="gramEnd"/>
+      <w:r>
+        <w:rPr>
+          <w:rFonts w:cs="Arial"/>
+        </w:rPr>
+        <w:t xml:space="preserve"> All sources, used in development, are cited in the text and in </w:t>
       </w:r>
       <w:r>
         <w:rPr>
@@ -861,13 +888,7 @@
           <w:rPr>
             <w:rStyle w:val="Hyperlink"/>
           </w:rPr>
-          <w:t>https://github.com/mxgmn/WaveFunctionCollaps</w:t>
-        </w:r>
-        <w:r>
-          <w:rPr>
-            <w:rStyle w:val="Hyperlink"/>
-          </w:rPr>
-          <w:t>e</w:t>
+          <w:t>https://github.com/mxgmn/WaveFunctionCollapse</w:t>
         </w:r>
       </w:hyperlink>
     </w:p>
@@ -881,12 +902,45 @@
         </w:r>
       </w:hyperlink>
     </w:p>
+    <w:p>
+      <w:hyperlink r:id="rId14" w:history="1">
+        <w:r>
+          <w:rPr>
+            <w:rStyle w:val="Hyperlink"/>
+          </w:rPr>
+          <w:t>https://theory.stanford.edu/~amitp/GameProgramming/AStarComparison.html</w:t>
+        </w:r>
+      </w:hyperlink>
+    </w:p>
+    <w:p>
+      <w:hyperlink r:id="rId15" w:history="1">
+        <w:r>
+          <w:rPr>
+            <w:rStyle w:val="Hyperlink"/>
+          </w:rPr>
+          <w:t>https://www.geeksforgeeks.org/dsa/a-search-algorithm/</w:t>
+        </w:r>
+      </w:hyperlink>
+    </w:p>
+    <w:p>
+      <w:hyperlink r:id="rId16" w:history="1">
+        <w:r>
+          <w:rPr>
+            <w:rStyle w:val="Hyperlink"/>
+          </w:rPr>
+          <w:t>https://www.baeldung.com/java-a-star-pathfinding</w:t>
+        </w:r>
+      </w:hyperlink>
+    </w:p>
+    <w:p/>
+    <w:p/>
     <w:p/>
     <w:p/>
     <w:p/>
     <w:p/>
     <w:p/>
     <w:sectPr>
+      <w:footerReference w:type="default" r:id="rId17"/>
       <w:pgSz w:w="12240" w:h="15840"/>
       <w:pgMar w:top="1440" w:right="1440" w:bottom="1440" w:left="1440" w:header="720" w:footer="720" w:gutter="0"/>
       <w:pgNumType w:start="0"/>
@@ -924,6 +978,59 @@
 </file>
 
 <file path=word/footer1.xml><?xml version="1.0" encoding="utf-8"?>
+<w:ftr xmlns:wpc="http://schemas.microsoft.com/office/word/2010/wordprocessingCanvas" xmlns:cx="http://schemas.microsoft.com/office/drawing/2014/chartex" xmlns:cx1="http://schemas.microsoft.com/office/drawing/2015/9/8/chartex" xmlns:cx2="http://schemas.microsoft.com/office/drawing/2015/10/21/chartex" xmlns:cx3="http://schemas.microsoft.com/office/drawing/2016/5/9/chartex" xmlns:cx4="http://schemas.microsoft.com/office/drawing/2016/5/10/chartex" xmlns:cx5="http://schemas.microsoft.com/office/drawing/2016/5/11/chartex" xmlns:cx6="http://schemas.microsoft.com/office/drawing/2016/5/12/chartex" xmlns:cx7="http://schemas.microsoft.com/office/drawing/2016/5/13/chartex" xmlns:cx8="http://schemas.microsoft.com/office/drawing/2016/5/14/chartex" xmlns:mc="http://schemas.openxmlformats.org/markup-compatibility/2006" xmlns:aink="http://schemas.microsoft.com/office/drawing/2016/ink" xmlns:am3d="http://schemas.microsoft.com/office/drawing/2017/model3d" xmlns:o="urn:schemas-microsoft-com:office:office" xmlns:oel="http://schemas.microsoft.com/office/2019/extlst" xmlns:r="http://schemas.openxmlformats.org/officeDocument/2006/relationships" xmlns:m="http://schemas.openxmlformats.org/officeDocument/2006/math" xmlns:v="urn:schemas-microsoft-com:vml" xmlns:wp14="http://schemas.microsoft.com/office/word/2010/wordprocessingDrawing" xmlns:wp="http://schemas.openxmlformats.org/drawingml/2006/wordprocessingDrawing" xmlns:w10="urn:schemas-microsoft-com:office:word" xmlns:w="http://schemas.openxmlformats.org/wordprocessingml/2006/main" xmlns:w14="http://schemas.microsoft.com/office/word/2010/wordml" xmlns:w15="http://schemas.microsoft.com/office/word/2012/wordml" xmlns:w16cex="http://schemas.microsoft.com/office/word/2018/wordml/cex" xmlns:w16cid="http://schemas.microsoft.com/office/word/2016/wordml/cid" xmlns:w16="http://schemas.microsoft.com/office/word/2018/wordml" xmlns:w16du="http://schemas.microsoft.com/office/word/2023/wordml/word16du" xmlns:w16sdtdh="http://schemas.microsoft.com/office/word/2020/wordml/sdtdatahash" xmlns:w16sdtfl="http://schemas.microsoft.com/office/word/2024/wordml/sdtformatlock" xmlns:w16se="http://schemas.microsoft.com/office/word/2015/wordml/symex" xmlns:wpg="http://schemas.microsoft.com/office/word/2010/wordprocessingGroup" xmlns:wpi="http://schemas.microsoft.com/office/word/2010/wordprocessingInk" xmlns:wne="http://schemas.microsoft.com/office/word/2006/wordml" xmlns:wps="http://schemas.microsoft.com/office/word/2010/wordprocessingShape" mc:Ignorable="w14 w15 w16se w16cid w16 w16cex w16sdtdh w16sdtfl w16du wp14">
+  <w:sdt>
+    <w:sdtPr>
+      <w:id w:val="-242961078"/>
+      <w:docPartObj>
+        <w:docPartGallery w:val="Page Numbers (Bottom of Page)"/>
+        <w:docPartUnique/>
+      </w:docPartObj>
+    </w:sdtPr>
+    <w:sdtEndPr>
+      <w:rPr>
+        <w:noProof/>
+      </w:rPr>
+    </w:sdtEndPr>
+    <w:sdtContent>
+      <w:p>
+        <w:pPr>
+          <w:pStyle w:val="Footer"/>
+          <w:jc w:val="right"/>
+        </w:pPr>
+        <w:r>
+          <w:fldChar w:fldCharType="begin"/>
+        </w:r>
+        <w:r>
+          <w:instrText xml:space="preserve"> PAGE   \* MERGEFORMAT </w:instrText>
+        </w:r>
+        <w:r>
+          <w:fldChar w:fldCharType="separate"/>
+        </w:r>
+        <w:r>
+          <w:rPr>
+            <w:noProof/>
+          </w:rPr>
+          <w:t>2</w:t>
+        </w:r>
+        <w:r>
+          <w:rPr>
+            <w:noProof/>
+          </w:rPr>
+          <w:fldChar w:fldCharType="end"/>
+        </w:r>
+      </w:p>
+    </w:sdtContent>
+  </w:sdt>
+  <w:p>
+    <w:pPr>
+      <w:pStyle w:val="Footer"/>
+    </w:pPr>
+  </w:p>
+</w:ftr>
+</file>
+
+<file path=word/footer2.xml><?xml version="1.0" encoding="utf-8"?>
 <w:ftr xmlns:wpc="http://schemas.microsoft.com/office/word/2010/wordprocessingCanvas" xmlns:cx="http://schemas.microsoft.com/office/drawing/2014/chartex" xmlns:cx1="http://schemas.microsoft.com/office/drawing/2015/9/8/chartex" xmlns:cx2="http://schemas.microsoft.com/office/drawing/2015/10/21/chartex" xmlns:cx3="http://schemas.microsoft.com/office/drawing/2016/5/9/chartex" xmlns:cx4="http://schemas.microsoft.com/office/drawing/2016/5/10/chartex" xmlns:cx5="http://schemas.microsoft.com/office/drawing/2016/5/11/chartex" xmlns:cx6="http://schemas.microsoft.com/office/drawing/2016/5/12/chartex" xmlns:cx7="http://schemas.microsoft.com/office/drawing/2016/5/13/chartex" xmlns:cx8="http://schemas.microsoft.com/office/drawing/2016/5/14/chartex" xmlns:mc="http://schemas.openxmlformats.org/markup-compatibility/2006" xmlns:aink="http://schemas.microsoft.com/office/drawing/2016/ink" xmlns:am3d="http://schemas.microsoft.com/office/drawing/2017/model3d" xmlns:o="urn:schemas-microsoft-com:office:office" xmlns:oel="http://schemas.microsoft.com/office/2019/extlst" xmlns:r="http://schemas.openxmlformats.org/officeDocument/2006/relationships" xmlns:m="http://schemas.openxmlformats.org/officeDocument/2006/math" xmlns:v="urn:schemas-microsoft-com:vml" xmlns:wp14="http://schemas.microsoft.com/office/word/2010/wordprocessingDrawing" xmlns:wp="http://schemas.openxmlformats.org/drawingml/2006/wordprocessingDrawing" xmlns:w10="urn:schemas-microsoft-com:office:word" xmlns:w="http://schemas.openxmlformats.org/wordprocessingml/2006/main" xmlns:w14="http://schemas.microsoft.com/office/word/2010/wordml" xmlns:w15="http://schemas.microsoft.com/office/word/2012/wordml" xmlns:w16cex="http://schemas.microsoft.com/office/word/2018/wordml/cex" xmlns:w16cid="http://schemas.microsoft.com/office/word/2016/wordml/cid" xmlns:w16="http://schemas.microsoft.com/office/word/2018/wordml" xmlns:w16du="http://schemas.microsoft.com/office/word/2023/wordml/word16du" xmlns:w16sdtdh="http://schemas.microsoft.com/office/word/2020/wordml/sdtdatahash" xmlns:w16sdtfl="http://schemas.microsoft.com/office/word/2024/wordml/sdtformatlock" xmlns:w16se="http://schemas.microsoft.com/office/word/2015/wordml/symex" xmlns:wpg="http://schemas.microsoft.com/office/word/2010/wordprocessingGroup" xmlns:wpi="http://schemas.microsoft.com/office/word/2010/wordprocessingInk" xmlns:wne="http://schemas.microsoft.com/office/word/2006/wordml" xmlns:wps="http://schemas.microsoft.com/office/word/2010/wordprocessingShape" mc:Ignorable="w14 w15 w16se w16cid w16 w16cex w16sdtdh w16sdtfl w16du wp14">
   <w:sdt>
     <w:sdtPr>
@@ -2613,6 +2720,27 @@
 </file>
 
 <file path=customXml/item1.xml><?xml version="1.0" encoding="utf-8"?>
+<b:Sources xmlns:b="http://schemas.openxmlformats.org/officeDocument/2006/bibliography" xmlns="http://schemas.openxmlformats.org/officeDocument/2006/bibliography" SelectedStyle="\CHICAGO.XSL" StyleName="Chicago" Version="16"/>
+</file>
+
+<file path=customXml/item2.xml><?xml version="1.0" encoding="utf-8"?>
+<?mso-contentType ?>
+<FormTemplates xmlns="http://schemas.microsoft.com/sharepoint/v3/contenttype/forms">
+  <Display>DocumentLibraryForm</Display>
+  <Edit>DocumentLibraryForm</Edit>
+  <New>DocumentLibraryForm</New>
+</FormTemplates>
+</file>
+
+<file path=customXml/item3.xml><?xml version="1.0" encoding="utf-8"?>
+<p:properties xmlns:p="http://schemas.microsoft.com/office/2006/metadata/properties" xmlns:xsi="http://www.w3.org/2001/XMLSchema-instance" xmlns:pc="http://schemas.microsoft.com/office/infopath/2007/PartnerControls">
+  <documentManagement>
+    <_activity xmlns="ee3fa869-338d-409e-ad68-ffdda0f66e0e" xsi:nil="true"/>
+  </documentManagement>
+</p:properties>
+</file>
+
+<file path=customXml/item4.xml><?xml version="1.0" encoding="utf-8"?>
 <ct:contentTypeSchema xmlns:ct="http://schemas.microsoft.com/office/2006/metadata/contentType" xmlns:ma="http://schemas.microsoft.com/office/2006/metadata/properties/metaAttributes" ct:_="" ma:_="" ma:contentTypeName="Document" ma:contentTypeID="0x010100AD9183C183CE7F4182736E7B6FAA1471" ma:contentTypeVersion="8" ma:contentTypeDescription="Create a new document." ma:contentTypeScope="" ma:versionID="6d9203e069f829f0903450143aca9827">
   <xsd:schema xmlns:xsd="http://www.w3.org/2001/XMLSchema" xmlns:xs="http://www.w3.org/2001/XMLSchema" xmlns:p="http://schemas.microsoft.com/office/2006/metadata/properties" xmlns:ns3="ee3fa869-338d-409e-ad68-ffdda0f66e0e" targetNamespace="http://schemas.microsoft.com/office/2006/metadata/properties" ma:root="true" ma:fieldsID="f7623c952454e8b59aafc1a5970208e8" ns3:_="">
     <xsd:import namespace="ee3fa869-338d-409e-ad68-ffdda0f66e0e"/>
@@ -2780,28 +2908,33 @@
 </ct:contentTypeSchema>
 </file>
 
-<file path=customXml/item2.xml><?xml version="1.0" encoding="utf-8"?>
-<p:properties xmlns:p="http://schemas.microsoft.com/office/2006/metadata/properties" xmlns:xsi="http://www.w3.org/2001/XMLSchema-instance" xmlns:pc="http://schemas.microsoft.com/office/infopath/2007/PartnerControls">
-  <documentManagement>
-    <_activity xmlns="ee3fa869-338d-409e-ad68-ffdda0f66e0e" xsi:nil="true"/>
-  </documentManagement>
-</p:properties>
+<file path=customXml/itemProps1.xml><?xml version="1.0" encoding="utf-8"?>
+<ds:datastoreItem xmlns:ds="http://schemas.openxmlformats.org/officeDocument/2006/customXml" ds:itemID="{9A5736F4-0B3E-49EF-BCE1-D4A1CABF672A}">
+  <ds:schemaRefs>
+    <ds:schemaRef ds:uri="http://schemas.openxmlformats.org/officeDocument/2006/bibliography"/>
+  </ds:schemaRefs>
+</ds:datastoreItem>
 </file>
 
-<file path=customXml/item3.xml><?xml version="1.0" encoding="utf-8"?>
-<?mso-contentType ?>
-<FormTemplates xmlns="http://schemas.microsoft.com/sharepoint/v3/contenttype/forms">
-  <Display>DocumentLibraryForm</Display>
-  <Edit>DocumentLibraryForm</Edit>
-  <New>DocumentLibraryForm</New>
-</FormTemplates>
+<file path=customXml/itemProps2.xml><?xml version="1.0" encoding="utf-8"?>
+<ds:datastoreItem xmlns:ds="http://schemas.openxmlformats.org/officeDocument/2006/customXml" ds:itemID="{2ACA8AA5-7236-49FE-8474-E5B5E827EE13}">
+  <ds:schemaRefs>
+    <ds:schemaRef ds:uri="http://schemas.microsoft.com/sharepoint/v3/contenttype/forms"/>
+  </ds:schemaRefs>
+</ds:datastoreItem>
 </file>
 
-<file path=customXml/item4.xml><?xml version="1.0" encoding="utf-8"?>
-<b:Sources xmlns:b="http://schemas.openxmlformats.org/officeDocument/2006/bibliography" xmlns="http://schemas.openxmlformats.org/officeDocument/2006/bibliography" SelectedStyle="\CHICAGO.XSL" StyleName="Chicago" Version="16"/>
+<file path=customXml/itemProps3.xml><?xml version="1.0" encoding="utf-8"?>
+<ds:datastoreItem xmlns:ds="http://schemas.openxmlformats.org/officeDocument/2006/customXml" ds:itemID="{EE45B69F-367A-4C5D-B470-6FA84AFBF402}">
+  <ds:schemaRefs>
+    <ds:schemaRef ds:uri="http://schemas.microsoft.com/office/2006/metadata/properties"/>
+    <ds:schemaRef ds:uri="http://schemas.microsoft.com/office/infopath/2007/PartnerControls"/>
+    <ds:schemaRef ds:uri="ee3fa869-338d-409e-ad68-ffdda0f66e0e"/>
+  </ds:schemaRefs>
+</ds:datastoreItem>
 </file>
 
-<file path=customXml/itemProps1.xml><?xml version="1.0" encoding="utf-8"?>
+<file path=customXml/itemProps4.xml><?xml version="1.0" encoding="utf-8"?>
 <ds:datastoreItem xmlns:ds="http://schemas.openxmlformats.org/officeDocument/2006/customXml" ds:itemID="{2F06AB04-8380-4A85-87BC-21F16DB57454}">
   <ds:schemaRefs>
     <ds:schemaRef ds:uri="http://schemas.microsoft.com/office/2006/metadata/contentType"/>
@@ -2817,30 +2950,4 @@
     <ds:schemaRef ds:uri="http://schemas.microsoft.com/internal/obd"/>
   </ds:schemaRefs>
 </ds:datastoreItem>
-</file>
-
-<file path=customXml/itemProps2.xml><?xml version="1.0" encoding="utf-8"?>
-<ds:datastoreItem xmlns:ds="http://schemas.openxmlformats.org/officeDocument/2006/customXml" ds:itemID="{EE45B69F-367A-4C5D-B470-6FA84AFBF402}">
-  <ds:schemaRefs>
-    <ds:schemaRef ds:uri="http://schemas.microsoft.com/office/2006/metadata/properties"/>
-    <ds:schemaRef ds:uri="http://schemas.microsoft.com/office/infopath/2007/PartnerControls"/>
-    <ds:schemaRef ds:uri="ee3fa869-338d-409e-ad68-ffdda0f66e0e"/>
-  </ds:schemaRefs>
-</ds:datastoreItem>
-</file>
-
-<file path=customXml/itemProps3.xml><?xml version="1.0" encoding="utf-8"?>
-<ds:datastoreItem xmlns:ds="http://schemas.openxmlformats.org/officeDocument/2006/customXml" ds:itemID="{2ACA8AA5-7236-49FE-8474-E5B5E827EE13}">
-  <ds:schemaRefs>
-    <ds:schemaRef ds:uri="http://schemas.microsoft.com/sharepoint/v3/contenttype/forms"/>
-  </ds:schemaRefs>
-</ds:datastoreItem>
-</file>
-
-<file path=customXml/itemProps4.xml><?xml version="1.0" encoding="utf-8"?>
-<ds:datastoreItem xmlns:ds="http://schemas.openxmlformats.org/officeDocument/2006/customXml" ds:itemID="{9A5736F4-0B3E-49EF-BCE1-D4A1CABF672A}">
-  <ds:schemaRefs>
-    <ds:schemaRef ds:uri="http://schemas.openxmlformats.org/officeDocument/2006/bibliography"/>
-  </ds:schemaRefs>
-</ds:datastoreItem>
 </file>
</xml_diff>

<commit_message>
updating documentation links and working on the findpath
</commit_message>
<xml_diff>
--- a/Senior Project Documentation.docx
+++ b/Senior Project Documentation.docx
@@ -146,7 +146,6 @@
         </w:rPr>
         <w:t xml:space="preserve">:  </w:t>
       </w:r>
-      <w:proofErr w:type="gramStart"/>
       <w:r>
         <w:rPr>
           <w:rFonts w:cs="Arial"/>
@@ -163,17 +162,7 @@
           <w:sz w:val="32"/>
           <w:szCs w:val="32"/>
         </w:rPr>
-        <w:t xml:space="preserve">  ,</w:t>
-      </w:r>
-      <w:proofErr w:type="gramEnd"/>
-      <w:r>
-        <w:rPr>
-          <w:rFonts w:cs="Arial"/>
-          <w:b/>
-          <w:sz w:val="32"/>
-          <w:szCs w:val="32"/>
-        </w:rPr>
-        <w:t xml:space="preserve"> Date: </w:t>
+        <w:t xml:space="preserve">  , Date: </w:t>
       </w:r>
       <w:r>
         <w:rPr>
@@ -246,7 +235,6 @@
         </w:rPr>
         <w:t xml:space="preserve">Supervisor:  </w:t>
       </w:r>
-      <w:proofErr w:type="gramStart"/>
       <w:r>
         <w:rPr>
           <w:rFonts w:cs="Arial"/>
@@ -263,17 +251,7 @@
           <w:sz w:val="32"/>
           <w:szCs w:val="32"/>
         </w:rPr>
-        <w:t xml:space="preserve">  ,</w:t>
-      </w:r>
-      <w:proofErr w:type="gramEnd"/>
-      <w:r>
-        <w:rPr>
-          <w:rFonts w:cs="Arial"/>
-          <w:b/>
-          <w:sz w:val="32"/>
-          <w:szCs w:val="32"/>
-        </w:rPr>
-        <w:t xml:space="preserve"> Date: </w:t>
+        <w:t xml:space="preserve">  , Date: </w:t>
       </w:r>
       <w:r>
         <w:rPr>
@@ -659,21 +637,7 @@
         <w:rPr>
           <w:rFonts w:cs="Arial"/>
         </w:rPr>
-        <w:t xml:space="preserve">under the supervision of </w:t>
-      </w:r>
-      <w:proofErr w:type="gramStart"/>
-      <w:r>
-        <w:rPr>
-          <w:rFonts w:cs="Arial"/>
-        </w:rPr>
-        <w:t>…..</w:t>
-      </w:r>
-      <w:proofErr w:type="gramEnd"/>
-      <w:r>
-        <w:rPr>
-          <w:rFonts w:cs="Arial"/>
-        </w:rPr>
-        <w:t xml:space="preserve"> All sources, used in development, are cited in the text and in </w:t>
+        <w:t xml:space="preserve">under the supervision of ….. All sources, used in development, are cited in the text and in </w:t>
       </w:r>
       <w:r>
         <w:rPr>
@@ -908,7 +872,19 @@
           <w:rPr>
             <w:rStyle w:val="Hyperlink"/>
           </w:rPr>
-          <w:t>https://theory.stanford.edu/~amitp/GameProgramming/AStarComparison.html</w:t>
+          <w:t>https://theory.stanford.edu/~amitp/GameProgra</w:t>
+        </w:r>
+        <w:r>
+          <w:rPr>
+            <w:rStyle w:val="Hyperlink"/>
+          </w:rPr>
+          <w:t>m</w:t>
+        </w:r>
+        <w:r>
+          <w:rPr>
+            <w:rStyle w:val="Hyperlink"/>
+          </w:rPr>
+          <w:t>ming/AStarComparison.html</w:t>
         </w:r>
       </w:hyperlink>
     </w:p>
@@ -918,7 +894,19 @@
           <w:rPr>
             <w:rStyle w:val="Hyperlink"/>
           </w:rPr>
-          <w:t>https://www.geeksforgeeks.org/dsa/a-search-algorithm/</w:t>
+          <w:t>https://www.geeksforgeeks.org/ds</w:t>
+        </w:r>
+        <w:r>
+          <w:rPr>
+            <w:rStyle w:val="Hyperlink"/>
+          </w:rPr>
+          <w:t>a</w:t>
+        </w:r>
+        <w:r>
+          <w:rPr>
+            <w:rStyle w:val="Hyperlink"/>
+          </w:rPr>
+          <w:t>/a-search-algorithm/</w:t>
         </w:r>
       </w:hyperlink>
     </w:p>
@@ -928,10 +916,11 @@
           <w:rPr>
             <w:rStyle w:val="Hyperlink"/>
           </w:rPr>
-          <w:t>https://www.baeldung.com/java-a-star-pathfinding</w:t>
+          <w:t>https://www.baeldung.com/cs/a-star-algorithm</w:t>
         </w:r>
       </w:hyperlink>
     </w:p>
+    <w:p/>
     <w:p/>
     <w:p/>
     <w:p/>

</xml_diff>

<commit_message>
fixed the syntax in the if statement and fixed a small mistake with the map neighbor method as well as working on the documentation
</commit_message>
<xml_diff>
--- a/Senior Project Documentation.docx
+++ b/Senior Project Documentation.docx
@@ -4,717 +4,32 @@
   <w:body>
     <w:p>
       <w:pPr>
-        <w:jc w:val="center"/>
-        <w:rPr>
-          <w:rFonts w:cs="Arial"/>
-          <w:b/>
-          <w:sz w:val="40"/>
-          <w:szCs w:val="40"/>
-        </w:rPr>
-      </w:pPr>
-      <w:r>
-        <w:rPr>
-          <w:rFonts w:cs="Arial"/>
-          <w:b/>
-          <w:sz w:val="40"/>
-          <w:szCs w:val="40"/>
-        </w:rPr>
-        <w:t xml:space="preserve">Bulgarian </w:t>
-      </w:r>
-      <w:r>
-        <w:rPr>
-          <w:rFonts w:cs="Arial"/>
-          <w:b/>
-          <w:sz w:val="40"/>
-          <w:szCs w:val="40"/>
-        </w:rPr>
-        <w:t>Diploma Thesis</w:t>
-      </w:r>
-    </w:p>
-    <w:p>
-      <w:pPr>
-        <w:jc w:val="center"/>
-        <w:rPr>
-          <w:rFonts w:cs="Arial"/>
-          <w:b/>
-          <w:sz w:val="40"/>
-          <w:szCs w:val="40"/>
-        </w:rPr>
-      </w:pPr>
-    </w:p>
-    <w:p>
-      <w:pPr>
-        <w:jc w:val="center"/>
-        <w:rPr>
-          <w:rFonts w:cs="Arial"/>
-          <w:b/>
-          <w:sz w:val="40"/>
-          <w:szCs w:val="40"/>
-        </w:rPr>
-      </w:pPr>
-      <w:r>
-        <w:rPr>
-          <w:rFonts w:cs="Arial"/>
-          <w:b/>
-          <w:sz w:val="40"/>
-          <w:szCs w:val="40"/>
-        </w:rPr>
-        <w:t>Turn-Based Game</w:t>
-      </w:r>
-    </w:p>
-    <w:p>
-      <w:pPr>
-        <w:jc w:val="center"/>
-        <w:rPr>
-          <w:rFonts w:cs="Arial"/>
-          <w:b/>
-          <w:sz w:val="40"/>
-          <w:szCs w:val="40"/>
-        </w:rPr>
-      </w:pPr>
-    </w:p>
-    <w:p>
-      <w:pPr>
-        <w:jc w:val="center"/>
-        <w:rPr>
-          <w:rFonts w:cs="Arial"/>
-          <w:b/>
-          <w:sz w:val="40"/>
-          <w:szCs w:val="40"/>
-        </w:rPr>
-      </w:pPr>
-      <w:r>
-        <w:rPr>
-          <w:rFonts w:cs="Arial"/>
-          <w:b/>
-          <w:sz w:val="40"/>
-          <w:szCs w:val="40"/>
-        </w:rPr>
-        <w:t>Fady Abdalla, ID#</w:t>
-      </w:r>
-    </w:p>
-    <w:p>
-      <w:pPr>
-        <w:jc w:val="center"/>
-        <w:rPr>
-          <w:rFonts w:cs="Arial"/>
-          <w:b/>
-          <w:sz w:val="40"/>
-          <w:szCs w:val="40"/>
-        </w:rPr>
-      </w:pPr>
-    </w:p>
-    <w:p>
-      <w:pPr>
-        <w:jc w:val="center"/>
-        <w:rPr>
-          <w:rFonts w:cs="Arial"/>
-          <w:b/>
-          <w:sz w:val="40"/>
-          <w:szCs w:val="40"/>
-        </w:rPr>
-      </w:pPr>
-    </w:p>
-    <w:p>
-      <w:pPr>
-        <w:tabs>
-          <w:tab w:val="left" w:pos="5040"/>
-          <w:tab w:val="left" w:pos="7920"/>
-        </w:tabs>
-        <w:rPr>
-          <w:rFonts w:cs="Arial"/>
-          <w:b/>
-          <w:sz w:val="32"/>
-          <w:szCs w:val="32"/>
-        </w:rPr>
-      </w:pPr>
-      <w:r>
-        <w:rPr>
-          <w:rFonts w:cs="Arial"/>
-          <w:b/>
-          <w:sz w:val="32"/>
-          <w:szCs w:val="32"/>
-        </w:rPr>
-        <w:t>Student</w:t>
-      </w:r>
-      <w:r>
-        <w:rPr>
-          <w:rFonts w:cs="Arial"/>
-          <w:b/>
-          <w:sz w:val="32"/>
-          <w:szCs w:val="32"/>
-        </w:rPr>
-        <w:t xml:space="preserve">:  </w:t>
-      </w:r>
-      <w:r>
-        <w:rPr>
-          <w:rFonts w:cs="Arial"/>
-          <w:sz w:val="32"/>
-          <w:szCs w:val="32"/>
-          <w:u w:val="single"/>
-        </w:rPr>
-        <w:tab/>
-      </w:r>
-      <w:r>
-        <w:rPr>
-          <w:rFonts w:cs="Arial"/>
-          <w:b/>
-          <w:sz w:val="32"/>
-          <w:szCs w:val="32"/>
-        </w:rPr>
-        <w:t xml:space="preserve">  , Date: </w:t>
-      </w:r>
-      <w:r>
-        <w:rPr>
-          <w:rFonts w:cs="Arial"/>
-          <w:sz w:val="32"/>
-          <w:szCs w:val="32"/>
-          <w:u w:val="single"/>
-        </w:rPr>
-        <w:tab/>
-      </w:r>
-    </w:p>
-    <w:p>
-      <w:pPr>
-        <w:tabs>
-          <w:tab w:val="left" w:pos="1980"/>
-          <w:tab w:val="left" w:pos="5040"/>
-          <w:tab w:val="left" w:pos="7920"/>
-        </w:tabs>
-        <w:rPr>
-          <w:rFonts w:cs="Arial"/>
-          <w:i/>
-          <w:sz w:val="20"/>
-          <w:szCs w:val="20"/>
-        </w:rPr>
-      </w:pPr>
-      <w:r>
-        <w:rPr>
-          <w:rFonts w:cs="Arial"/>
-          <w:i/>
-          <w:sz w:val="20"/>
-          <w:szCs w:val="20"/>
-        </w:rPr>
-        <w:tab/>
-        <w:t>signature</w:t>
-      </w:r>
-    </w:p>
-    <w:p>
-      <w:pPr>
-        <w:tabs>
-          <w:tab w:val="left" w:pos="5040"/>
-          <w:tab w:val="left" w:pos="7920"/>
-        </w:tabs>
-        <w:rPr>
-          <w:rFonts w:cs="Arial"/>
-          <w:b/>
-          <w:sz w:val="32"/>
-          <w:szCs w:val="32"/>
-        </w:rPr>
-      </w:pPr>
-    </w:p>
-    <w:p>
-      <w:pPr>
-        <w:tabs>
-          <w:tab w:val="left" w:pos="5040"/>
-          <w:tab w:val="left" w:pos="7920"/>
-        </w:tabs>
-        <w:rPr>
-          <w:rFonts w:cs="Arial"/>
-          <w:b/>
-          <w:sz w:val="32"/>
-          <w:szCs w:val="32"/>
-        </w:rPr>
-      </w:pPr>
-      <w:r>
-        <w:rPr>
-          <w:rFonts w:cs="Arial"/>
-          <w:b/>
-          <w:sz w:val="32"/>
-          <w:szCs w:val="32"/>
-        </w:rPr>
-        <w:t xml:space="preserve">Supervisor:  </w:t>
-      </w:r>
-      <w:r>
-        <w:rPr>
-          <w:rFonts w:cs="Arial"/>
-          <w:sz w:val="32"/>
-          <w:szCs w:val="32"/>
-          <w:u w:val="single"/>
-        </w:rPr>
-        <w:tab/>
-      </w:r>
-      <w:r>
-        <w:rPr>
-          <w:rFonts w:cs="Arial"/>
-          <w:b/>
-          <w:sz w:val="32"/>
-          <w:szCs w:val="32"/>
-        </w:rPr>
-        <w:t xml:space="preserve">  , Date: </w:t>
-      </w:r>
-      <w:r>
-        <w:rPr>
-          <w:rFonts w:cs="Arial"/>
-          <w:sz w:val="32"/>
-          <w:szCs w:val="32"/>
-          <w:u w:val="single"/>
-        </w:rPr>
-        <w:tab/>
-      </w:r>
-    </w:p>
-    <w:p>
-      <w:pPr>
-        <w:tabs>
-          <w:tab w:val="left" w:pos="1980"/>
-          <w:tab w:val="left" w:pos="5040"/>
-          <w:tab w:val="left" w:pos="7920"/>
-        </w:tabs>
-        <w:rPr>
-          <w:rFonts w:cs="Arial"/>
-          <w:i/>
-          <w:sz w:val="20"/>
-          <w:szCs w:val="20"/>
-        </w:rPr>
-      </w:pPr>
-      <w:r>
-        <w:rPr>
-          <w:rFonts w:cs="Arial"/>
-          <w:i/>
-          <w:sz w:val="20"/>
-          <w:szCs w:val="20"/>
-        </w:rPr>
-        <w:tab/>
-        <w:t>signature</w:t>
-      </w:r>
-    </w:p>
-    <w:p>
-      <w:pPr>
-        <w:rPr>
-          <w:rFonts w:cs="Arial"/>
-        </w:rPr>
-      </w:pPr>
-    </w:p>
-    <w:p>
-      <w:pPr>
-        <w:rPr>
-          <w:rFonts w:cs="Arial"/>
-        </w:rPr>
-      </w:pPr>
-    </w:p>
-    <w:p>
-      <w:pPr>
-        <w:rPr>
-          <w:rFonts w:cs="Arial"/>
-        </w:rPr>
-      </w:pPr>
-    </w:p>
-    <w:p>
-      <w:pPr>
-        <w:jc w:val="center"/>
-        <w:rPr>
-          <w:rFonts w:cs="Arial"/>
-          <w:b/>
-          <w:color w:val="000000"/>
-          <w:sz w:val="36"/>
-          <w:szCs w:val="36"/>
-        </w:rPr>
-      </w:pPr>
-      <w:r>
-        <w:rPr>
-          <w:rFonts w:cs="Arial"/>
-          <w:b/>
-          <w:color w:val="000000"/>
-          <w:sz w:val="36"/>
-          <w:szCs w:val="36"/>
-        </w:rPr>
-        <w:t xml:space="preserve">Department of Computer Science, AUBG </w:t>
-      </w:r>
-    </w:p>
-    <w:p>
-      <w:pPr>
-        <w:jc w:val="center"/>
-        <w:rPr>
-          <w:rFonts w:cs="Arial"/>
-          <w:b/>
-          <w:sz w:val="36"/>
-          <w:szCs w:val="36"/>
-        </w:rPr>
-        <w:sectPr>
-          <w:footerReference w:type="default" r:id="rId11"/>
-          <w:pgSz w:w="12240" w:h="15840" w:code="1"/>
-          <w:pgMar w:top="1440" w:right="1800" w:bottom="1440" w:left="1800" w:header="720" w:footer="720" w:gutter="0"/>
-          <w:cols w:space="720"/>
-          <w:noEndnote/>
-          <w:titlePg/>
-        </w:sectPr>
-      </w:pPr>
-      <w:r>
-        <w:rPr>
-          <w:rFonts w:cs="Arial"/>
-          <w:b/>
-          <w:sz w:val="36"/>
-          <w:szCs w:val="36"/>
-        </w:rPr>
-        <w:t>Blagoevgrad, 202</w:t>
-      </w:r>
-      <w:r>
-        <w:rPr>
-          <w:rFonts w:cs="Arial"/>
-          <w:b/>
-          <w:sz w:val="36"/>
-          <w:szCs w:val="36"/>
-        </w:rPr>
-        <w:t>6</w:t>
-      </w:r>
-    </w:p>
-    <w:p>
-      <w:pPr>
-        <w:jc w:val="both"/>
-        <w:rPr>
-          <w:rFonts w:cs="Arial"/>
-          <w:b/>
-          <w:sz w:val="28"/>
-          <w:szCs w:val="28"/>
-        </w:rPr>
-      </w:pPr>
-      <w:r>
-        <w:rPr>
-          <w:rFonts w:cs="Arial"/>
-          <w:b/>
-          <w:sz w:val="28"/>
-          <w:szCs w:val="28"/>
-        </w:rPr>
-        <w:lastRenderedPageBreak/>
-        <w:t xml:space="preserve">Declaration template for Senior Project </w:t>
-      </w:r>
-      <w:r>
-        <w:rPr>
-          <w:rFonts w:cs="Arial"/>
-          <w:b/>
-          <w:sz w:val="28"/>
-          <w:szCs w:val="28"/>
-          <w:u w:val="single"/>
-        </w:rPr>
-        <w:t>and</w:t>
-      </w:r>
-      <w:r>
-        <w:rPr>
-          <w:rFonts w:cs="Arial"/>
-          <w:b/>
-          <w:sz w:val="28"/>
-          <w:szCs w:val="28"/>
-        </w:rPr>
-        <w:t xml:space="preserve"> Diploma Thesis</w:t>
-      </w:r>
-    </w:p>
-    <w:p>
-      <w:pPr>
-        <w:jc w:val="both"/>
-        <w:rPr>
-          <w:rFonts w:cs="Arial"/>
-          <w:b/>
-          <w:sz w:val="28"/>
-          <w:szCs w:val="28"/>
-        </w:rPr>
-      </w:pPr>
-    </w:p>
-    <w:p>
-      <w:pPr>
-        <w:jc w:val="both"/>
-        <w:rPr>
-          <w:rFonts w:cs="Arial"/>
-        </w:rPr>
-      </w:pPr>
-      <w:r>
-        <w:rPr>
-          <w:rFonts w:cs="Arial"/>
-          <w:b/>
-        </w:rPr>
-        <w:t>Title</w:t>
-      </w:r>
-      <w:r>
-        <w:rPr>
-          <w:rFonts w:cs="Arial"/>
-        </w:rPr>
-        <w:t>:</w:t>
-      </w:r>
-      <w:r>
-        <w:rPr>
-          <w:rFonts w:cs="Arial"/>
-        </w:rPr>
-        <w:tab/>
-      </w:r>
-    </w:p>
-    <w:p>
-      <w:pPr>
-        <w:jc w:val="both"/>
-        <w:rPr>
-          <w:rFonts w:cs="Arial"/>
-        </w:rPr>
-      </w:pPr>
-    </w:p>
-    <w:p>
-      <w:pPr>
-        <w:jc w:val="both"/>
-        <w:rPr>
-          <w:rFonts w:cs="Arial"/>
-        </w:rPr>
-      </w:pPr>
-      <w:r>
-        <w:rPr>
-          <w:rFonts w:cs="Arial"/>
-          <w:b/>
-        </w:rPr>
-        <w:t>Author</w:t>
-      </w:r>
-      <w:r>
-        <w:rPr>
-          <w:rFonts w:cs="Arial"/>
-        </w:rPr>
-        <w:t>:</w:t>
-      </w:r>
-      <w:r>
-        <w:rPr>
-          <w:rFonts w:cs="Arial"/>
-        </w:rPr>
-        <w:tab/>
-      </w:r>
-    </w:p>
-    <w:p>
-      <w:pPr>
-        <w:jc w:val="both"/>
-        <w:rPr>
-          <w:rFonts w:cs="Arial"/>
-        </w:rPr>
-      </w:pPr>
-    </w:p>
-    <w:p>
-      <w:pPr>
-        <w:jc w:val="both"/>
-        <w:rPr>
-          <w:rFonts w:cs="Arial"/>
-        </w:rPr>
-      </w:pPr>
-      <w:r>
-        <w:rPr>
-          <w:rFonts w:cs="Arial"/>
-          <w:b/>
-        </w:rPr>
-        <w:t>Abstract:</w:t>
-      </w:r>
-      <w:r>
-        <w:rPr>
-          <w:rFonts w:cs="Arial"/>
-        </w:rPr>
-        <w:tab/>
-        <w:t>half-</w:t>
-      </w:r>
-      <w:r>
-        <w:rPr>
-          <w:rFonts w:cs="Arial"/>
-        </w:rPr>
-        <w:t xml:space="preserve">page </w:t>
-      </w:r>
-      <w:r>
-        <w:rPr>
-          <w:rFonts w:cs="Arial"/>
-        </w:rPr>
-        <w:t>description</w:t>
-      </w:r>
-    </w:p>
-    <w:p>
-      <w:pPr>
-        <w:jc w:val="both"/>
-        <w:rPr>
-          <w:rFonts w:cs="Arial"/>
-        </w:rPr>
-      </w:pPr>
-    </w:p>
-    <w:p>
-      <w:pPr>
-        <w:jc w:val="both"/>
-        <w:rPr>
-          <w:rFonts w:cs="Arial"/>
-        </w:rPr>
-      </w:pPr>
-    </w:p>
-    <w:p>
-      <w:pPr>
-        <w:jc w:val="both"/>
-        <w:rPr>
-          <w:rFonts w:cs="Arial"/>
-        </w:rPr>
-      </w:pPr>
-    </w:p>
-    <w:p>
-      <w:pPr>
-        <w:jc w:val="both"/>
-        <w:rPr>
-          <w:rFonts w:cs="Arial"/>
-        </w:rPr>
-      </w:pPr>
-    </w:p>
-    <w:p>
-      <w:pPr>
-        <w:jc w:val="both"/>
-        <w:rPr>
-          <w:rFonts w:cs="Arial"/>
-        </w:rPr>
-      </w:pPr>
-    </w:p>
-    <w:p>
-      <w:pPr>
-        <w:jc w:val="both"/>
-        <w:rPr>
-          <w:rFonts w:cs="Arial"/>
-        </w:rPr>
-      </w:pPr>
-    </w:p>
-    <w:p>
-      <w:pPr>
-        <w:jc w:val="both"/>
-        <w:rPr>
-          <w:rFonts w:cs="Arial"/>
-          <w:b/>
-        </w:rPr>
-      </w:pPr>
-      <w:r>
-        <w:rPr>
-          <w:rFonts w:cs="Arial"/>
-          <w:b/>
-        </w:rPr>
-        <w:t>Declaration of authorship:</w:t>
-      </w:r>
-    </w:p>
-    <w:p>
-      <w:pPr>
-        <w:jc w:val="both"/>
-        <w:rPr>
-          <w:rFonts w:cs="Arial"/>
-          <w:b/>
-        </w:rPr>
-      </w:pPr>
-    </w:p>
-    <w:p>
-      <w:pPr>
-        <w:jc w:val="both"/>
-        <w:rPr>
-          <w:rFonts w:cs="Arial"/>
-        </w:rPr>
-      </w:pPr>
-      <w:r>
-        <w:rPr>
-          <w:rFonts w:cs="Arial"/>
-        </w:rPr>
-        <w:t xml:space="preserve">“The Senior Project/Bulgarian Diploma Thesis presented here is </w:t>
-      </w:r>
-      <w:r>
-        <w:rPr>
-          <w:rFonts w:cs="Arial"/>
-        </w:rPr>
-        <w:t>the work of the author</w:t>
-      </w:r>
-      <w:r>
-        <w:rPr>
-          <w:rFonts w:cs="Arial"/>
-        </w:rPr>
-        <w:t xml:space="preserve"> solely</w:t>
-      </w:r>
-      <w:r>
-        <w:rPr>
-          <w:rFonts w:cs="Arial"/>
-        </w:rPr>
-        <w:t xml:space="preserve">, </w:t>
-      </w:r>
-      <w:r>
-        <w:rPr>
-          <w:rFonts w:cs="Arial"/>
-        </w:rPr>
-        <w:t xml:space="preserve">without any external help, </w:t>
-      </w:r>
-      <w:r>
-        <w:rPr>
-          <w:rFonts w:cs="Arial"/>
-        </w:rPr>
-        <w:t xml:space="preserve">under the supervision of ….. All sources, used in development, are cited in the text and in </w:t>
-      </w:r>
-      <w:r>
-        <w:rPr>
-          <w:rFonts w:cs="Arial"/>
-        </w:rPr>
-        <w:t xml:space="preserve">the </w:t>
-      </w:r>
-      <w:r>
-        <w:rPr>
-          <w:rFonts w:cs="Arial"/>
-        </w:rPr>
-        <w:t>Reference section.”</w:t>
-      </w:r>
-    </w:p>
-    <w:p>
-      <w:pPr>
-        <w:jc w:val="both"/>
-        <w:rPr>
-          <w:rFonts w:cs="Arial"/>
-        </w:rPr>
-      </w:pPr>
-    </w:p>
-    <w:p>
-      <w:pPr>
-        <w:jc w:val="both"/>
-        <w:rPr>
-          <w:rFonts w:cs="Arial"/>
-        </w:rPr>
-      </w:pPr>
-    </w:p>
-    <w:p>
-      <w:pPr>
-        <w:jc w:val="both"/>
-        <w:rPr>
-          <w:rFonts w:cs="Arial"/>
-        </w:rPr>
-      </w:pPr>
-    </w:p>
-    <w:p>
-      <w:pPr>
-        <w:tabs>
-          <w:tab w:val="left" w:pos="5760"/>
-        </w:tabs>
-        <w:jc w:val="both"/>
-        <w:rPr>
-          <w:rFonts w:cs="Arial"/>
-        </w:rPr>
-      </w:pPr>
-      <w:r>
-        <w:rPr>
-          <w:rFonts w:cs="Arial"/>
-        </w:rPr>
-        <w:t xml:space="preserve">Author: </w:t>
-      </w:r>
-      <w:r>
-        <w:rPr>
-          <w:rFonts w:cs="Arial"/>
-          <w:u w:val="single"/>
-        </w:rPr>
-        <w:tab/>
-      </w:r>
-    </w:p>
-    <w:p>
-      <w:pPr>
         <w:tabs>
           <w:tab w:val="left" w:pos="540"/>
         </w:tabs>
+        <w:jc w:val="both"/>
+        <w:rPr>
+          <w:rFonts w:asciiTheme="minorBidi" w:hAnsiTheme="minorBidi"/>
+          <w:lang w:val="en-US"/>
+        </w:rPr>
       </w:pPr>
     </w:p>
     <w:p>
       <w:pPr>
         <w:pStyle w:val="Heading1"/>
+        <w:jc w:val="both"/>
+        <w:rPr>
+          <w:rFonts w:asciiTheme="minorBidi" w:hAnsiTheme="minorBidi" w:cstheme="minorBidi"/>
+          <w:lang w:val="en-US"/>
+        </w:rPr>
       </w:pPr>
       <w:bookmarkStart w:id="0" w:name="_Toc219873179"/>
       <w:bookmarkStart w:id="1" w:name="_Toc219873213"/>
       <w:r>
-        <w:lastRenderedPageBreak/>
+        <w:rPr>
+          <w:rFonts w:asciiTheme="minorBidi" w:hAnsiTheme="minorBidi" w:cstheme="minorBidi"/>
+          <w:lang w:val="en-US"/>
+        </w:rPr>
         <w:t>Table of Contents</w:t>
       </w:r>
       <w:bookmarkEnd w:id="0"/>
@@ -726,113 +41,315 @@
         <w:tabs>
           <w:tab w:val="right" w:leader="middleDot" w:pos="9350"/>
         </w:tabs>
-        <w:rPr>
-          <w:rFonts w:cstheme="minorBidi"/>
+        <w:jc w:val="both"/>
+        <w:rPr>
+          <w:rFonts w:asciiTheme="minorBidi" w:hAnsiTheme="minorBidi" w:cstheme="minorBidi"/>
           <w:b w:val="0"/>
           <w:bCs w:val="0"/>
           <w:i w:val="0"/>
           <w:iCs w:val="0"/>
           <w:noProof/>
           <w:szCs w:val="24"/>
-        </w:rPr>
-      </w:pPr>
-      <w:r>
+          <w:lang w:val="en-US"/>
+        </w:rPr>
+      </w:pPr>
+      <w:r>
+        <w:rPr>
+          <w:rFonts w:asciiTheme="minorBidi" w:hAnsiTheme="minorBidi" w:cstheme="minorBidi"/>
+          <w:lang w:val="en-US"/>
+        </w:rPr>
         <w:fldChar w:fldCharType="begin"/>
       </w:r>
       <w:r>
+        <w:rPr>
+          <w:rFonts w:asciiTheme="minorBidi" w:hAnsiTheme="minorBidi" w:cstheme="minorBidi"/>
+          <w:lang w:val="en-US"/>
+        </w:rPr>
         <w:instrText xml:space="preserve"> TOC \o "1-3" \h \z \u </w:instrText>
       </w:r>
       <w:r>
+        <w:rPr>
+          <w:rFonts w:asciiTheme="minorBidi" w:hAnsiTheme="minorBidi" w:cstheme="minorBidi"/>
+          <w:lang w:val="en-US"/>
+        </w:rPr>
         <w:fldChar w:fldCharType="separate"/>
       </w:r>
       <w:hyperlink w:anchor="_Toc219873214" w:history="1">
         <w:r>
           <w:rPr>
             <w:rStyle w:val="Hyperlink"/>
+            <w:rFonts w:asciiTheme="minorBidi" w:hAnsiTheme="minorBidi" w:cstheme="minorBidi"/>
             <w:noProof/>
+            <w:lang w:val="en-US"/>
           </w:rPr>
           <w:t>Introduction</w:t>
         </w:r>
         <w:r>
           <w:rPr>
+            <w:rFonts w:asciiTheme="minorBidi" w:hAnsiTheme="minorBidi" w:cstheme="minorBidi"/>
             <w:noProof/>
             <w:webHidden/>
+            <w:lang w:val="en-US"/>
           </w:rPr>
           <w:tab/>
         </w:r>
         <w:r>
           <w:rPr>
+            <w:rFonts w:asciiTheme="minorBidi" w:hAnsiTheme="minorBidi" w:cstheme="minorBidi"/>
             <w:noProof/>
             <w:webHidden/>
+            <w:lang w:val="en-US"/>
           </w:rPr>
           <w:fldChar w:fldCharType="begin"/>
         </w:r>
         <w:r>
           <w:rPr>
+            <w:rFonts w:asciiTheme="minorBidi" w:hAnsiTheme="minorBidi" w:cstheme="minorBidi"/>
             <w:noProof/>
             <w:webHidden/>
+            <w:lang w:val="en-US"/>
           </w:rPr>
           <w:instrText xml:space="preserve"> PAGEREF _Toc219873214 \h </w:instrText>
         </w:r>
         <w:r>
           <w:rPr>
+            <w:rFonts w:asciiTheme="minorBidi" w:hAnsiTheme="minorBidi" w:cstheme="minorBidi"/>
             <w:noProof/>
             <w:webHidden/>
+            <w:lang w:val="en-US"/>
           </w:rPr>
         </w:r>
         <w:r>
           <w:rPr>
+            <w:rFonts w:asciiTheme="minorBidi" w:hAnsiTheme="minorBidi" w:cstheme="minorBidi"/>
             <w:noProof/>
             <w:webHidden/>
+            <w:lang w:val="en-US"/>
           </w:rPr>
           <w:fldChar w:fldCharType="separate"/>
         </w:r>
         <w:r>
           <w:rPr>
+            <w:rFonts w:asciiTheme="minorBidi" w:hAnsiTheme="minorBidi" w:cstheme="minorBidi"/>
             <w:noProof/>
             <w:webHidden/>
+            <w:lang w:val="en-US"/>
           </w:rPr>
-          <w:t>2</w:t>
+          <w:t>1</w:t>
         </w:r>
         <w:r>
           <w:rPr>
+            <w:rFonts w:asciiTheme="minorBidi" w:hAnsiTheme="minorBidi" w:cstheme="minorBidi"/>
             <w:noProof/>
             <w:webHidden/>
+            <w:lang w:val="en-US"/>
           </w:rPr>
           <w:fldChar w:fldCharType="end"/>
         </w:r>
       </w:hyperlink>
     </w:p>
     <w:p>
-      <w:r>
+      <w:pPr>
+        <w:jc w:val="both"/>
+        <w:rPr>
+          <w:rFonts w:asciiTheme="minorBidi" w:hAnsiTheme="minorBidi"/>
+          <w:lang w:val="en-US"/>
+        </w:rPr>
+      </w:pPr>
+      <w:r>
+        <w:rPr>
+          <w:rFonts w:asciiTheme="minorBidi" w:hAnsiTheme="minorBidi"/>
+          <w:lang w:val="en-US"/>
+        </w:rPr>
         <w:fldChar w:fldCharType="end"/>
       </w:r>
     </w:p>
-    <w:p/>
-    <w:p/>
-    <w:p/>
-    <w:p/>
-    <w:p/>
-    <w:p/>
-    <w:p/>
-    <w:p/>
-    <w:p/>
-    <w:p/>
-    <w:p/>
-    <w:p/>
-    <w:p/>
-    <w:p/>
-    <w:p/>
-    <w:p/>
-    <w:p/>
-    <w:p/>
-    <w:p/>
+    <w:p>
+      <w:pPr>
+        <w:jc w:val="both"/>
+        <w:rPr>
+          <w:rFonts w:asciiTheme="minorBidi" w:hAnsiTheme="minorBidi"/>
+          <w:lang w:val="en-US"/>
+        </w:rPr>
+      </w:pPr>
+    </w:p>
+    <w:p>
+      <w:pPr>
+        <w:jc w:val="both"/>
+        <w:rPr>
+          <w:rFonts w:asciiTheme="minorBidi" w:hAnsiTheme="minorBidi"/>
+          <w:lang w:val="en-US"/>
+        </w:rPr>
+      </w:pPr>
+    </w:p>
+    <w:p>
+      <w:pPr>
+        <w:jc w:val="both"/>
+        <w:rPr>
+          <w:rFonts w:asciiTheme="minorBidi" w:hAnsiTheme="minorBidi"/>
+          <w:lang w:val="en-US"/>
+        </w:rPr>
+      </w:pPr>
+    </w:p>
+    <w:p>
+      <w:pPr>
+        <w:jc w:val="both"/>
+        <w:rPr>
+          <w:rFonts w:asciiTheme="minorBidi" w:hAnsiTheme="minorBidi"/>
+          <w:lang w:val="en-US"/>
+        </w:rPr>
+      </w:pPr>
+    </w:p>
+    <w:p>
+      <w:pPr>
+        <w:jc w:val="both"/>
+        <w:rPr>
+          <w:rFonts w:asciiTheme="minorBidi" w:hAnsiTheme="minorBidi"/>
+          <w:lang w:val="en-US"/>
+        </w:rPr>
+      </w:pPr>
+    </w:p>
+    <w:p>
+      <w:pPr>
+        <w:jc w:val="both"/>
+        <w:rPr>
+          <w:rFonts w:asciiTheme="minorBidi" w:hAnsiTheme="minorBidi"/>
+          <w:lang w:val="en-US"/>
+        </w:rPr>
+      </w:pPr>
+    </w:p>
+    <w:p>
+      <w:pPr>
+        <w:jc w:val="both"/>
+        <w:rPr>
+          <w:rFonts w:asciiTheme="minorBidi" w:hAnsiTheme="minorBidi"/>
+          <w:lang w:val="en-US"/>
+        </w:rPr>
+      </w:pPr>
+    </w:p>
+    <w:p>
+      <w:pPr>
+        <w:jc w:val="both"/>
+        <w:rPr>
+          <w:rFonts w:asciiTheme="minorBidi" w:hAnsiTheme="minorBidi"/>
+          <w:lang w:val="en-US"/>
+        </w:rPr>
+      </w:pPr>
+    </w:p>
+    <w:p>
+      <w:pPr>
+        <w:jc w:val="both"/>
+        <w:rPr>
+          <w:rFonts w:asciiTheme="minorBidi" w:hAnsiTheme="minorBidi"/>
+          <w:lang w:val="en-US"/>
+        </w:rPr>
+      </w:pPr>
+    </w:p>
+    <w:p>
+      <w:pPr>
+        <w:jc w:val="both"/>
+        <w:rPr>
+          <w:rFonts w:asciiTheme="minorBidi" w:hAnsiTheme="minorBidi"/>
+          <w:lang w:val="en-US"/>
+        </w:rPr>
+      </w:pPr>
+    </w:p>
+    <w:p>
+      <w:pPr>
+        <w:jc w:val="both"/>
+        <w:rPr>
+          <w:rFonts w:asciiTheme="minorBidi" w:hAnsiTheme="minorBidi"/>
+          <w:lang w:val="en-US"/>
+        </w:rPr>
+      </w:pPr>
+    </w:p>
+    <w:p>
+      <w:pPr>
+        <w:jc w:val="both"/>
+        <w:rPr>
+          <w:rFonts w:asciiTheme="minorBidi" w:hAnsiTheme="minorBidi"/>
+          <w:lang w:val="en-US"/>
+        </w:rPr>
+      </w:pPr>
+    </w:p>
+    <w:p>
+      <w:pPr>
+        <w:jc w:val="both"/>
+        <w:rPr>
+          <w:rFonts w:asciiTheme="minorBidi" w:hAnsiTheme="minorBidi"/>
+          <w:lang w:val="en-US"/>
+        </w:rPr>
+      </w:pPr>
+    </w:p>
+    <w:p>
+      <w:pPr>
+        <w:jc w:val="both"/>
+        <w:rPr>
+          <w:rFonts w:asciiTheme="minorBidi" w:hAnsiTheme="minorBidi"/>
+          <w:lang w:val="en-US"/>
+        </w:rPr>
+      </w:pPr>
+    </w:p>
+    <w:p>
+      <w:pPr>
+        <w:jc w:val="both"/>
+        <w:rPr>
+          <w:rFonts w:asciiTheme="minorBidi" w:hAnsiTheme="minorBidi"/>
+          <w:lang w:val="en-US"/>
+        </w:rPr>
+      </w:pPr>
+    </w:p>
+    <w:p>
+      <w:pPr>
+        <w:jc w:val="both"/>
+        <w:rPr>
+          <w:rFonts w:asciiTheme="minorBidi" w:hAnsiTheme="minorBidi"/>
+          <w:lang w:val="en-US"/>
+        </w:rPr>
+      </w:pPr>
+    </w:p>
+    <w:p>
+      <w:pPr>
+        <w:jc w:val="both"/>
+        <w:rPr>
+          <w:rFonts w:asciiTheme="minorBidi" w:hAnsiTheme="minorBidi"/>
+          <w:lang w:val="en-US"/>
+        </w:rPr>
+      </w:pPr>
+    </w:p>
+    <w:p>
+      <w:pPr>
+        <w:jc w:val="both"/>
+        <w:rPr>
+          <w:rFonts w:asciiTheme="minorBidi" w:hAnsiTheme="minorBidi"/>
+          <w:lang w:val="en-US"/>
+        </w:rPr>
+      </w:pPr>
+    </w:p>
+    <w:p>
+      <w:pPr>
+        <w:jc w:val="both"/>
+        <w:rPr>
+          <w:rFonts w:asciiTheme="minorBidi" w:hAnsiTheme="minorBidi"/>
+          <w:lang w:val="en-US"/>
+        </w:rPr>
+      </w:pPr>
+    </w:p>
     <w:p>
       <w:pPr>
         <w:pStyle w:val="Heading1"/>
+        <w:jc w:val="both"/>
+        <w:rPr>
+          <w:rFonts w:asciiTheme="minorBidi" w:hAnsiTheme="minorBidi" w:cstheme="minorBidi"/>
+          <w:lang w:val="en-US"/>
+        </w:rPr>
       </w:pPr>
       <w:bookmarkStart w:id="2" w:name="_Toc219873214"/>
       <w:r>
+        <w:rPr>
+          <w:rFonts w:asciiTheme="minorBidi" w:hAnsiTheme="minorBidi" w:cstheme="minorBidi"/>
+          <w:lang w:val="en-US"/>
+        </w:rPr>
         <w:lastRenderedPageBreak/>
         <w:t>Introduction</w:t>
       </w:r>
@@ -840,97 +357,956 @@
     </w:p>
     <w:p>
       <w:pPr>
+        <w:rPr>
+          <w:b/>
+          <w:bCs/>
+          <w:u w:val="single"/>
+          <w:lang w:val="en-US"/>
+        </w:rPr>
+      </w:pPr>
+    </w:p>
+    <w:p>
+      <w:pPr>
+        <w:ind w:left="720" w:firstLine="720"/>
+        <w:rPr>
+          <w:lang w:val="en-US"/>
+        </w:rPr>
+      </w:pPr>
+      <w:r>
+        <w:rPr>
+          <w:lang w:val="en-US"/>
+        </w:rPr>
+        <w:t xml:space="preserve">In recent years, video games have relied on algorithmic techniques to generate </w:t>
+      </w:r>
+      <w:r>
+        <w:rPr>
+          <w:lang w:val="en-US"/>
+        </w:rPr>
+        <w:t xml:space="preserve">dynamic and interactive environments with certain constraints for the player, and an artificial intelligence that chooses a list of decisions and behavior either in relation to the environment and/or towards the player. </w:t>
+      </w:r>
+      <w:r>
+        <w:rPr>
+          <w:lang w:val="en-US"/>
+        </w:rPr>
+        <w:t>Procedural content generation, pathfinding algorithms, and non-playable characters (NPC) decision-making are widely used as the basis of video games to create an interactive world that can adapt to the player’s actions and the environment they are in while keeping the constraints in check.</w:t>
+      </w:r>
+    </w:p>
+    <w:p>
+      <w:pPr>
+        <w:ind w:left="1080" w:firstLine="360"/>
+        <w:rPr>
+          <w:lang w:val="en-US"/>
+        </w:rPr>
+      </w:pPr>
+    </w:p>
+    <w:p>
+      <w:pPr>
+        <w:ind w:left="1080" w:firstLine="360"/>
+        <w:rPr>
+          <w:lang w:val="en-US"/>
+        </w:rPr>
+      </w:pPr>
+      <w:r>
+        <w:rPr>
+          <w:lang w:val="en-US"/>
+        </w:rPr>
+        <w:t xml:space="preserve">This project is a console-based turn-based strategy game that provides algorithmic techniques found within Game Development and Artificial Intelligence within games. </w:t>
+      </w:r>
+      <w:r>
+        <w:rPr>
+          <w:lang w:val="en-US"/>
+        </w:rPr>
+        <w:t xml:space="preserve">The game provides procedurally generated maps that are created using a form of Wave Function Collapse (WFC) which also makes sure that there are </w:t>
+      </w:r>
+      <w:r>
+        <w:rPr>
+          <w:lang w:val="en-US"/>
+        </w:rPr>
+        <w:t>terrain constraints</w:t>
+      </w:r>
+      <w:r>
+        <w:rPr>
+          <w:lang w:val="en-US"/>
+        </w:rPr>
+        <w:t xml:space="preserve">, example mountains should not be next to water. </w:t>
+      </w:r>
+    </w:p>
+    <w:p>
+      <w:pPr>
+        <w:ind w:left="1080" w:firstLine="360"/>
+        <w:rPr>
+          <w:lang w:val="en-US"/>
+        </w:rPr>
+      </w:pPr>
+    </w:p>
+    <w:p>
+      <w:pPr>
+        <w:ind w:left="1080" w:firstLine="360"/>
+        <w:rPr>
+          <w:lang w:val="en-US"/>
+        </w:rPr>
+      </w:pPr>
+      <w:r>
+        <w:rPr>
+          <w:lang w:val="en-US"/>
+        </w:rPr>
+        <w:t>The player is</w:t>
+      </w:r>
+      <w:r>
+        <w:rPr>
+          <w:lang w:val="en-US"/>
+        </w:rPr>
+        <w:t xml:space="preserve"> able to navigate through a grid-based maps exploring tiles such as Grass, Mountains, Water, and Forests. </w:t>
+      </w:r>
+      <w:r>
+        <w:rPr>
+          <w:lang w:val="en-US"/>
+        </w:rPr>
+        <w:t xml:space="preserve">Each terrain influences the player’s movements and the gameplay mechanics, such as the player not being able to initially go through mountains unless they have a specific tool that allows them to do such. </w:t>
+      </w:r>
+      <w:r>
+        <w:rPr>
+          <w:lang w:val="en-US"/>
+        </w:rPr>
+        <w:t xml:space="preserve">Enemy characters attempt to locate and pursue the player via A* pathfinding algorithm, </w:t>
+      </w:r>
+      <w:r>
+        <w:rPr>
+          <w:lang w:val="en-US"/>
+        </w:rPr>
+        <w:t>allowing for a more efficient way for enemies to navigate through the terrain to pursue the player while also avoiding obstacles that they may not be able to pass through such as some enemies being unable to navigate through mountains.</w:t>
+      </w:r>
+      <w:r>
+        <w:rPr>
+          <w:lang w:val="en-US"/>
+        </w:rPr>
+        <w:t xml:space="preserve"> </w:t>
+      </w:r>
+    </w:p>
+    <w:p>
+      <w:pPr>
+        <w:ind w:left="1080" w:firstLine="360"/>
+        <w:rPr>
+          <w:lang w:val="en-US"/>
+        </w:rPr>
+      </w:pPr>
+    </w:p>
+    <w:p>
+      <w:pPr>
+        <w:ind w:left="1080" w:firstLine="360"/>
+        <w:rPr>
+          <w:lang w:val="en-US"/>
+        </w:rPr>
+      </w:pPr>
+      <w:r>
+        <w:rPr>
+          <w:lang w:val="en-US"/>
+        </w:rPr>
+        <w:lastRenderedPageBreak/>
+        <w:t>Once the enemy catches the player a turn-based combat subsystem is triggered which takes into account enemy behavior when approached with different attacks, items and/or spells, the same for which also applies for the player, though with an additional option to escape the combat.</w:t>
+      </w:r>
+    </w:p>
+    <w:p>
+      <w:pPr>
+        <w:ind w:left="1080" w:firstLine="360"/>
+        <w:rPr>
+          <w:lang w:val="en-US"/>
+        </w:rPr>
+      </w:pPr>
+    </w:p>
+    <w:p>
+      <w:pPr>
+        <w:ind w:left="1080" w:firstLine="360"/>
+        <w:rPr>
+          <w:lang w:val="en-US"/>
+        </w:rPr>
+      </w:pPr>
+      <w:r>
+        <w:rPr>
+          <w:lang w:val="en-US"/>
+        </w:rPr>
+        <w:t xml:space="preserve">The objective of this project is to showcase how algorithmic techniques such as </w:t>
+      </w:r>
+      <w:r>
+        <w:rPr>
+          <w:lang w:val="en-US"/>
+        </w:rPr>
+        <w:t xml:space="preserve">procedural generation and heuristic search can be integrated to create one of the most interactive mediums, video games. </w:t>
+      </w:r>
+      <w:r>
+        <w:rPr>
+          <w:lang w:val="en-US"/>
+        </w:rPr>
+        <w:t>When combining these methods within a game environment, this project further showcases the practical applications of concepts that include object oriented programming (OOP) system design, pathfinding, terrain constraint management, and overall enemy behavior and decision</w:t>
+      </w:r>
+      <w:r>
+        <w:rPr>
+          <w:lang w:val="en-US"/>
+        </w:rPr>
+        <w:t xml:space="preserve"> </w:t>
+      </w:r>
+      <w:r>
+        <w:rPr>
+          <w:lang w:val="en-US"/>
+        </w:rPr>
+        <w:t xml:space="preserve">making. </w:t>
+      </w:r>
+    </w:p>
+    <w:p>
+      <w:pPr>
+        <w:ind w:left="1080" w:firstLine="360"/>
+        <w:rPr>
+          <w:lang w:val="en-US"/>
+        </w:rPr>
+      </w:pPr>
+    </w:p>
+    <w:p>
+      <w:pPr>
         <w:pStyle w:val="Heading1"/>
-      </w:pPr>
-      <w:r>
+        <w:jc w:val="both"/>
+        <w:rPr>
+          <w:rFonts w:asciiTheme="minorBidi" w:hAnsiTheme="minorBidi" w:cstheme="minorBidi"/>
+          <w:lang w:val="en-US"/>
+        </w:rPr>
+      </w:pPr>
+      <w:r>
+        <w:rPr>
+          <w:rFonts w:asciiTheme="minorBidi" w:hAnsiTheme="minorBidi" w:cstheme="minorBidi"/>
+          <w:lang w:val="en-US"/>
+        </w:rPr>
+        <w:t xml:space="preserve">Game </w:t>
+      </w:r>
+      <w:r>
+        <w:rPr>
+          <w:rFonts w:asciiTheme="minorBidi" w:hAnsiTheme="minorBidi" w:cstheme="minorBidi"/>
+          <w:lang w:val="en-US"/>
+        </w:rPr>
+        <w:t>Design</w:t>
+      </w:r>
+    </w:p>
+    <w:p>
+      <w:pPr>
+        <w:rPr>
+          <w:lang w:val="en-US"/>
+        </w:rPr>
+      </w:pPr>
+    </w:p>
+    <w:p>
+      <w:pPr>
+        <w:pStyle w:val="ListParagraph"/>
+        <w:numPr>
+          <w:ilvl w:val="0"/>
+          <w:numId w:val="4"/>
+        </w:numPr>
+        <w:rPr>
+          <w:b/>
+          <w:bCs/>
+          <w:u w:val="single"/>
+          <w:lang w:val="en-US"/>
+        </w:rPr>
+      </w:pPr>
+      <w:r>
+        <w:rPr>
+          <w:b/>
+          <w:bCs/>
+          <w:u w:val="single"/>
+          <w:lang w:val="en-US"/>
+        </w:rPr>
+        <w:t>Game Map</w:t>
+      </w:r>
+    </w:p>
+    <w:p>
+      <w:pPr>
+        <w:ind w:left="1080"/>
+        <w:jc w:val="center"/>
+        <w:rPr>
+          <w:b/>
+          <w:bCs/>
+          <w:u w:val="single"/>
+          <w:lang w:val="en-US"/>
+        </w:rPr>
+      </w:pPr>
+      <w:r>
+        <w:rPr>
+          <w:b/>
+          <w:bCs/>
+          <w:u w:val="single"/>
+          <w:lang w:val="en-US"/>
+        </w:rPr>
+        <w:drawing>
+          <wp:inline distT="0" distB="0" distL="0" distR="0" wp14:anchorId="7109CA66" wp14:editId="0B3336D1">
+            <wp:extent cx="3688080" cy="2695511"/>
+            <wp:effectExtent l="0" t="0" r="7620" b="0"/>
+            <wp:docPr id="1509473547" name="Picture 1"/>
+            <wp:cNvGraphicFramePr>
+              <a:graphicFrameLocks xmlns:a="http://schemas.openxmlformats.org/drawingml/2006/main" noChangeAspect="1"/>
+            </wp:cNvGraphicFramePr>
+            <a:graphic xmlns:a="http://schemas.openxmlformats.org/drawingml/2006/main">
+              <a:graphicData uri="http://schemas.openxmlformats.org/drawingml/2006/picture">
+                <pic:pic xmlns:pic="http://schemas.openxmlformats.org/drawingml/2006/picture">
+                  <pic:nvPicPr>
+                    <pic:cNvPr id="1509473547" name=""/>
+                    <pic:cNvPicPr/>
+                  </pic:nvPicPr>
+                  <pic:blipFill>
+                    <a:blip r:embed="rId11"/>
+                    <a:stretch>
+                      <a:fillRect/>
+                    </a:stretch>
+                  </pic:blipFill>
+                  <pic:spPr>
+                    <a:xfrm>
+                      <a:off x="0" y="0"/>
+                      <a:ext cx="3711182" cy="2712396"/>
+                    </a:xfrm>
+                    <a:prstGeom prst="rect">
+                      <a:avLst/>
+                    </a:prstGeom>
+                  </pic:spPr>
+                </pic:pic>
+              </a:graphicData>
+            </a:graphic>
+          </wp:inline>
+        </w:drawing>
+      </w:r>
+    </w:p>
+    <w:p>
+      <w:pPr>
+        <w:ind w:left="1080"/>
+        <w:jc w:val="center"/>
+        <w:rPr>
+          <w:b/>
+          <w:bCs/>
+          <w:lang w:val="en-US"/>
+        </w:rPr>
+      </w:pPr>
+      <w:r>
+        <w:rPr>
+          <w:b/>
+          <w:bCs/>
+          <w:lang w:val="en-US"/>
+        </w:rPr>
+        <w:t xml:space="preserve">Figure 1: </w:t>
+      </w:r>
+      <w:r>
+        <w:rPr>
+          <w:b/>
+          <w:bCs/>
+          <w:lang w:val="en-US"/>
+        </w:rPr>
+        <w:t xml:space="preserve">An example of the map taken from the Project, the player is represented through the </w:t>
+      </w:r>
+      <w:r>
+        <w:rPr>
+          <w:b/>
+          <w:bCs/>
+          <w:lang w:val="en-US"/>
+        </w:rPr>
+        <w:t>“</w:t>
+      </w:r>
+      <w:r>
+        <w:rPr>
+          <w:b/>
+          <w:bCs/>
+          <w:lang w:val="en-US"/>
+        </w:rPr>
+        <w:t>@</w:t>
+      </w:r>
+      <w:r>
+        <w:rPr>
+          <w:b/>
+          <w:bCs/>
+          <w:lang w:val="en-US"/>
+        </w:rPr>
+        <w:t>”</w:t>
+      </w:r>
+      <w:r>
+        <w:rPr>
+          <w:b/>
+          <w:bCs/>
+          <w:lang w:val="en-US"/>
+        </w:rPr>
+        <w:t xml:space="preserve"> symbol</w:t>
+      </w:r>
+    </w:p>
+    <w:p>
+      <w:pPr>
+        <w:ind w:left="1080"/>
+        <w:jc w:val="center"/>
+        <w:rPr>
+          <w:b/>
+          <w:bCs/>
+          <w:u w:val="single"/>
+          <w:lang w:val="en-US"/>
+        </w:rPr>
+      </w:pPr>
+    </w:p>
+    <w:p>
+      <w:pPr>
+        <w:ind w:left="1080" w:firstLine="360"/>
+        <w:rPr>
+          <w:lang w:val="en-US"/>
+        </w:rPr>
+      </w:pPr>
+      <w:r>
+        <w:rPr>
+          <w:lang w:val="en-US"/>
+        </w:rPr>
+        <w:lastRenderedPageBreak/>
+        <w:t xml:space="preserve">The Game </w:t>
+      </w:r>
+      <w:r>
+        <w:rPr>
+          <w:lang w:val="en-US"/>
+        </w:rPr>
+        <w:t>Environment</w:t>
+      </w:r>
+      <w:r>
+        <w:rPr>
+          <w:lang w:val="en-US"/>
+        </w:rPr>
+        <w:t xml:space="preserve"> is represented through a two-dimensional grid that is composed of terrain tiles that are represented with a character.</w:t>
+      </w:r>
+      <w:r>
+        <w:rPr>
+          <w:lang w:val="en-US"/>
+        </w:rPr>
+        <w:t xml:space="preserve"> Instead of relying on predefined map layouts, the game uses </w:t>
+      </w:r>
+      <w:r>
+        <w:rPr>
+          <w:b/>
+          <w:bCs/>
+          <w:lang w:val="en-US"/>
+        </w:rPr>
+        <w:t>Procedural Map Generation</w:t>
+      </w:r>
+      <w:r>
+        <w:rPr>
+          <w:b/>
+          <w:bCs/>
+          <w:lang w:val="en-US"/>
+        </w:rPr>
+        <w:t xml:space="preserve"> </w:t>
+      </w:r>
+      <w:r>
+        <w:rPr>
+          <w:lang w:val="en-US"/>
+        </w:rPr>
+        <w:t xml:space="preserve">to </w:t>
+      </w:r>
+      <w:r>
+        <w:rPr>
+          <w:lang w:val="en-US"/>
+        </w:rPr>
+        <w:t xml:space="preserve">produce different maps </w:t>
+      </w:r>
+      <w:r>
+        <w:rPr>
+          <w:lang w:val="en-US"/>
+        </w:rPr>
+        <w:t xml:space="preserve">which </w:t>
+      </w:r>
+      <w:r>
+        <w:rPr>
+          <w:lang w:val="en-US"/>
+        </w:rPr>
+        <w:t>ensure</w:t>
+      </w:r>
+      <w:r>
+        <w:rPr>
+          <w:lang w:val="en-US"/>
+        </w:rPr>
+        <w:t xml:space="preserve"> that each playthrough creates a different environment while maintaining its current logical terrain relationships.</w:t>
+      </w:r>
+    </w:p>
+    <w:p>
+      <w:pPr>
+        <w:ind w:left="1080"/>
+        <w:rPr>
+          <w:lang w:val="en-US"/>
+        </w:rPr>
+      </w:pPr>
+    </w:p>
+    <w:p>
+      <w:pPr>
+        <w:ind w:left="1080" w:firstLine="360"/>
+        <w:rPr>
+          <w:lang w:val="en-US"/>
+        </w:rPr>
+      </w:pPr>
+      <w:r>
+        <w:rPr>
+          <w:lang w:val="en-US"/>
+        </w:rPr>
+        <w:t>In order to generate the map though, the project uses Wave Function Collapse (WFC)</w:t>
+      </w:r>
+      <w:r>
+        <w:rPr>
+          <w:lang w:val="en-US"/>
+        </w:rPr>
+        <w:t>. Created by Maxim Gumin</w:t>
+      </w:r>
+      <w:r>
+        <w:rPr>
+          <w:lang w:val="en-US"/>
+        </w:rPr>
+        <w:t xml:space="preserve"> and based on work by Paul Merrell, </w:t>
+      </w:r>
+      <w:r>
+        <w:rPr>
+          <w:lang w:val="en-US"/>
+        </w:rPr>
+        <w:t xml:space="preserve">WFC is a procedural </w:t>
+      </w:r>
+      <w:r>
+        <w:rPr>
+          <w:lang w:val="en-US"/>
+        </w:rPr>
+        <w:t>map generation technique that was originally used to develop</w:t>
+      </w:r>
+      <w:r>
+        <w:rPr>
+          <w:lang w:val="en-US"/>
+        </w:rPr>
+        <w:t xml:space="preserve"> </w:t>
+      </w:r>
+      <w:r>
+        <w:rPr>
+          <w:lang w:val="en-US"/>
+        </w:rPr>
+        <w:t>simple configuration</w:t>
+      </w:r>
+      <w:r>
+        <w:rPr>
+          <w:lang w:val="en-US"/>
+        </w:rPr>
+        <w:t xml:space="preserve"> or</w:t>
+      </w:r>
+      <w:r>
+        <w:rPr>
+          <w:lang w:val="en-US"/>
+        </w:rPr>
+        <w:t xml:space="preserve"> sample image</w:t>
+      </w:r>
+      <w:r>
+        <w:rPr>
+          <w:lang w:val="en-US"/>
+        </w:rPr>
+        <w:t xml:space="preserve">s, in video games it has been used to </w:t>
+      </w:r>
+      <w:r>
+        <w:rPr>
+          <w:lang w:val="en-US"/>
+        </w:rPr>
+        <w:t xml:space="preserve">generate </w:t>
+      </w:r>
+      <w:r>
+        <w:rPr>
+          <w:lang w:val="en-US"/>
+        </w:rPr>
+        <w:t>adjacent constraints from element to element</w:t>
+      </w:r>
+      <w:r>
+        <w:rPr>
+          <w:lang w:val="en-US"/>
+        </w:rPr>
+        <w:t xml:space="preserve">. </w:t>
+      </w:r>
+      <w:r>
+        <w:rPr>
+          <w:lang w:val="en-US"/>
+        </w:rPr>
+        <w:t xml:space="preserve">The function </w:t>
+      </w:r>
+      <w:r>
+        <w:rPr>
+          <w:lang w:val="en-US"/>
+        </w:rPr>
+        <w:t>operates through</w:t>
+      </w:r>
+      <w:r>
+        <w:rPr>
+          <w:lang w:val="en-US"/>
+        </w:rPr>
+        <w:t xml:space="preserve"> checking tiles that are adjacent to one another</w:t>
+      </w:r>
+      <w:r>
+        <w:rPr>
+          <w:lang w:val="en-US"/>
+        </w:rPr>
+        <w:t xml:space="preserve">, e.g. grass can be next to </w:t>
+      </w:r>
+      <w:r>
+        <w:rPr>
+          <w:lang w:val="en-US"/>
+        </w:rPr>
+        <w:t>water,</w:t>
+      </w:r>
+      <w:r>
+        <w:rPr>
+          <w:lang w:val="en-US"/>
+        </w:rPr>
+        <w:t xml:space="preserve"> but mountains can</w:t>
+      </w:r>
+      <w:r>
+        <w:rPr>
+          <w:lang w:val="en-US"/>
+        </w:rPr>
+        <w:t xml:space="preserve">not. </w:t>
+      </w:r>
+    </w:p>
+    <w:p>
+      <w:pPr>
+        <w:ind w:left="1080"/>
+        <w:rPr>
+          <w:lang w:val="en-US"/>
+        </w:rPr>
+      </w:pPr>
+    </w:p>
+    <w:p>
+      <w:pPr>
+        <w:ind w:left="1080" w:firstLine="360"/>
+        <w:rPr>
+          <w:lang w:val="en-US"/>
+        </w:rPr>
+      </w:pPr>
+      <w:r>
+        <w:rPr>
+          <w:lang w:val="en-US"/>
+        </w:rPr>
+        <w:t xml:space="preserve">Initially, all grid cells are assigned </w:t>
+      </w:r>
+      <w:r>
+        <w:rPr>
+          <w:lang w:val="en-US"/>
+        </w:rPr>
+        <w:t>a set of possible tiles that would be assigned to them</w:t>
+      </w:r>
+      <w:r>
+        <w:rPr>
+          <w:lang w:val="en-US"/>
+        </w:rPr>
+        <w:t xml:space="preserve">. </w:t>
+      </w:r>
+      <w:r>
+        <w:rPr>
+          <w:lang w:val="en-US"/>
+        </w:rPr>
+        <w:t>This is the highest level of entropy, which is the many possible tiles</w:t>
+      </w:r>
+      <w:r>
+        <w:rPr>
+          <w:lang w:val="en-US"/>
+        </w:rPr>
+        <w:t xml:space="preserve"> and the cell that has not been assigned a specific terrain yet. </w:t>
+      </w:r>
+      <w:r>
+        <w:rPr>
+          <w:lang w:val="en-US"/>
+        </w:rPr>
+        <w:t>Then, the function goes on a loop to select the cell that has the lowest entropy cell, meaning the cell with the fewest possible til</w:t>
+      </w:r>
+      <w:r>
+        <w:rPr>
+          <w:lang w:val="en-US"/>
+        </w:rPr>
+        <w:t>es.</w:t>
+      </w:r>
+    </w:p>
+    <w:p>
+      <w:pPr>
+        <w:ind w:left="1080" w:firstLine="360"/>
+        <w:rPr>
+          <w:lang w:val="en-US"/>
+        </w:rPr>
+      </w:pPr>
+    </w:p>
+    <w:p>
+      <w:pPr>
+        <w:ind w:left="1080" w:firstLine="360"/>
+        <w:rPr>
+          <w:lang w:val="en-US"/>
+        </w:rPr>
+      </w:pPr>
+      <w:r>
+        <w:rPr>
+          <w:lang w:val="en-US"/>
+        </w:rPr>
+        <w:t xml:space="preserve">After that, once a terrain </w:t>
+      </w:r>
+      <w:r>
+        <w:rPr>
+          <w:lang w:val="en-US"/>
+        </w:rPr>
+        <w:t>is chosen for the cell, a constraint propagation is performed</w:t>
+      </w:r>
+      <w:r>
+        <w:rPr>
+          <w:lang w:val="en-US"/>
+        </w:rPr>
+        <w:t>. Constraint propagation updates their possible terrain states based on the defined adjacency</w:t>
+      </w:r>
+      <w:r>
+        <w:rPr>
+          <w:lang w:val="en-US"/>
+        </w:rPr>
+        <w:t xml:space="preserve"> restrictions</w:t>
+      </w:r>
+      <w:r>
+        <w:rPr>
+          <w:lang w:val="en-US"/>
+        </w:rPr>
+        <w:t xml:space="preserve">. </w:t>
+      </w:r>
+      <w:r>
+        <w:rPr>
+          <w:lang w:val="en-US"/>
+        </w:rPr>
+        <w:t xml:space="preserve">These adjacency restrictions </w:t>
+      </w:r>
+    </w:p>
+    <w:p>
+      <w:pPr>
+        <w:rPr>
+          <w:lang w:val="en-US"/>
+        </w:rPr>
+      </w:pPr>
+    </w:p>
+    <w:p>
+      <w:pPr>
+        <w:rPr>
+          <w:lang w:val="en-US"/>
+        </w:rPr>
+      </w:pPr>
+    </w:p>
+    <w:p>
+      <w:pPr>
+        <w:ind w:left="1080" w:firstLine="360"/>
+        <w:rPr>
+          <w:lang w:val="en-US"/>
+        </w:rPr>
+      </w:pPr>
+    </w:p>
+    <w:p>
+      <w:pPr>
+        <w:ind w:left="1080" w:firstLine="360"/>
+        <w:rPr>
+          <w:lang w:val="en-US"/>
+        </w:rPr>
+      </w:pPr>
+    </w:p>
+    <w:p>
+      <w:pPr>
+        <w:ind w:left="1080" w:firstLine="360"/>
+        <w:rPr>
+          <w:lang w:val="en-US"/>
+        </w:rPr>
+      </w:pPr>
+    </w:p>
+    <w:p>
+      <w:pPr>
+        <w:pStyle w:val="Heading1"/>
+        <w:jc w:val="both"/>
+        <w:rPr>
+          <w:rFonts w:asciiTheme="minorBidi" w:hAnsiTheme="minorBidi" w:cstheme="minorBidi"/>
+          <w:lang w:val="en-US"/>
+        </w:rPr>
+      </w:pPr>
+      <w:r>
+        <w:rPr>
+          <w:rFonts w:asciiTheme="minorBidi" w:hAnsiTheme="minorBidi" w:cstheme="minorBidi"/>
+          <w:lang w:val="en-US"/>
+        </w:rPr>
+        <w:lastRenderedPageBreak/>
         <w:t>Bibliography</w:t>
       </w:r>
     </w:p>
     <w:p>
+      <w:pPr>
+        <w:jc w:val="both"/>
+        <w:rPr>
+          <w:rFonts w:asciiTheme="minorBidi" w:hAnsiTheme="minorBidi"/>
+          <w:lang w:val="en-US"/>
+        </w:rPr>
+      </w:pPr>
       <w:hyperlink r:id="rId12" w:history="1">
         <w:r>
           <w:rPr>
             <w:rStyle w:val="Hyperlink"/>
+            <w:rFonts w:asciiTheme="minorBidi" w:hAnsiTheme="minorBidi"/>
+            <w:lang w:val="en-US"/>
           </w:rPr>
           <w:t>https://github.com/mxgmn/WaveFunctionCollapse</w:t>
         </w:r>
       </w:hyperlink>
     </w:p>
     <w:p>
+      <w:pPr>
+        <w:jc w:val="both"/>
+      </w:pPr>
       <w:hyperlink r:id="rId13" w:history="1">
         <w:r>
           <w:rPr>
             <w:rStyle w:val="Hyperlink"/>
+            <w:rFonts w:asciiTheme="minorBidi" w:hAnsiTheme="minorBidi"/>
+            <w:lang w:val="en-US"/>
           </w:rPr>
           <w:t>https://www.boristhebrave.com/2020/04/13/wave-function-collapse-explained/</w:t>
         </w:r>
       </w:hyperlink>
     </w:p>
     <w:p>
+      <w:pPr>
+        <w:jc w:val="both"/>
+        <w:rPr>
+          <w:rFonts w:asciiTheme="minorBidi" w:hAnsiTheme="minorBidi"/>
+          <w:lang w:val="en-US"/>
+        </w:rPr>
+      </w:pPr>
       <w:hyperlink r:id="rId14" w:history="1">
         <w:r>
           <w:rPr>
             <w:rStyle w:val="Hyperlink"/>
+            <w:rFonts w:asciiTheme="minorBidi" w:hAnsiTheme="minorBidi"/>
+            <w:lang w:val="en-US"/>
           </w:rPr>
-          <w:t>https://theory.stanford.edu/~amitp/GameProgra</w:t>
-        </w:r>
-        <w:r>
-          <w:rPr>
-            <w:rStyle w:val="Hyperlink"/>
-          </w:rPr>
-          <w:t>m</w:t>
-        </w:r>
-        <w:r>
-          <w:rPr>
-            <w:rStyle w:val="Hyperlink"/>
-          </w:rPr>
-          <w:t>ming/AStarComparison.html</w:t>
+          <w:t>https://paulmerrell.org/model-synthesis/</w:t>
         </w:r>
       </w:hyperlink>
     </w:p>
     <w:p>
+      <w:pPr>
+        <w:jc w:val="both"/>
+        <w:rPr>
+          <w:rFonts w:asciiTheme="minorBidi" w:hAnsiTheme="minorBidi"/>
+          <w:lang w:val="en-US"/>
+        </w:rPr>
+      </w:pPr>
       <w:hyperlink r:id="rId15" w:history="1">
         <w:r>
           <w:rPr>
             <w:rStyle w:val="Hyperlink"/>
+            <w:rFonts w:asciiTheme="minorBidi" w:hAnsiTheme="minorBidi"/>
+            <w:lang w:val="en-US"/>
           </w:rPr>
-          <w:t>https://www.geeksforgeeks.org/ds</w:t>
-        </w:r>
-        <w:r>
-          <w:rPr>
-            <w:rStyle w:val="Hyperlink"/>
-          </w:rPr>
-          <w:t>a</w:t>
-        </w:r>
-        <w:r>
-          <w:rPr>
-            <w:rStyle w:val="Hyperlink"/>
-          </w:rPr>
-          <w:t>/a-search-algorithm/</w:t>
+          <w:t>https://theory.stanford.edu/~amitp/GameProgramming/AStarComparison.html</w:t>
         </w:r>
       </w:hyperlink>
     </w:p>
     <w:p>
+      <w:pPr>
+        <w:jc w:val="both"/>
+        <w:rPr>
+          <w:rFonts w:asciiTheme="minorBidi" w:hAnsiTheme="minorBidi"/>
+          <w:lang w:val="en-US"/>
+        </w:rPr>
+      </w:pPr>
       <w:hyperlink r:id="rId16" w:history="1">
         <w:r>
           <w:rPr>
             <w:rStyle w:val="Hyperlink"/>
+            <w:rFonts w:asciiTheme="minorBidi" w:hAnsiTheme="minorBidi"/>
+            <w:lang w:val="en-US"/>
+          </w:rPr>
+          <w:t>https://www.geeksforgeeks.org/dsa/a-search-algorithm/</w:t>
+        </w:r>
+      </w:hyperlink>
+    </w:p>
+    <w:p>
+      <w:pPr>
+        <w:jc w:val="both"/>
+        <w:rPr>
+          <w:rFonts w:asciiTheme="minorBidi" w:hAnsiTheme="minorBidi"/>
+          <w:lang w:val="en-US"/>
+        </w:rPr>
+      </w:pPr>
+      <w:hyperlink r:id="rId17" w:history="1">
+        <w:r>
+          <w:rPr>
+            <w:rStyle w:val="Hyperlink"/>
+            <w:rFonts w:asciiTheme="minorBidi" w:hAnsiTheme="minorBidi"/>
+            <w:lang w:val="en-US"/>
           </w:rPr>
           <w:t>https://www.baeldung.com/cs/a-star-algorithm</w:t>
         </w:r>
       </w:hyperlink>
     </w:p>
-    <w:p/>
-    <w:p/>
-    <w:p/>
-    <w:p/>
-    <w:p/>
-    <w:p/>
-    <w:p/>
-    <w:p/>
+    <w:p>
+      <w:pPr>
+        <w:jc w:val="both"/>
+        <w:rPr>
+          <w:rFonts w:asciiTheme="minorBidi" w:hAnsiTheme="minorBidi"/>
+          <w:lang w:val="en-US"/>
+        </w:rPr>
+      </w:pPr>
+    </w:p>
+    <w:p>
+      <w:pPr>
+        <w:jc w:val="both"/>
+        <w:rPr>
+          <w:rFonts w:asciiTheme="minorBidi" w:hAnsiTheme="minorBidi"/>
+          <w:lang w:val="en-US"/>
+        </w:rPr>
+      </w:pPr>
+    </w:p>
+    <w:p>
+      <w:pPr>
+        <w:jc w:val="both"/>
+        <w:rPr>
+          <w:rFonts w:asciiTheme="minorBidi" w:hAnsiTheme="minorBidi"/>
+          <w:lang w:val="en-US"/>
+        </w:rPr>
+      </w:pPr>
+    </w:p>
+    <w:p>
+      <w:pPr>
+        <w:jc w:val="both"/>
+        <w:rPr>
+          <w:rFonts w:asciiTheme="minorBidi" w:hAnsiTheme="minorBidi"/>
+          <w:lang w:val="en-US"/>
+        </w:rPr>
+      </w:pPr>
+    </w:p>
+    <w:p>
+      <w:pPr>
+        <w:jc w:val="both"/>
+        <w:rPr>
+          <w:rFonts w:asciiTheme="minorBidi" w:hAnsiTheme="minorBidi"/>
+          <w:lang w:val="en-US"/>
+        </w:rPr>
+      </w:pPr>
+    </w:p>
+    <w:p>
+      <w:pPr>
+        <w:jc w:val="both"/>
+        <w:rPr>
+          <w:rFonts w:asciiTheme="minorBidi" w:hAnsiTheme="minorBidi"/>
+          <w:lang w:val="en-US"/>
+        </w:rPr>
+      </w:pPr>
+    </w:p>
+    <w:p>
+      <w:pPr>
+        <w:jc w:val="both"/>
+        <w:rPr>
+          <w:rFonts w:asciiTheme="minorBidi" w:hAnsiTheme="minorBidi"/>
+          <w:lang w:val="en-US"/>
+        </w:rPr>
+      </w:pPr>
+    </w:p>
+    <w:p>
+      <w:pPr>
+        <w:jc w:val="both"/>
+        <w:rPr>
+          <w:rFonts w:asciiTheme="minorBidi" w:hAnsiTheme="minorBidi"/>
+          <w:lang w:val="en-US"/>
+        </w:rPr>
+      </w:pPr>
+    </w:p>
     <w:sectPr>
-      <w:footerReference w:type="default" r:id="rId17"/>
-      <w:pgSz w:w="12240" w:h="15840"/>
+      <w:footerReference w:type="default" r:id="rId18"/>
+      <w:pgSz w:w="11906" w:h="16838" w:code="9"/>
       <w:pgMar w:top="1440" w:right="1440" w:bottom="1440" w:left="1440" w:header="720" w:footer="720" w:gutter="0"/>
       <w:pgNumType w:start="0"/>
       <w:cols w:space="720"/>
@@ -967,59 +1343,6 @@
 </file>
 
 <file path=word/footer1.xml><?xml version="1.0" encoding="utf-8"?>
-<w:ftr xmlns:wpc="http://schemas.microsoft.com/office/word/2010/wordprocessingCanvas" xmlns:cx="http://schemas.microsoft.com/office/drawing/2014/chartex" xmlns:cx1="http://schemas.microsoft.com/office/drawing/2015/9/8/chartex" xmlns:cx2="http://schemas.microsoft.com/office/drawing/2015/10/21/chartex" xmlns:cx3="http://schemas.microsoft.com/office/drawing/2016/5/9/chartex" xmlns:cx4="http://schemas.microsoft.com/office/drawing/2016/5/10/chartex" xmlns:cx5="http://schemas.microsoft.com/office/drawing/2016/5/11/chartex" xmlns:cx6="http://schemas.microsoft.com/office/drawing/2016/5/12/chartex" xmlns:cx7="http://schemas.microsoft.com/office/drawing/2016/5/13/chartex" xmlns:cx8="http://schemas.microsoft.com/office/drawing/2016/5/14/chartex" xmlns:mc="http://schemas.openxmlformats.org/markup-compatibility/2006" xmlns:aink="http://schemas.microsoft.com/office/drawing/2016/ink" xmlns:am3d="http://schemas.microsoft.com/office/drawing/2017/model3d" xmlns:o="urn:schemas-microsoft-com:office:office" xmlns:oel="http://schemas.microsoft.com/office/2019/extlst" xmlns:r="http://schemas.openxmlformats.org/officeDocument/2006/relationships" xmlns:m="http://schemas.openxmlformats.org/officeDocument/2006/math" xmlns:v="urn:schemas-microsoft-com:vml" xmlns:wp14="http://schemas.microsoft.com/office/word/2010/wordprocessingDrawing" xmlns:wp="http://schemas.openxmlformats.org/drawingml/2006/wordprocessingDrawing" xmlns:w10="urn:schemas-microsoft-com:office:word" xmlns:w="http://schemas.openxmlformats.org/wordprocessingml/2006/main" xmlns:w14="http://schemas.microsoft.com/office/word/2010/wordml" xmlns:w15="http://schemas.microsoft.com/office/word/2012/wordml" xmlns:w16cex="http://schemas.microsoft.com/office/word/2018/wordml/cex" xmlns:w16cid="http://schemas.microsoft.com/office/word/2016/wordml/cid" xmlns:w16="http://schemas.microsoft.com/office/word/2018/wordml" xmlns:w16du="http://schemas.microsoft.com/office/word/2023/wordml/word16du" xmlns:w16sdtdh="http://schemas.microsoft.com/office/word/2020/wordml/sdtdatahash" xmlns:w16sdtfl="http://schemas.microsoft.com/office/word/2024/wordml/sdtformatlock" xmlns:w16se="http://schemas.microsoft.com/office/word/2015/wordml/symex" xmlns:wpg="http://schemas.microsoft.com/office/word/2010/wordprocessingGroup" xmlns:wpi="http://schemas.microsoft.com/office/word/2010/wordprocessingInk" xmlns:wne="http://schemas.microsoft.com/office/word/2006/wordml" xmlns:wps="http://schemas.microsoft.com/office/word/2010/wordprocessingShape" mc:Ignorable="w14 w15 w16se w16cid w16 w16cex w16sdtdh w16sdtfl w16du wp14">
-  <w:sdt>
-    <w:sdtPr>
-      <w:id w:val="-242961078"/>
-      <w:docPartObj>
-        <w:docPartGallery w:val="Page Numbers (Bottom of Page)"/>
-        <w:docPartUnique/>
-      </w:docPartObj>
-    </w:sdtPr>
-    <w:sdtEndPr>
-      <w:rPr>
-        <w:noProof/>
-      </w:rPr>
-    </w:sdtEndPr>
-    <w:sdtContent>
-      <w:p>
-        <w:pPr>
-          <w:pStyle w:val="Footer"/>
-          <w:jc w:val="right"/>
-        </w:pPr>
-        <w:r>
-          <w:fldChar w:fldCharType="begin"/>
-        </w:r>
-        <w:r>
-          <w:instrText xml:space="preserve"> PAGE   \* MERGEFORMAT </w:instrText>
-        </w:r>
-        <w:r>
-          <w:fldChar w:fldCharType="separate"/>
-        </w:r>
-        <w:r>
-          <w:rPr>
-            <w:noProof/>
-          </w:rPr>
-          <w:t>2</w:t>
-        </w:r>
-        <w:r>
-          <w:rPr>
-            <w:noProof/>
-          </w:rPr>
-          <w:fldChar w:fldCharType="end"/>
-        </w:r>
-      </w:p>
-    </w:sdtContent>
-  </w:sdt>
-  <w:p>
-    <w:pPr>
-      <w:pStyle w:val="Footer"/>
-    </w:pPr>
-  </w:p>
-</w:ftr>
-</file>
-
-<file path=word/footer2.xml><?xml version="1.0" encoding="utf-8"?>
 <w:ftr xmlns:wpc="http://schemas.microsoft.com/office/word/2010/wordprocessingCanvas" xmlns:cx="http://schemas.microsoft.com/office/drawing/2014/chartex" xmlns:cx1="http://schemas.microsoft.com/office/drawing/2015/9/8/chartex" xmlns:cx2="http://schemas.microsoft.com/office/drawing/2015/10/21/chartex" xmlns:cx3="http://schemas.microsoft.com/office/drawing/2016/5/9/chartex" xmlns:cx4="http://schemas.microsoft.com/office/drawing/2016/5/10/chartex" xmlns:cx5="http://schemas.microsoft.com/office/drawing/2016/5/11/chartex" xmlns:cx6="http://schemas.microsoft.com/office/drawing/2016/5/12/chartex" xmlns:cx7="http://schemas.microsoft.com/office/drawing/2016/5/13/chartex" xmlns:cx8="http://schemas.microsoft.com/office/drawing/2016/5/14/chartex" xmlns:mc="http://schemas.openxmlformats.org/markup-compatibility/2006" xmlns:aink="http://schemas.microsoft.com/office/drawing/2016/ink" xmlns:am3d="http://schemas.microsoft.com/office/drawing/2017/model3d" xmlns:o="urn:schemas-microsoft-com:office:office" xmlns:oel="http://schemas.microsoft.com/office/2019/extlst" xmlns:r="http://schemas.openxmlformats.org/officeDocument/2006/relationships" xmlns:m="http://schemas.openxmlformats.org/officeDocument/2006/math" xmlns:v="urn:schemas-microsoft-com:vml" xmlns:wp14="http://schemas.microsoft.com/office/word/2010/wordprocessingDrawing" xmlns:wp="http://schemas.openxmlformats.org/drawingml/2006/wordprocessingDrawing" xmlns:w10="urn:schemas-microsoft-com:office:word" xmlns:w="http://schemas.openxmlformats.org/wordprocessingml/2006/main" xmlns:w14="http://schemas.microsoft.com/office/word/2010/wordml" xmlns:w15="http://schemas.microsoft.com/office/word/2012/wordml" xmlns:w16cex="http://schemas.microsoft.com/office/word/2018/wordml/cex" xmlns:w16cid="http://schemas.microsoft.com/office/word/2016/wordml/cid" xmlns:w16="http://schemas.microsoft.com/office/word/2018/wordml" xmlns:w16du="http://schemas.microsoft.com/office/word/2023/wordml/word16du" xmlns:w16sdtdh="http://schemas.microsoft.com/office/word/2020/wordml/sdtdatahash" xmlns:w16sdtfl="http://schemas.microsoft.com/office/word/2024/wordml/sdtformatlock" xmlns:w16se="http://schemas.microsoft.com/office/word/2015/wordml/symex" xmlns:wpg="http://schemas.microsoft.com/office/word/2010/wordprocessingGroup" xmlns:wpi="http://schemas.microsoft.com/office/word/2010/wordprocessingInk" xmlns:wne="http://schemas.microsoft.com/office/word/2006/wordml" xmlns:wps="http://schemas.microsoft.com/office/word/2010/wordprocessingShape" mc:Ignorable="w14 w15 w16se w16cid w16 w16cex w16sdtdh w16sdtfl w16du wp14">
   <w:sdt>
     <w:sdtPr>
@@ -1100,6 +1423,297 @@
 <file path=word/numbering.xml><?xml version="1.0" encoding="utf-8"?>
 <w:numbering xmlns:wpc="http://schemas.microsoft.com/office/word/2010/wordprocessingCanvas" xmlns:cx="http://schemas.microsoft.com/office/drawing/2014/chartex" xmlns:cx1="http://schemas.microsoft.com/office/drawing/2015/9/8/chartex" xmlns:cx2="http://schemas.microsoft.com/office/drawing/2015/10/21/chartex" xmlns:cx3="http://schemas.microsoft.com/office/drawing/2016/5/9/chartex" xmlns:cx4="http://schemas.microsoft.com/office/drawing/2016/5/10/chartex" xmlns:cx5="http://schemas.microsoft.com/office/drawing/2016/5/11/chartex" xmlns:cx6="http://schemas.microsoft.com/office/drawing/2016/5/12/chartex" xmlns:cx7="http://schemas.microsoft.com/office/drawing/2016/5/13/chartex" xmlns:cx8="http://schemas.microsoft.com/office/drawing/2016/5/14/chartex" xmlns:mc="http://schemas.openxmlformats.org/markup-compatibility/2006" xmlns:aink="http://schemas.microsoft.com/office/drawing/2016/ink" xmlns:am3d="http://schemas.microsoft.com/office/drawing/2017/model3d" xmlns:o="urn:schemas-microsoft-com:office:office" xmlns:oel="http://schemas.microsoft.com/office/2019/extlst" xmlns:r="http://schemas.openxmlformats.org/officeDocument/2006/relationships" xmlns:m="http://schemas.openxmlformats.org/officeDocument/2006/math" xmlns:v="urn:schemas-microsoft-com:vml" xmlns:wp14="http://schemas.microsoft.com/office/word/2010/wordprocessingDrawing" xmlns:wp="http://schemas.openxmlformats.org/drawingml/2006/wordprocessingDrawing" xmlns:w10="urn:schemas-microsoft-com:office:word" xmlns:w="http://schemas.openxmlformats.org/wordprocessingml/2006/main" xmlns:w14="http://schemas.microsoft.com/office/word/2010/wordml" xmlns:w15="http://schemas.microsoft.com/office/word/2012/wordml" xmlns:w16cex="http://schemas.microsoft.com/office/word/2018/wordml/cex" xmlns:w16cid="http://schemas.microsoft.com/office/word/2016/wordml/cid" xmlns:w16="http://schemas.microsoft.com/office/word/2018/wordml" xmlns:w16du="http://schemas.microsoft.com/office/word/2023/wordml/word16du" xmlns:w16sdtdh="http://schemas.microsoft.com/office/word/2020/wordml/sdtdatahash" xmlns:w16sdtfl="http://schemas.microsoft.com/office/word/2024/wordml/sdtformatlock" xmlns:w16se="http://schemas.microsoft.com/office/word/2015/wordml/symex" xmlns:wpg="http://schemas.microsoft.com/office/word/2010/wordprocessingGroup" xmlns:wpi="http://schemas.microsoft.com/office/word/2010/wordprocessingInk" xmlns:wne="http://schemas.microsoft.com/office/word/2006/wordml" xmlns:wps="http://schemas.microsoft.com/office/word/2010/wordprocessingShape" mc:Ignorable="w14 w15 w16se w16cid w16 w16cex w16sdtdh w16sdtfl w16du wp14">
   <w:abstractNum w:abstractNumId="0" w15:restartNumberingAfterBreak="0">
+    <w:nsid w:val="14F23680"/>
+    <w:multiLevelType w:val="hybridMultilevel"/>
+    <w:tmpl w:val="2F5094AE"/>
+    <w:lvl w:ilvl="0" w:tplc="8B082FE0">
+      <w:start w:val="1"/>
+      <w:numFmt w:val="decimal"/>
+      <w:lvlText w:val="%1."/>
+      <w:lvlJc w:val="left"/>
+      <w:pPr>
+        <w:ind w:left="1080" w:hanging="360"/>
+      </w:pPr>
+      <w:rPr>
+        <w:rFonts w:hint="default"/>
+      </w:rPr>
+    </w:lvl>
+    <w:lvl w:ilvl="1" w:tplc="08090019">
+      <w:start w:val="1"/>
+      <w:numFmt w:val="lowerLetter"/>
+      <w:lvlText w:val="%2."/>
+      <w:lvlJc w:val="left"/>
+      <w:pPr>
+        <w:ind w:left="1800" w:hanging="360"/>
+      </w:pPr>
+    </w:lvl>
+    <w:lvl w:ilvl="2" w:tplc="0809001B" w:tentative="1">
+      <w:start w:val="1"/>
+      <w:numFmt w:val="lowerRoman"/>
+      <w:lvlText w:val="%3."/>
+      <w:lvlJc w:val="right"/>
+      <w:pPr>
+        <w:ind w:left="2520" w:hanging="180"/>
+      </w:pPr>
+    </w:lvl>
+    <w:lvl w:ilvl="3" w:tplc="0809000F" w:tentative="1">
+      <w:start w:val="1"/>
+      <w:numFmt w:val="decimal"/>
+      <w:lvlText w:val="%4."/>
+      <w:lvlJc w:val="left"/>
+      <w:pPr>
+        <w:ind w:left="3240" w:hanging="360"/>
+      </w:pPr>
+    </w:lvl>
+    <w:lvl w:ilvl="4" w:tplc="08090019" w:tentative="1">
+      <w:start w:val="1"/>
+      <w:numFmt w:val="lowerLetter"/>
+      <w:lvlText w:val="%5."/>
+      <w:lvlJc w:val="left"/>
+      <w:pPr>
+        <w:ind w:left="3960" w:hanging="360"/>
+      </w:pPr>
+    </w:lvl>
+    <w:lvl w:ilvl="5" w:tplc="0809001B" w:tentative="1">
+      <w:start w:val="1"/>
+      <w:numFmt w:val="lowerRoman"/>
+      <w:lvlText w:val="%6."/>
+      <w:lvlJc w:val="right"/>
+      <w:pPr>
+        <w:ind w:left="4680" w:hanging="180"/>
+      </w:pPr>
+    </w:lvl>
+    <w:lvl w:ilvl="6" w:tplc="0809000F" w:tentative="1">
+      <w:start w:val="1"/>
+      <w:numFmt w:val="decimal"/>
+      <w:lvlText w:val="%7."/>
+      <w:lvlJc w:val="left"/>
+      <w:pPr>
+        <w:ind w:left="5400" w:hanging="360"/>
+      </w:pPr>
+    </w:lvl>
+    <w:lvl w:ilvl="7" w:tplc="08090019" w:tentative="1">
+      <w:start w:val="1"/>
+      <w:numFmt w:val="lowerLetter"/>
+      <w:lvlText w:val="%8."/>
+      <w:lvlJc w:val="left"/>
+      <w:pPr>
+        <w:ind w:left="6120" w:hanging="360"/>
+      </w:pPr>
+    </w:lvl>
+    <w:lvl w:ilvl="8" w:tplc="0809001B" w:tentative="1">
+      <w:start w:val="1"/>
+      <w:numFmt w:val="lowerRoman"/>
+      <w:lvlText w:val="%9."/>
+      <w:lvlJc w:val="right"/>
+      <w:pPr>
+        <w:ind w:left="6840" w:hanging="180"/>
+      </w:pPr>
+    </w:lvl>
+  </w:abstractNum>
+  <w:abstractNum w:abstractNumId="1" w15:restartNumberingAfterBreak="0">
+    <w:nsid w:val="199820DB"/>
+    <w:multiLevelType w:val="hybridMultilevel"/>
+    <w:tmpl w:val="2DF8E5A0"/>
+    <w:lvl w:ilvl="0" w:tplc="0809000F">
+      <w:start w:val="1"/>
+      <w:numFmt w:val="decimal"/>
+      <w:lvlText w:val="%1."/>
+      <w:lvlJc w:val="left"/>
+      <w:pPr>
+        <w:ind w:left="720" w:hanging="360"/>
+      </w:pPr>
+      <w:rPr>
+        <w:rFonts w:hint="default"/>
+      </w:rPr>
+    </w:lvl>
+    <w:lvl w:ilvl="1" w:tplc="08090019" w:tentative="1">
+      <w:start w:val="1"/>
+      <w:numFmt w:val="lowerLetter"/>
+      <w:lvlText w:val="%2."/>
+      <w:lvlJc w:val="left"/>
+      <w:pPr>
+        <w:ind w:left="1440" w:hanging="360"/>
+      </w:pPr>
+    </w:lvl>
+    <w:lvl w:ilvl="2" w:tplc="0809001B" w:tentative="1">
+      <w:start w:val="1"/>
+      <w:numFmt w:val="lowerRoman"/>
+      <w:lvlText w:val="%3."/>
+      <w:lvlJc w:val="right"/>
+      <w:pPr>
+        <w:ind w:left="2160" w:hanging="180"/>
+      </w:pPr>
+    </w:lvl>
+    <w:lvl w:ilvl="3" w:tplc="0809000F" w:tentative="1">
+      <w:start w:val="1"/>
+      <w:numFmt w:val="decimal"/>
+      <w:lvlText w:val="%4."/>
+      <w:lvlJc w:val="left"/>
+      <w:pPr>
+        <w:ind w:left="2880" w:hanging="360"/>
+      </w:pPr>
+    </w:lvl>
+    <w:lvl w:ilvl="4" w:tplc="08090019" w:tentative="1">
+      <w:start w:val="1"/>
+      <w:numFmt w:val="lowerLetter"/>
+      <w:lvlText w:val="%5."/>
+      <w:lvlJc w:val="left"/>
+      <w:pPr>
+        <w:ind w:left="3600" w:hanging="360"/>
+      </w:pPr>
+    </w:lvl>
+    <w:lvl w:ilvl="5" w:tplc="0809001B" w:tentative="1">
+      <w:start w:val="1"/>
+      <w:numFmt w:val="lowerRoman"/>
+      <w:lvlText w:val="%6."/>
+      <w:lvlJc w:val="right"/>
+      <w:pPr>
+        <w:ind w:left="4320" w:hanging="180"/>
+      </w:pPr>
+    </w:lvl>
+    <w:lvl w:ilvl="6" w:tplc="0809000F" w:tentative="1">
+      <w:start w:val="1"/>
+      <w:numFmt w:val="decimal"/>
+      <w:lvlText w:val="%7."/>
+      <w:lvlJc w:val="left"/>
+      <w:pPr>
+        <w:ind w:left="5040" w:hanging="360"/>
+      </w:pPr>
+    </w:lvl>
+    <w:lvl w:ilvl="7" w:tplc="08090019" w:tentative="1">
+      <w:start w:val="1"/>
+      <w:numFmt w:val="lowerLetter"/>
+      <w:lvlText w:val="%8."/>
+      <w:lvlJc w:val="left"/>
+      <w:pPr>
+        <w:ind w:left="5760" w:hanging="360"/>
+      </w:pPr>
+    </w:lvl>
+    <w:lvl w:ilvl="8" w:tplc="0809001B" w:tentative="1">
+      <w:start w:val="1"/>
+      <w:numFmt w:val="lowerRoman"/>
+      <w:lvlText w:val="%9."/>
+      <w:lvlJc w:val="right"/>
+      <w:pPr>
+        <w:ind w:left="6480" w:hanging="180"/>
+      </w:pPr>
+    </w:lvl>
+  </w:abstractNum>
+  <w:abstractNum w:abstractNumId="2" w15:restartNumberingAfterBreak="0">
+    <w:nsid w:val="546A2873"/>
+    <w:multiLevelType w:val="hybridMultilevel"/>
+    <w:tmpl w:val="01A465E6"/>
+    <w:lvl w:ilvl="0" w:tplc="08090001">
+      <w:start w:val="1"/>
+      <w:numFmt w:val="bullet"/>
+      <w:lvlText w:val=""/>
+      <w:lvlJc w:val="left"/>
+      <w:pPr>
+        <w:ind w:left="1800" w:hanging="360"/>
+      </w:pPr>
+      <w:rPr>
+        <w:rFonts w:ascii="Symbol" w:hAnsi="Symbol" w:hint="default"/>
+      </w:rPr>
+    </w:lvl>
+    <w:lvl w:ilvl="1" w:tplc="08090003" w:tentative="1">
+      <w:start w:val="1"/>
+      <w:numFmt w:val="bullet"/>
+      <w:lvlText w:val="o"/>
+      <w:lvlJc w:val="left"/>
+      <w:pPr>
+        <w:ind w:left="2520" w:hanging="360"/>
+      </w:pPr>
+      <w:rPr>
+        <w:rFonts w:ascii="Courier New" w:hAnsi="Courier New" w:cs="Courier New" w:hint="default"/>
+      </w:rPr>
+    </w:lvl>
+    <w:lvl w:ilvl="2" w:tplc="08090005" w:tentative="1">
+      <w:start w:val="1"/>
+      <w:numFmt w:val="bullet"/>
+      <w:lvlText w:val=""/>
+      <w:lvlJc w:val="left"/>
+      <w:pPr>
+        <w:ind w:left="3240" w:hanging="360"/>
+      </w:pPr>
+      <w:rPr>
+        <w:rFonts w:ascii="Wingdings" w:hAnsi="Wingdings" w:hint="default"/>
+      </w:rPr>
+    </w:lvl>
+    <w:lvl w:ilvl="3" w:tplc="08090001" w:tentative="1">
+      <w:start w:val="1"/>
+      <w:numFmt w:val="bullet"/>
+      <w:lvlText w:val=""/>
+      <w:lvlJc w:val="left"/>
+      <w:pPr>
+        <w:ind w:left="3960" w:hanging="360"/>
+      </w:pPr>
+      <w:rPr>
+        <w:rFonts w:ascii="Symbol" w:hAnsi="Symbol" w:hint="default"/>
+      </w:rPr>
+    </w:lvl>
+    <w:lvl w:ilvl="4" w:tplc="08090003" w:tentative="1">
+      <w:start w:val="1"/>
+      <w:numFmt w:val="bullet"/>
+      <w:lvlText w:val="o"/>
+      <w:lvlJc w:val="left"/>
+      <w:pPr>
+        <w:ind w:left="4680" w:hanging="360"/>
+      </w:pPr>
+      <w:rPr>
+        <w:rFonts w:ascii="Courier New" w:hAnsi="Courier New" w:cs="Courier New" w:hint="default"/>
+      </w:rPr>
+    </w:lvl>
+    <w:lvl w:ilvl="5" w:tplc="08090005" w:tentative="1">
+      <w:start w:val="1"/>
+      <w:numFmt w:val="bullet"/>
+      <w:lvlText w:val=""/>
+      <w:lvlJc w:val="left"/>
+      <w:pPr>
+        <w:ind w:left="5400" w:hanging="360"/>
+      </w:pPr>
+      <w:rPr>
+        <w:rFonts w:ascii="Wingdings" w:hAnsi="Wingdings" w:hint="default"/>
+      </w:rPr>
+    </w:lvl>
+    <w:lvl w:ilvl="6" w:tplc="08090001" w:tentative="1">
+      <w:start w:val="1"/>
+      <w:numFmt w:val="bullet"/>
+      <w:lvlText w:val=""/>
+      <w:lvlJc w:val="left"/>
+      <w:pPr>
+        <w:ind w:left="6120" w:hanging="360"/>
+      </w:pPr>
+      <w:rPr>
+        <w:rFonts w:ascii="Symbol" w:hAnsi="Symbol" w:hint="default"/>
+      </w:rPr>
+    </w:lvl>
+    <w:lvl w:ilvl="7" w:tplc="08090003" w:tentative="1">
+      <w:start w:val="1"/>
+      <w:numFmt w:val="bullet"/>
+      <w:lvlText w:val="o"/>
+      <w:lvlJc w:val="left"/>
+      <w:pPr>
+        <w:ind w:left="6840" w:hanging="360"/>
+      </w:pPr>
+      <w:rPr>
+        <w:rFonts w:ascii="Courier New" w:hAnsi="Courier New" w:cs="Courier New" w:hint="default"/>
+      </w:rPr>
+    </w:lvl>
+    <w:lvl w:ilvl="8" w:tplc="08090005" w:tentative="1">
+      <w:start w:val="1"/>
+      <w:numFmt w:val="bullet"/>
+      <w:lvlText w:val=""/>
+      <w:lvlJc w:val="left"/>
+      <w:pPr>
+        <w:ind w:left="7560" w:hanging="360"/>
+      </w:pPr>
+      <w:rPr>
+        <w:rFonts w:ascii="Wingdings" w:hAnsi="Wingdings" w:hint="default"/>
+      </w:rPr>
+    </w:lvl>
+  </w:abstractNum>
+  <w:abstractNum w:abstractNumId="3" w15:restartNumberingAfterBreak="0">
     <w:nsid w:val="573E3AD2"/>
     <w:multiLevelType w:val="hybridMultilevel"/>
     <w:tmpl w:val="04AA3AAE"/>
@@ -1212,8 +1826,109 @@
       </w:rPr>
     </w:lvl>
   </w:abstractNum>
+  <w:abstractNum w:abstractNumId="4" w15:restartNumberingAfterBreak="0">
+    <w:nsid w:val="79307786"/>
+    <w:multiLevelType w:val="hybridMultilevel"/>
+    <w:tmpl w:val="2F5094AE"/>
+    <w:lvl w:ilvl="0" w:tplc="FFFFFFFF">
+      <w:start w:val="1"/>
+      <w:numFmt w:val="decimal"/>
+      <w:lvlText w:val="%1."/>
+      <w:lvlJc w:val="left"/>
+      <w:pPr>
+        <w:ind w:left="1080" w:hanging="360"/>
+      </w:pPr>
+      <w:rPr>
+        <w:rFonts w:hint="default"/>
+      </w:rPr>
+    </w:lvl>
+    <w:lvl w:ilvl="1" w:tplc="FFFFFFFF">
+      <w:start w:val="1"/>
+      <w:numFmt w:val="lowerLetter"/>
+      <w:lvlText w:val="%2."/>
+      <w:lvlJc w:val="left"/>
+      <w:pPr>
+        <w:ind w:left="1800" w:hanging="360"/>
+      </w:pPr>
+    </w:lvl>
+    <w:lvl w:ilvl="2" w:tplc="FFFFFFFF" w:tentative="1">
+      <w:start w:val="1"/>
+      <w:numFmt w:val="lowerRoman"/>
+      <w:lvlText w:val="%3."/>
+      <w:lvlJc w:val="right"/>
+      <w:pPr>
+        <w:ind w:left="2520" w:hanging="180"/>
+      </w:pPr>
+    </w:lvl>
+    <w:lvl w:ilvl="3" w:tplc="FFFFFFFF" w:tentative="1">
+      <w:start w:val="1"/>
+      <w:numFmt w:val="decimal"/>
+      <w:lvlText w:val="%4."/>
+      <w:lvlJc w:val="left"/>
+      <w:pPr>
+        <w:ind w:left="3240" w:hanging="360"/>
+      </w:pPr>
+    </w:lvl>
+    <w:lvl w:ilvl="4" w:tplc="FFFFFFFF" w:tentative="1">
+      <w:start w:val="1"/>
+      <w:numFmt w:val="lowerLetter"/>
+      <w:lvlText w:val="%5."/>
+      <w:lvlJc w:val="left"/>
+      <w:pPr>
+        <w:ind w:left="3960" w:hanging="360"/>
+      </w:pPr>
+    </w:lvl>
+    <w:lvl w:ilvl="5" w:tplc="FFFFFFFF" w:tentative="1">
+      <w:start w:val="1"/>
+      <w:numFmt w:val="lowerRoman"/>
+      <w:lvlText w:val="%6."/>
+      <w:lvlJc w:val="right"/>
+      <w:pPr>
+        <w:ind w:left="4680" w:hanging="180"/>
+      </w:pPr>
+    </w:lvl>
+    <w:lvl w:ilvl="6" w:tplc="FFFFFFFF" w:tentative="1">
+      <w:start w:val="1"/>
+      <w:numFmt w:val="decimal"/>
+      <w:lvlText w:val="%7."/>
+      <w:lvlJc w:val="left"/>
+      <w:pPr>
+        <w:ind w:left="5400" w:hanging="360"/>
+      </w:pPr>
+    </w:lvl>
+    <w:lvl w:ilvl="7" w:tplc="FFFFFFFF" w:tentative="1">
+      <w:start w:val="1"/>
+      <w:numFmt w:val="lowerLetter"/>
+      <w:lvlText w:val="%8."/>
+      <w:lvlJc w:val="left"/>
+      <w:pPr>
+        <w:ind w:left="6120" w:hanging="360"/>
+      </w:pPr>
+    </w:lvl>
+    <w:lvl w:ilvl="8" w:tplc="FFFFFFFF" w:tentative="1">
+      <w:start w:val="1"/>
+      <w:numFmt w:val="lowerRoman"/>
+      <w:lvlText w:val="%9."/>
+      <w:lvlJc w:val="right"/>
+      <w:pPr>
+        <w:ind w:left="6840" w:hanging="180"/>
+      </w:pPr>
+    </w:lvl>
+  </w:abstractNum>
   <w:num w:numId="1" w16cid:durableId="2075082800">
+    <w:abstractNumId w:val="3"/>
+  </w:num>
+  <w:num w:numId="2" w16cid:durableId="1471097875">
+    <w:abstractNumId w:val="1"/>
+  </w:num>
+  <w:num w:numId="3" w16cid:durableId="1694962537">
     <w:abstractNumId w:val="0"/>
+  </w:num>
+  <w:num w:numId="4" w16cid:durableId="469400546">
+    <w:abstractNumId w:val="4"/>
+  </w:num>
+  <w:num w:numId="5" w16cid:durableId="1381977018">
+    <w:abstractNumId w:val="2"/>
   </w:num>
 </w:numbering>
 </file>

</xml_diff>

<commit_message>
fixing the neighbor restrictions  once again and working on documentation
</commit_message>
<xml_diff>
--- a/Senior Project Documentation.docx
+++ b/Senior Project Documentation.docx
@@ -1065,20 +1065,12 @@
         </w:rPr>
         <w:t xml:space="preserve">These adjacency restrictions </w:t>
       </w:r>
-    </w:p>
-    <w:p>
-      <w:pPr>
-        <w:rPr>
-          <w:lang w:val="en-US"/>
-        </w:rPr>
-      </w:pPr>
-    </w:p>
-    <w:p>
-      <w:pPr>
-        <w:rPr>
-          <w:lang w:val="en-US"/>
-        </w:rPr>
-      </w:pPr>
+      <w:r>
+        <w:rPr>
+          <w:lang w:val="en-US"/>
+        </w:rPr>
+        <w:t xml:space="preserve">define what terrain type is allowed to neighbor next to the other. Therefore, grass can neighbor anything, mountain neighbors grass and itself, the tree neighbors anything but water, and water only neighbors the grass and itself. </w:t>
+      </w:r>
     </w:p>
     <w:p>
       <w:pPr>
@@ -1095,6 +1087,13 @@
           <w:lang w:val="en-US"/>
         </w:rPr>
       </w:pPr>
+      <w:r>
+        <w:rPr>
+          <w:lang w:val="en-US"/>
+        </w:rPr>
+        <w:lastRenderedPageBreak/>
+        <w:t xml:space="preserve">Through constraint propagation, it allows for the number of possible tiles on a cell to be reduced depending on the neighboring cells. This, in turn, influences the selections made by the function. This entirely continues looping until every cell within the map grid has been assigned a single terrain type which leads to a filled map that has the defined terrain constraints. </w:t>
+      </w:r>
     </w:p>
     <w:p>
       <w:pPr>
@@ -1106,6 +1105,70 @@
     </w:p>
     <w:p>
       <w:pPr>
+        <w:ind w:left="1080" w:firstLine="360"/>
+        <w:rPr>
+          <w:lang w:val="en-US"/>
+        </w:rPr>
+      </w:pPr>
+      <w:r>
+        <w:rPr>
+          <w:lang w:val="en-US"/>
+        </w:rPr>
+        <w:t>Through WFC, this map system does not require a predefined map but rather a random set of tiles that still have a structur</w:t>
+      </w:r>
+      <w:r>
+        <w:rPr>
+          <w:lang w:val="en-US"/>
+        </w:rPr>
+        <w:t xml:space="preserve">al consistency to them. </w:t>
+      </w:r>
+      <w:r>
+        <w:rPr>
+          <w:lang w:val="en-US"/>
+        </w:rPr>
+        <w:t>This leads to the environment having a variety yet at the same time coherency during different game sessions.</w:t>
+      </w:r>
+    </w:p>
+    <w:p>
+      <w:pPr>
+        <w:rPr>
+          <w:lang w:val="en-US"/>
+        </w:rPr>
+      </w:pPr>
+    </w:p>
+    <w:p>
+      <w:pPr>
+        <w:rPr>
+          <w:lang w:val="en-US"/>
+        </w:rPr>
+      </w:pPr>
+    </w:p>
+    <w:p>
+      <w:pPr>
+        <w:ind w:left="1080" w:firstLine="360"/>
+        <w:rPr>
+          <w:lang w:val="en-US"/>
+        </w:rPr>
+      </w:pPr>
+    </w:p>
+    <w:p>
+      <w:pPr>
+        <w:ind w:left="1080" w:firstLine="360"/>
+        <w:rPr>
+          <w:lang w:val="en-US"/>
+        </w:rPr>
+      </w:pPr>
+    </w:p>
+    <w:p>
+      <w:pPr>
+        <w:ind w:left="1080" w:firstLine="360"/>
+        <w:rPr>
+          <w:lang w:val="en-US"/>
+        </w:rPr>
+      </w:pPr>
+    </w:p>
+    <w:p>
+      <w:pPr>
         <w:pStyle w:val="Heading1"/>
         <w:jc w:val="both"/>
         <w:rPr>
@@ -1118,7 +1181,6 @@
           <w:rFonts w:asciiTheme="minorBidi" w:hAnsiTheme="minorBidi" w:cstheme="minorBidi"/>
           <w:lang w:val="en-US"/>
         </w:rPr>
-        <w:lastRenderedPageBreak/>
         <w:t>Bibliography</w:t>
       </w:r>
     </w:p>

</xml_diff>

<commit_message>
putting the find path method in comments as I'm currently checking program's compatibility
</commit_message>
<xml_diff>
--- a/Senior Project Documentation.docx
+++ b/Senior Project Documentation.docx
@@ -17,6 +17,10 @@
     <w:p>
       <w:pPr>
         <w:pStyle w:val="Heading1"/>
+        <w:numPr>
+          <w:ilvl w:val="0"/>
+          <w:numId w:val="0"/>
+        </w:numPr>
         <w:jc w:val="both"/>
         <w:rPr>
           <w:rFonts w:asciiTheme="minorBidi" w:hAnsiTheme="minorBidi" w:cstheme="minorBidi"/>
@@ -25,6 +29,7 @@
       </w:pPr>
       <w:bookmarkStart w:id="0" w:name="_Toc219873179"/>
       <w:bookmarkStart w:id="1" w:name="_Toc219873213"/>
+      <w:bookmarkStart w:id="2" w:name="_Toc224417144"/>
       <w:r>
         <w:rPr>
           <w:rFonts w:asciiTheme="minorBidi" w:hAnsiTheme="minorBidi" w:cstheme="minorBidi"/>
@@ -34,23 +39,22 @@
       </w:r>
       <w:bookmarkEnd w:id="0"/>
       <w:bookmarkEnd w:id="1"/>
+      <w:bookmarkEnd w:id="2"/>
     </w:p>
     <w:p>
       <w:pPr>
         <w:pStyle w:val="TOC1"/>
         <w:tabs>
-          <w:tab w:val="right" w:leader="middleDot" w:pos="9350"/>
+          <w:tab w:val="right" w:leader="middleDot" w:pos="9016"/>
         </w:tabs>
-        <w:jc w:val="both"/>
-        <w:rPr>
-          <w:rFonts w:asciiTheme="minorBidi" w:hAnsiTheme="minorBidi" w:cstheme="minorBidi"/>
+        <w:rPr>
+          <w:rFonts w:cstheme="minorBidi"/>
           <w:b w:val="0"/>
           <w:bCs w:val="0"/>
           <w:i w:val="0"/>
           <w:iCs w:val="0"/>
           <w:noProof/>
           <w:szCs w:val="24"/>
-          <w:lang w:val="en-US"/>
         </w:rPr>
       </w:pPr>
       <w:r>
@@ -74,75 +78,739 @@
         </w:rPr>
         <w:fldChar w:fldCharType="separate"/>
       </w:r>
-      <w:hyperlink w:anchor="_Toc219873214" w:history="1">
+      <w:hyperlink w:anchor="_Toc224417144" w:history="1">
         <w:r>
           <w:rPr>
             <w:rStyle w:val="Hyperlink"/>
-            <w:rFonts w:asciiTheme="minorBidi" w:hAnsiTheme="minorBidi" w:cstheme="minorBidi"/>
+            <w:rFonts w:asciiTheme="minorBidi" w:hAnsiTheme="minorBidi"/>
             <w:noProof/>
             <w:lang w:val="en-US"/>
           </w:rPr>
+          <w:t>Table of Contents</w:t>
+        </w:r>
+        <w:r>
+          <w:rPr>
+            <w:noProof/>
+            <w:webHidden/>
+          </w:rPr>
+          <w:tab/>
+        </w:r>
+        <w:r>
+          <w:rPr>
+            <w:noProof/>
+            <w:webHidden/>
+          </w:rPr>
+          <w:fldChar w:fldCharType="begin"/>
+        </w:r>
+        <w:r>
+          <w:rPr>
+            <w:noProof/>
+            <w:webHidden/>
+          </w:rPr>
+          <w:instrText xml:space="preserve"> PAGEREF _Toc224417144 \h </w:instrText>
+        </w:r>
+        <w:r>
+          <w:rPr>
+            <w:noProof/>
+            <w:webHidden/>
+          </w:rPr>
+        </w:r>
+        <w:r>
+          <w:rPr>
+            <w:noProof/>
+            <w:webHidden/>
+          </w:rPr>
+          <w:fldChar w:fldCharType="separate"/>
+        </w:r>
+        <w:r>
+          <w:rPr>
+            <w:noProof/>
+            <w:webHidden/>
+          </w:rPr>
+          <w:t>0</w:t>
+        </w:r>
+        <w:r>
+          <w:rPr>
+            <w:noProof/>
+            <w:webHidden/>
+          </w:rPr>
+          <w:fldChar w:fldCharType="end"/>
+        </w:r>
+      </w:hyperlink>
+    </w:p>
+    <w:p>
+      <w:pPr>
+        <w:pStyle w:val="TOC1"/>
+        <w:tabs>
+          <w:tab w:val="right" w:leader="middleDot" w:pos="9016"/>
+        </w:tabs>
+        <w:rPr>
+          <w:rFonts w:cstheme="minorBidi"/>
+          <w:b w:val="0"/>
+          <w:bCs w:val="0"/>
+          <w:i w:val="0"/>
+          <w:iCs w:val="0"/>
+          <w:noProof/>
+          <w:szCs w:val="24"/>
+        </w:rPr>
+      </w:pPr>
+      <w:hyperlink w:anchor="_Toc224417145" w:history="1">
+        <w:r>
+          <w:rPr>
+            <w:rStyle w:val="Hyperlink"/>
+            <w:rFonts w:asciiTheme="minorBidi" w:hAnsiTheme="minorBidi"/>
+            <w:noProof/>
+            <w:lang w:val="en-US"/>
+          </w:rPr>
           <w:t>Introduction</w:t>
         </w:r>
         <w:r>
           <w:rPr>
-            <w:rFonts w:asciiTheme="minorBidi" w:hAnsiTheme="minorBidi" w:cstheme="minorBidi"/>
             <w:noProof/>
             <w:webHidden/>
+          </w:rPr>
+          <w:tab/>
+        </w:r>
+        <w:r>
+          <w:rPr>
+            <w:noProof/>
+            <w:webHidden/>
+          </w:rPr>
+          <w:fldChar w:fldCharType="begin"/>
+        </w:r>
+        <w:r>
+          <w:rPr>
+            <w:noProof/>
+            <w:webHidden/>
+          </w:rPr>
+          <w:instrText xml:space="preserve"> PAGEREF _Toc224417145 \h </w:instrText>
+        </w:r>
+        <w:r>
+          <w:rPr>
+            <w:noProof/>
+            <w:webHidden/>
+          </w:rPr>
+        </w:r>
+        <w:r>
+          <w:rPr>
+            <w:noProof/>
+            <w:webHidden/>
+          </w:rPr>
+          <w:fldChar w:fldCharType="separate"/>
+        </w:r>
+        <w:r>
+          <w:rPr>
+            <w:noProof/>
+            <w:webHidden/>
+          </w:rPr>
+          <w:t>1</w:t>
+        </w:r>
+        <w:r>
+          <w:rPr>
+            <w:noProof/>
+            <w:webHidden/>
+          </w:rPr>
+          <w:fldChar w:fldCharType="end"/>
+        </w:r>
+      </w:hyperlink>
+    </w:p>
+    <w:p>
+      <w:pPr>
+        <w:pStyle w:val="TOC1"/>
+        <w:tabs>
+          <w:tab w:val="right" w:leader="middleDot" w:pos="9016"/>
+        </w:tabs>
+        <w:rPr>
+          <w:rFonts w:cstheme="minorBidi"/>
+          <w:b w:val="0"/>
+          <w:bCs w:val="0"/>
+          <w:i w:val="0"/>
+          <w:iCs w:val="0"/>
+          <w:noProof/>
+          <w:szCs w:val="24"/>
+        </w:rPr>
+      </w:pPr>
+      <w:hyperlink w:anchor="_Toc224417146" w:history="1">
+        <w:r>
+          <w:rPr>
+            <w:rStyle w:val="Hyperlink"/>
+            <w:rFonts w:asciiTheme="minorBidi" w:hAnsiTheme="minorBidi"/>
+            <w:noProof/>
             <w:lang w:val="en-US"/>
           </w:rPr>
+          <w:t>Specifications of the Game Requirements and their Analysis</w:t>
+        </w:r>
+        <w:r>
+          <w:rPr>
+            <w:noProof/>
+            <w:webHidden/>
+          </w:rPr>
           <w:tab/>
         </w:r>
         <w:r>
           <w:rPr>
-            <w:rFonts w:asciiTheme="minorBidi" w:hAnsiTheme="minorBidi" w:cstheme="minorBidi"/>
             <w:noProof/>
             <w:webHidden/>
+          </w:rPr>
+          <w:fldChar w:fldCharType="begin"/>
+        </w:r>
+        <w:r>
+          <w:rPr>
+            <w:noProof/>
+            <w:webHidden/>
+          </w:rPr>
+          <w:instrText xml:space="preserve"> PAGEREF _Toc224417146 \h </w:instrText>
+        </w:r>
+        <w:r>
+          <w:rPr>
+            <w:noProof/>
+            <w:webHidden/>
+          </w:rPr>
+        </w:r>
+        <w:r>
+          <w:rPr>
+            <w:noProof/>
+            <w:webHidden/>
+          </w:rPr>
+          <w:fldChar w:fldCharType="separate"/>
+        </w:r>
+        <w:r>
+          <w:rPr>
+            <w:noProof/>
+            <w:webHidden/>
+          </w:rPr>
+          <w:t>2</w:t>
+        </w:r>
+        <w:r>
+          <w:rPr>
+            <w:noProof/>
+            <w:webHidden/>
+          </w:rPr>
+          <w:fldChar w:fldCharType="end"/>
+        </w:r>
+      </w:hyperlink>
+    </w:p>
+    <w:p>
+      <w:pPr>
+        <w:pStyle w:val="TOC2"/>
+        <w:tabs>
+          <w:tab w:val="left" w:pos="720"/>
+          <w:tab w:val="right" w:leader="middleDot" w:pos="9016"/>
+        </w:tabs>
+        <w:rPr>
+          <w:rFonts w:cstheme="minorBidi"/>
+          <w:b w:val="0"/>
+          <w:bCs w:val="0"/>
+          <w:noProof/>
+          <w:sz w:val="24"/>
+          <w:szCs w:val="24"/>
+        </w:rPr>
+      </w:pPr>
+      <w:hyperlink w:anchor="_Toc224417147" w:history="1">
+        <w:r>
+          <w:rPr>
+            <w:rStyle w:val="Hyperlink"/>
+            <w:noProof/>
             <w:lang w:val="en-US"/>
           </w:rPr>
+          <w:t>1.</w:t>
+        </w:r>
+        <w:r>
+          <w:rPr>
+            <w:rFonts w:cstheme="minorBidi"/>
+            <w:b w:val="0"/>
+            <w:bCs w:val="0"/>
+            <w:noProof/>
+            <w:sz w:val="24"/>
+            <w:szCs w:val="24"/>
+          </w:rPr>
+          <w:tab/>
+        </w:r>
+        <w:r>
+          <w:rPr>
+            <w:rStyle w:val="Hyperlink"/>
+            <w:noProof/>
+            <w:lang w:val="en-US"/>
+          </w:rPr>
+          <w:t>Functional Requirements</w:t>
+        </w:r>
+        <w:r>
+          <w:rPr>
+            <w:noProof/>
+            <w:webHidden/>
+          </w:rPr>
+          <w:tab/>
+        </w:r>
+        <w:r>
+          <w:rPr>
+            <w:noProof/>
+            <w:webHidden/>
+          </w:rPr>
           <w:fldChar w:fldCharType="begin"/>
         </w:r>
         <w:r>
           <w:rPr>
-            <w:rFonts w:asciiTheme="minorBidi" w:hAnsiTheme="minorBidi" w:cstheme="minorBidi"/>
             <w:noProof/>
             <w:webHidden/>
+          </w:rPr>
+          <w:instrText xml:space="preserve"> PAGEREF _Toc224417147 \h </w:instrText>
+        </w:r>
+        <w:r>
+          <w:rPr>
+            <w:noProof/>
+            <w:webHidden/>
+          </w:rPr>
+        </w:r>
+        <w:r>
+          <w:rPr>
+            <w:noProof/>
+            <w:webHidden/>
+          </w:rPr>
+          <w:fldChar w:fldCharType="separate"/>
+        </w:r>
+        <w:r>
+          <w:rPr>
+            <w:noProof/>
+            <w:webHidden/>
+          </w:rPr>
+          <w:t>2</w:t>
+        </w:r>
+        <w:r>
+          <w:rPr>
+            <w:noProof/>
+            <w:webHidden/>
+          </w:rPr>
+          <w:fldChar w:fldCharType="end"/>
+        </w:r>
+      </w:hyperlink>
+    </w:p>
+    <w:p>
+      <w:pPr>
+        <w:pStyle w:val="TOC1"/>
+        <w:tabs>
+          <w:tab w:val="right" w:leader="middleDot" w:pos="9016"/>
+        </w:tabs>
+        <w:rPr>
+          <w:rFonts w:cstheme="minorBidi"/>
+          <w:b w:val="0"/>
+          <w:bCs w:val="0"/>
+          <w:i w:val="0"/>
+          <w:iCs w:val="0"/>
+          <w:noProof/>
+          <w:szCs w:val="24"/>
+        </w:rPr>
+      </w:pPr>
+      <w:hyperlink w:anchor="_Toc224417148" w:history="1">
+        <w:r>
+          <w:rPr>
+            <w:rStyle w:val="Hyperlink"/>
+            <w:rFonts w:asciiTheme="minorBidi" w:hAnsiTheme="minorBidi"/>
+            <w:noProof/>
             <w:lang w:val="en-US"/>
           </w:rPr>
-          <w:instrText xml:space="preserve"> PAGEREF _Toc219873214 \h </w:instrText>
-        </w:r>
-        <w:r>
-          <w:rPr>
-            <w:rFonts w:asciiTheme="minorBidi" w:hAnsiTheme="minorBidi" w:cstheme="minorBidi"/>
+          <w:t>Game Design</w:t>
+        </w:r>
+        <w:r>
+          <w:rPr>
             <w:noProof/>
             <w:webHidden/>
+          </w:rPr>
+          <w:tab/>
+        </w:r>
+        <w:r>
+          <w:rPr>
+            <w:noProof/>
+            <w:webHidden/>
+          </w:rPr>
+          <w:fldChar w:fldCharType="begin"/>
+        </w:r>
+        <w:r>
+          <w:rPr>
+            <w:noProof/>
+            <w:webHidden/>
+          </w:rPr>
+          <w:instrText xml:space="preserve"> PAGEREF _Toc224417148 \h </w:instrText>
+        </w:r>
+        <w:r>
+          <w:rPr>
+            <w:noProof/>
+            <w:webHidden/>
+          </w:rPr>
+        </w:r>
+        <w:r>
+          <w:rPr>
+            <w:noProof/>
+            <w:webHidden/>
+          </w:rPr>
+          <w:fldChar w:fldCharType="separate"/>
+        </w:r>
+        <w:r>
+          <w:rPr>
+            <w:noProof/>
+            <w:webHidden/>
+          </w:rPr>
+          <w:t>3</w:t>
+        </w:r>
+        <w:r>
+          <w:rPr>
+            <w:noProof/>
+            <w:webHidden/>
+          </w:rPr>
+          <w:fldChar w:fldCharType="end"/>
+        </w:r>
+      </w:hyperlink>
+    </w:p>
+    <w:p>
+      <w:pPr>
+        <w:pStyle w:val="TOC2"/>
+        <w:tabs>
+          <w:tab w:val="left" w:pos="720"/>
+          <w:tab w:val="right" w:leader="middleDot" w:pos="9016"/>
+        </w:tabs>
+        <w:rPr>
+          <w:rFonts w:cstheme="minorBidi"/>
+          <w:b w:val="0"/>
+          <w:bCs w:val="0"/>
+          <w:noProof/>
+          <w:sz w:val="24"/>
+          <w:szCs w:val="24"/>
+        </w:rPr>
+      </w:pPr>
+      <w:hyperlink w:anchor="_Toc224417149" w:history="1">
+        <w:r>
+          <w:rPr>
+            <w:rStyle w:val="Hyperlink"/>
+            <w:noProof/>
+          </w:rPr>
+          <w:t>2.</w:t>
+        </w:r>
+        <w:r>
+          <w:rPr>
+            <w:rFonts w:cstheme="minorBidi"/>
+            <w:b w:val="0"/>
+            <w:bCs w:val="0"/>
+            <w:noProof/>
+            <w:sz w:val="24"/>
+            <w:szCs w:val="24"/>
+          </w:rPr>
+          <w:tab/>
+        </w:r>
+        <w:r>
+          <w:rPr>
+            <w:rStyle w:val="Hyperlink"/>
+            <w:noProof/>
+          </w:rPr>
+          <w:t>Game Map</w:t>
+        </w:r>
+        <w:r>
+          <w:rPr>
+            <w:noProof/>
+            <w:webHidden/>
+          </w:rPr>
+          <w:tab/>
+        </w:r>
+        <w:r>
+          <w:rPr>
+            <w:noProof/>
+            <w:webHidden/>
+          </w:rPr>
+          <w:fldChar w:fldCharType="begin"/>
+        </w:r>
+        <w:r>
+          <w:rPr>
+            <w:noProof/>
+            <w:webHidden/>
+          </w:rPr>
+          <w:instrText xml:space="preserve"> PAGEREF _Toc224417149 \h </w:instrText>
+        </w:r>
+        <w:r>
+          <w:rPr>
+            <w:noProof/>
+            <w:webHidden/>
+          </w:rPr>
+        </w:r>
+        <w:r>
+          <w:rPr>
+            <w:noProof/>
+            <w:webHidden/>
+          </w:rPr>
+          <w:fldChar w:fldCharType="separate"/>
+        </w:r>
+        <w:r>
+          <w:rPr>
+            <w:noProof/>
+            <w:webHidden/>
+          </w:rPr>
+          <w:t>3</w:t>
+        </w:r>
+        <w:r>
+          <w:rPr>
+            <w:noProof/>
+            <w:webHidden/>
+          </w:rPr>
+          <w:fldChar w:fldCharType="end"/>
+        </w:r>
+      </w:hyperlink>
+    </w:p>
+    <w:p>
+      <w:pPr>
+        <w:pStyle w:val="TOC2"/>
+        <w:tabs>
+          <w:tab w:val="left" w:pos="720"/>
+          <w:tab w:val="right" w:leader="middleDot" w:pos="9016"/>
+        </w:tabs>
+        <w:rPr>
+          <w:rFonts w:cstheme="minorBidi"/>
+          <w:b w:val="0"/>
+          <w:bCs w:val="0"/>
+          <w:noProof/>
+          <w:sz w:val="24"/>
+          <w:szCs w:val="24"/>
+        </w:rPr>
+      </w:pPr>
+      <w:hyperlink w:anchor="_Toc224417150" w:history="1">
+        <w:r>
+          <w:rPr>
+            <w:rStyle w:val="Hyperlink"/>
+            <w:noProof/>
             <w:lang w:val="en-US"/>
           </w:rPr>
-        </w:r>
-        <w:r>
-          <w:rPr>
-            <w:rFonts w:asciiTheme="minorBidi" w:hAnsiTheme="minorBidi" w:cstheme="minorBidi"/>
+          <w:t>3.</w:t>
+        </w:r>
+        <w:r>
+          <w:rPr>
+            <w:rFonts w:cstheme="minorBidi"/>
+            <w:b w:val="0"/>
+            <w:bCs w:val="0"/>
+            <w:noProof/>
+            <w:sz w:val="24"/>
+            <w:szCs w:val="24"/>
+          </w:rPr>
+          <w:tab/>
+        </w:r>
+        <w:r>
+          <w:rPr>
+            <w:rStyle w:val="Hyperlink"/>
+            <w:noProof/>
+            <w:lang w:val="en-US"/>
+          </w:rPr>
+          <w:t>Player</w:t>
+        </w:r>
+        <w:r>
+          <w:rPr>
             <w:noProof/>
             <w:webHidden/>
+          </w:rPr>
+          <w:tab/>
+        </w:r>
+        <w:r>
+          <w:rPr>
+            <w:noProof/>
+            <w:webHidden/>
+          </w:rPr>
+          <w:fldChar w:fldCharType="begin"/>
+        </w:r>
+        <w:r>
+          <w:rPr>
+            <w:noProof/>
+            <w:webHidden/>
+          </w:rPr>
+          <w:instrText xml:space="preserve"> PAGEREF _Toc224417150 \h </w:instrText>
+        </w:r>
+        <w:r>
+          <w:rPr>
+            <w:noProof/>
+            <w:webHidden/>
+          </w:rPr>
+        </w:r>
+        <w:r>
+          <w:rPr>
+            <w:noProof/>
+            <w:webHidden/>
+          </w:rPr>
+          <w:fldChar w:fldCharType="separate"/>
+        </w:r>
+        <w:r>
+          <w:rPr>
+            <w:noProof/>
+            <w:webHidden/>
+          </w:rPr>
+          <w:t>5</w:t>
+        </w:r>
+        <w:r>
+          <w:rPr>
+            <w:noProof/>
+            <w:webHidden/>
+          </w:rPr>
+          <w:fldChar w:fldCharType="end"/>
+        </w:r>
+      </w:hyperlink>
+    </w:p>
+    <w:p>
+      <w:pPr>
+        <w:pStyle w:val="TOC2"/>
+        <w:tabs>
+          <w:tab w:val="left" w:pos="720"/>
+          <w:tab w:val="right" w:leader="middleDot" w:pos="9016"/>
+        </w:tabs>
+        <w:rPr>
+          <w:rFonts w:cstheme="minorBidi"/>
+          <w:b w:val="0"/>
+          <w:bCs w:val="0"/>
+          <w:noProof/>
+          <w:sz w:val="24"/>
+          <w:szCs w:val="24"/>
+        </w:rPr>
+      </w:pPr>
+      <w:hyperlink w:anchor="_Toc224417151" w:history="1">
+        <w:r>
+          <w:rPr>
+            <w:rStyle w:val="Hyperlink"/>
+            <w:noProof/>
             <w:lang w:val="en-US"/>
           </w:rPr>
+          <w:t>4.</w:t>
+        </w:r>
+        <w:r>
+          <w:rPr>
+            <w:rFonts w:cstheme="minorBidi"/>
+            <w:b w:val="0"/>
+            <w:bCs w:val="0"/>
+            <w:noProof/>
+            <w:sz w:val="24"/>
+            <w:szCs w:val="24"/>
+          </w:rPr>
+          <w:tab/>
+        </w:r>
+        <w:r>
+          <w:rPr>
+            <w:rStyle w:val="Hyperlink"/>
+            <w:noProof/>
+            <w:lang w:val="en-US"/>
+          </w:rPr>
+          <w:t>Enemy</w:t>
+        </w:r>
+        <w:r>
+          <w:rPr>
+            <w:noProof/>
+            <w:webHidden/>
+          </w:rPr>
+          <w:tab/>
+        </w:r>
+        <w:r>
+          <w:rPr>
+            <w:noProof/>
+            <w:webHidden/>
+          </w:rPr>
+          <w:fldChar w:fldCharType="begin"/>
+        </w:r>
+        <w:r>
+          <w:rPr>
+            <w:noProof/>
+            <w:webHidden/>
+          </w:rPr>
+          <w:instrText xml:space="preserve"> PAGEREF _Toc224417151 \h </w:instrText>
+        </w:r>
+        <w:r>
+          <w:rPr>
+            <w:noProof/>
+            <w:webHidden/>
+          </w:rPr>
+        </w:r>
+        <w:r>
+          <w:rPr>
+            <w:noProof/>
+            <w:webHidden/>
+          </w:rPr>
           <w:fldChar w:fldCharType="separate"/>
         </w:r>
         <w:r>
           <w:rPr>
-            <w:rFonts w:asciiTheme="minorBidi" w:hAnsiTheme="minorBidi" w:cstheme="minorBidi"/>
             <w:noProof/>
             <w:webHidden/>
+          </w:rPr>
+          <w:t>6</w:t>
+        </w:r>
+        <w:r>
+          <w:rPr>
+            <w:noProof/>
+            <w:webHidden/>
+          </w:rPr>
+          <w:fldChar w:fldCharType="end"/>
+        </w:r>
+      </w:hyperlink>
+    </w:p>
+    <w:p>
+      <w:pPr>
+        <w:pStyle w:val="TOC1"/>
+        <w:tabs>
+          <w:tab w:val="right" w:leader="middleDot" w:pos="9016"/>
+        </w:tabs>
+        <w:rPr>
+          <w:rFonts w:cstheme="minorBidi"/>
+          <w:b w:val="0"/>
+          <w:bCs w:val="0"/>
+          <w:i w:val="0"/>
+          <w:iCs w:val="0"/>
+          <w:noProof/>
+          <w:szCs w:val="24"/>
+        </w:rPr>
+      </w:pPr>
+      <w:hyperlink w:anchor="_Toc224417152" w:history="1">
+        <w:r>
+          <w:rPr>
+            <w:rStyle w:val="Hyperlink"/>
+            <w:rFonts w:asciiTheme="minorBidi" w:hAnsiTheme="minorBidi"/>
+            <w:noProof/>
             <w:lang w:val="en-US"/>
           </w:rPr>
-          <w:t>1</w:t>
-        </w:r>
-        <w:r>
-          <w:rPr>
-            <w:rFonts w:asciiTheme="minorBidi" w:hAnsiTheme="minorBidi" w:cstheme="minorBidi"/>
+          <w:t>Bibliography</w:t>
+        </w:r>
+        <w:r>
+          <w:rPr>
             <w:noProof/>
             <w:webHidden/>
-            <w:lang w:val="en-US"/>
+          </w:rPr>
+          <w:tab/>
+        </w:r>
+        <w:r>
+          <w:rPr>
+            <w:noProof/>
+            <w:webHidden/>
+          </w:rPr>
+          <w:fldChar w:fldCharType="begin"/>
+        </w:r>
+        <w:r>
+          <w:rPr>
+            <w:noProof/>
+            <w:webHidden/>
+          </w:rPr>
+          <w:instrText xml:space="preserve"> PAGEREF _Toc224417152 \h </w:instrText>
+        </w:r>
+        <w:r>
+          <w:rPr>
+            <w:noProof/>
+            <w:webHidden/>
+          </w:rPr>
+        </w:r>
+        <w:r>
+          <w:rPr>
+            <w:noProof/>
+            <w:webHidden/>
+          </w:rPr>
+          <w:fldChar w:fldCharType="separate"/>
+        </w:r>
+        <w:r>
+          <w:rPr>
+            <w:noProof/>
+            <w:webHidden/>
+          </w:rPr>
+          <w:t>9</w:t>
+        </w:r>
+        <w:r>
+          <w:rPr>
+            <w:noProof/>
+            <w:webHidden/>
           </w:rPr>
           <w:fldChar w:fldCharType="end"/>
         </w:r>
@@ -163,42 +831,6 @@
         </w:rPr>
         <w:fldChar w:fldCharType="end"/>
       </w:r>
-    </w:p>
-    <w:p>
-      <w:pPr>
-        <w:jc w:val="both"/>
-        <w:rPr>
-          <w:rFonts w:asciiTheme="minorBidi" w:hAnsiTheme="minorBidi"/>
-          <w:lang w:val="en-US"/>
-        </w:rPr>
-      </w:pPr>
-    </w:p>
-    <w:p>
-      <w:pPr>
-        <w:jc w:val="both"/>
-        <w:rPr>
-          <w:rFonts w:asciiTheme="minorBidi" w:hAnsiTheme="minorBidi"/>
-          <w:lang w:val="en-US"/>
-        </w:rPr>
-      </w:pPr>
-    </w:p>
-    <w:p>
-      <w:pPr>
-        <w:jc w:val="both"/>
-        <w:rPr>
-          <w:rFonts w:asciiTheme="minorBidi" w:hAnsiTheme="minorBidi"/>
-          <w:lang w:val="en-US"/>
-        </w:rPr>
-      </w:pPr>
-    </w:p>
-    <w:p>
-      <w:pPr>
-        <w:jc w:val="both"/>
-        <w:rPr>
-          <w:rFonts w:asciiTheme="minorBidi" w:hAnsiTheme="minorBidi"/>
-          <w:lang w:val="en-US"/>
-        </w:rPr>
-      </w:pPr>
     </w:p>
     <w:p>
       <w:pPr>
@@ -344,16 +976,15 @@
           <w:lang w:val="en-US"/>
         </w:rPr>
       </w:pPr>
-      <w:bookmarkStart w:id="2" w:name="_Toc219873214"/>
+      <w:bookmarkStart w:id="3" w:name="_Toc224417145"/>
       <w:r>
         <w:rPr>
           <w:rFonts w:asciiTheme="minorBidi" w:hAnsiTheme="minorBidi" w:cstheme="minorBidi"/>
           <w:lang w:val="en-US"/>
         </w:rPr>
-        <w:lastRenderedPageBreak/>
         <w:t>Introduction</w:t>
       </w:r>
-      <w:bookmarkEnd w:id="2"/>
+      <w:bookmarkEnd w:id="3"/>
     </w:p>
     <w:p>
       <w:pPr>
@@ -367,7 +998,6 @@
     </w:p>
     <w:p>
       <w:pPr>
-        <w:ind w:left="720" w:firstLine="720"/>
         <w:rPr>
           <w:lang w:val="en-US"/>
         </w:rPr>
@@ -401,34 +1031,126 @@
     </w:p>
     <w:p>
       <w:pPr>
+        <w:rPr>
+          <w:lang w:val="en-US"/>
+        </w:rPr>
+      </w:pPr>
+      <w:r>
+        <w:rPr>
+          <w:lang w:val="en-US"/>
+        </w:rPr>
+        <w:t xml:space="preserve">This project is a console-based turn-based strategy game that provides algorithmic techniques found within Game Development and Artificial Intelligence within games. </w:t>
+      </w:r>
+      <w:r>
+        <w:rPr>
+          <w:lang w:val="en-US"/>
+        </w:rPr>
+        <w:t xml:space="preserve">The game provides procedurally generated maps that are created using a </w:t>
+      </w:r>
+      <w:proofErr w:type="gramStart"/>
+      <w:r>
+        <w:rPr>
+          <w:lang w:val="en-US"/>
+        </w:rPr>
+        <w:t>form of Wave</w:t>
+      </w:r>
+      <w:proofErr w:type="gramEnd"/>
+      <w:r>
+        <w:rPr>
+          <w:lang w:val="en-US"/>
+        </w:rPr>
+        <w:t xml:space="preserve"> Function Collapse (WFC) which also makes sure that there are </w:t>
+      </w:r>
+      <w:r>
+        <w:rPr>
+          <w:lang w:val="en-US"/>
+        </w:rPr>
+        <w:t>terrain constraints</w:t>
+      </w:r>
+      <w:r>
+        <w:rPr>
+          <w:lang w:val="en-US"/>
+        </w:rPr>
+        <w:t xml:space="preserve">, </w:t>
+      </w:r>
+      <w:proofErr w:type="gramStart"/>
+      <w:r>
+        <w:rPr>
+          <w:lang w:val="en-US"/>
+        </w:rPr>
+        <w:t>example</w:t>
+      </w:r>
+      <w:proofErr w:type="gramEnd"/>
+      <w:r>
+        <w:rPr>
+          <w:lang w:val="en-US"/>
+        </w:rPr>
+        <w:t xml:space="preserve"> mountains should not be next to water. </w:t>
+      </w:r>
+    </w:p>
+    <w:p>
+      <w:pPr>
         <w:ind w:left="1080" w:firstLine="360"/>
         <w:rPr>
           <w:lang w:val="en-US"/>
         </w:rPr>
       </w:pPr>
-      <w:r>
-        <w:rPr>
-          <w:lang w:val="en-US"/>
-        </w:rPr>
-        <w:t xml:space="preserve">This project is a console-based turn-based strategy game that provides algorithmic techniques found within Game Development and Artificial Intelligence within games. </w:t>
-      </w:r>
-      <w:r>
-        <w:rPr>
-          <w:lang w:val="en-US"/>
-        </w:rPr>
-        <w:t xml:space="preserve">The game provides procedurally generated maps that are created using a form of Wave Function Collapse (WFC) which also makes sure that there are </w:t>
-      </w:r>
-      <w:r>
-        <w:rPr>
-          <w:lang w:val="en-US"/>
-        </w:rPr>
-        <w:t>terrain constraints</w:t>
-      </w:r>
-      <w:r>
-        <w:rPr>
-          <w:lang w:val="en-US"/>
-        </w:rPr>
-        <w:t xml:space="preserve">, example mountains should not be next to water. </w:t>
+    </w:p>
+    <w:p>
+      <w:pPr>
+        <w:rPr>
+          <w:lang w:val="en-US"/>
+        </w:rPr>
+      </w:pPr>
+      <w:r>
+        <w:rPr>
+          <w:lang w:val="en-US"/>
+        </w:rPr>
+        <w:t xml:space="preserve">The player </w:t>
+      </w:r>
+      <w:proofErr w:type="gramStart"/>
+      <w:r>
+        <w:rPr>
+          <w:lang w:val="en-US"/>
+        </w:rPr>
+        <w:t>is</w:t>
+      </w:r>
+      <w:r>
+        <w:rPr>
+          <w:lang w:val="en-US"/>
+        </w:rPr>
+        <w:t xml:space="preserve"> able to</w:t>
+      </w:r>
+      <w:proofErr w:type="gramEnd"/>
+      <w:r>
+        <w:rPr>
+          <w:lang w:val="en-US"/>
+        </w:rPr>
+        <w:t xml:space="preserve"> navigate through a grid-based maps exploring tiles such as Grass, Mountains, Water, and Forests. </w:t>
+      </w:r>
+      <w:r>
+        <w:rPr>
+          <w:lang w:val="en-US"/>
+        </w:rPr>
+        <w:t xml:space="preserve">Each terrain influences the player’s movements and the gameplay mechanics, such as the player not being able to initially go through mountains unless they have a specific tool that allows them to do such. </w:t>
+      </w:r>
+      <w:r>
+        <w:rPr>
+          <w:lang w:val="en-US"/>
+        </w:rPr>
+        <w:t xml:space="preserve">Enemy characters attempt to locate and pursue the player via A* pathfinding algorithm, </w:t>
+      </w:r>
+      <w:r>
+        <w:rPr>
+          <w:lang w:val="en-US"/>
+        </w:rPr>
+        <w:t>allowing for a more efficient way for enemies to navigate through the terrain to pursue the player while also avoiding obstacles that they may not be able to pass through such as some enemies being unable to navigate through mountains.</w:t>
+      </w:r>
+      <w:r>
+        <w:rPr>
+          <w:lang w:val="en-US"/>
+        </w:rPr>
+        <w:t xml:space="preserve"> </w:t>
       </w:r>
     </w:p>
     <w:p>
@@ -441,40 +1163,77 @@
     </w:p>
     <w:p>
       <w:pPr>
+        <w:rPr>
+          <w:lang w:val="en-US"/>
+        </w:rPr>
+      </w:pPr>
+      <w:r>
+        <w:rPr>
+          <w:lang w:val="en-US"/>
+        </w:rPr>
+        <w:lastRenderedPageBreak/>
+        <w:t xml:space="preserve">Once the enemy catches the player a turn-based combat subsystem is triggered which </w:t>
+      </w:r>
+      <w:proofErr w:type="gramStart"/>
+      <w:r>
+        <w:rPr>
+          <w:lang w:val="en-US"/>
+        </w:rPr>
+        <w:t>takes into account</w:t>
+      </w:r>
+      <w:proofErr w:type="gramEnd"/>
+      <w:r>
+        <w:rPr>
+          <w:lang w:val="en-US"/>
+        </w:rPr>
+        <w:t xml:space="preserve"> enemy behavior when approached with different attacks, items and/or spells, the same for which also applies for the player, though with an additional option to escape the combat.</w:t>
+      </w:r>
+    </w:p>
+    <w:p>
+      <w:pPr>
         <w:ind w:left="1080" w:firstLine="360"/>
         <w:rPr>
           <w:lang w:val="en-US"/>
         </w:rPr>
       </w:pPr>
-      <w:r>
-        <w:rPr>
-          <w:lang w:val="en-US"/>
-        </w:rPr>
-        <w:t>The player is</w:t>
-      </w:r>
-      <w:r>
-        <w:rPr>
-          <w:lang w:val="en-US"/>
-        </w:rPr>
-        <w:t xml:space="preserve"> able to navigate through a grid-based maps exploring tiles such as Grass, Mountains, Water, and Forests. </w:t>
-      </w:r>
-      <w:r>
-        <w:rPr>
-          <w:lang w:val="en-US"/>
-        </w:rPr>
-        <w:t xml:space="preserve">Each terrain influences the player’s movements and the gameplay mechanics, such as the player not being able to initially go through mountains unless they have a specific tool that allows them to do such. </w:t>
-      </w:r>
-      <w:r>
-        <w:rPr>
-          <w:lang w:val="en-US"/>
-        </w:rPr>
-        <w:t xml:space="preserve">Enemy characters attempt to locate and pursue the player via A* pathfinding algorithm, </w:t>
-      </w:r>
-      <w:r>
-        <w:rPr>
-          <w:lang w:val="en-US"/>
-        </w:rPr>
-        <w:t>allowing for a more efficient way for enemies to navigate through the terrain to pursue the player while also avoiding obstacles that they may not be able to pass through such as some enemies being unable to navigate through mountains.</w:t>
+    </w:p>
+    <w:p>
+      <w:pPr>
+        <w:rPr>
+          <w:lang w:val="en-US"/>
+        </w:rPr>
+      </w:pPr>
+      <w:r>
+        <w:rPr>
+          <w:lang w:val="en-US"/>
+        </w:rPr>
+        <w:t xml:space="preserve">The objective of this project is to showcase how algorithmic techniques such as </w:t>
+      </w:r>
+      <w:r>
+        <w:rPr>
+          <w:lang w:val="en-US"/>
+        </w:rPr>
+        <w:t xml:space="preserve">procedural generation and heuristic search can be integrated to create one of the most interactive mediums, video games. </w:t>
+      </w:r>
+      <w:r>
+        <w:rPr>
+          <w:lang w:val="en-US"/>
+        </w:rPr>
+        <w:t xml:space="preserve">When combining these methods within a game environment, this project further showcases the practical applications of concepts that include </w:t>
+      </w:r>
+      <w:proofErr w:type="gramStart"/>
+      <w:r>
+        <w:rPr>
+          <w:lang w:val="en-US"/>
+        </w:rPr>
+        <w:t>object oriented</w:t>
+      </w:r>
+      <w:proofErr w:type="gramEnd"/>
+      <w:r>
+        <w:rPr>
+          <w:lang w:val="en-US"/>
+        </w:rPr>
+        <w:t xml:space="preserve"> programming (OOP) system design, pathfinding, terrain constraint management, and overall enemy behavior and decision</w:t>
       </w:r>
       <w:r>
         <w:rPr>
@@ -482,69 +1241,6 @@
         </w:rPr>
         <w:t xml:space="preserve"> </w:t>
       </w:r>
-    </w:p>
-    <w:p>
-      <w:pPr>
-        <w:ind w:left="1080" w:firstLine="360"/>
-        <w:rPr>
-          <w:lang w:val="en-US"/>
-        </w:rPr>
-      </w:pPr>
-    </w:p>
-    <w:p>
-      <w:pPr>
-        <w:ind w:left="1080" w:firstLine="360"/>
-        <w:rPr>
-          <w:lang w:val="en-US"/>
-        </w:rPr>
-      </w:pPr>
-      <w:r>
-        <w:rPr>
-          <w:lang w:val="en-US"/>
-        </w:rPr>
-        <w:lastRenderedPageBreak/>
-        <w:t>Once the enemy catches the player a turn-based combat subsystem is triggered which takes into account enemy behavior when approached with different attacks, items and/or spells, the same for which also applies for the player, though with an additional option to escape the combat.</w:t>
-      </w:r>
-    </w:p>
-    <w:p>
-      <w:pPr>
-        <w:ind w:left="1080" w:firstLine="360"/>
-        <w:rPr>
-          <w:lang w:val="en-US"/>
-        </w:rPr>
-      </w:pPr>
-    </w:p>
-    <w:p>
-      <w:pPr>
-        <w:ind w:left="1080" w:firstLine="360"/>
-        <w:rPr>
-          <w:lang w:val="en-US"/>
-        </w:rPr>
-      </w:pPr>
-      <w:r>
-        <w:rPr>
-          <w:lang w:val="en-US"/>
-        </w:rPr>
-        <w:t xml:space="preserve">The objective of this project is to showcase how algorithmic techniques such as </w:t>
-      </w:r>
-      <w:r>
-        <w:rPr>
-          <w:lang w:val="en-US"/>
-        </w:rPr>
-        <w:t xml:space="preserve">procedural generation and heuristic search can be integrated to create one of the most interactive mediums, video games. </w:t>
-      </w:r>
-      <w:r>
-        <w:rPr>
-          <w:lang w:val="en-US"/>
-        </w:rPr>
-        <w:t>When combining these methods within a game environment, this project further showcases the practical applications of concepts that include object oriented programming (OOP) system design, pathfinding, terrain constraint management, and overall enemy behavior and decision</w:t>
-      </w:r>
-      <w:r>
-        <w:rPr>
-          <w:lang w:val="en-US"/>
-        </w:rPr>
-        <w:t xml:space="preserve"> </w:t>
-      </w:r>
       <w:r>
         <w:rPr>
           <w:lang w:val="en-US"/>
@@ -554,7 +1250,6 @@
     </w:p>
     <w:p>
       <w:pPr>
-        <w:ind w:left="1080" w:firstLine="360"/>
         <w:rPr>
           <w:lang w:val="en-US"/>
         </w:rPr>
@@ -569,23 +1264,138 @@
           <w:lang w:val="en-US"/>
         </w:rPr>
       </w:pPr>
+      <w:bookmarkStart w:id="4" w:name="_Toc224417146"/>
       <w:r>
         <w:rPr>
           <w:rFonts w:asciiTheme="minorBidi" w:hAnsiTheme="minorBidi" w:cstheme="minorBidi"/>
           <w:lang w:val="en-US"/>
         </w:rPr>
-        <w:t xml:space="preserve">Game </w:t>
-      </w:r>
-      <w:r>
-        <w:rPr>
-          <w:rFonts w:asciiTheme="minorBidi" w:hAnsiTheme="minorBidi" w:cstheme="minorBidi"/>
-          <w:lang w:val="en-US"/>
-        </w:rPr>
-        <w:t>Design</w:t>
-      </w:r>
-    </w:p>
-    <w:p>
-      <w:pPr>
+        <w:t>Specifications of the Game Requirements and their Analysis</w:t>
+      </w:r>
+      <w:bookmarkEnd w:id="4"/>
+    </w:p>
+    <w:p>
+      <w:pPr>
+        <w:ind w:firstLine="720"/>
+        <w:rPr>
+          <w:lang w:val="en-US"/>
+        </w:rPr>
+      </w:pPr>
+    </w:p>
+    <w:p>
+      <w:pPr>
+        <w:rPr>
+          <w:lang w:val="en-US"/>
+        </w:rPr>
+      </w:pPr>
+      <w:r>
+        <w:rPr>
+          <w:lang w:val="en-US"/>
+        </w:rPr>
+        <w:t xml:space="preserve">This section covers the game requirements and </w:t>
+      </w:r>
+      <w:proofErr w:type="gramStart"/>
+      <w:r>
+        <w:rPr>
+          <w:lang w:val="en-US"/>
+        </w:rPr>
+        <w:t>showcases</w:t>
+      </w:r>
+      <w:proofErr w:type="gramEnd"/>
+      <w:r>
+        <w:rPr>
+          <w:lang w:val="en-US"/>
+        </w:rPr>
+        <w:t xml:space="preserve"> how these elements are implemented within the game. </w:t>
+      </w:r>
+      <w:r>
+        <w:rPr>
+          <w:lang w:val="en-US"/>
+        </w:rPr>
+        <w:t xml:space="preserve">It will describe both the functional behavior of the game system and the constraints it operates under. </w:t>
+      </w:r>
+    </w:p>
+    <w:p>
+      <w:pPr>
+        <w:ind w:left="1080" w:firstLine="360"/>
+        <w:rPr>
+          <w:lang w:val="en-US"/>
+        </w:rPr>
+      </w:pPr>
+    </w:p>
+    <w:p>
+      <w:pPr>
+        <w:rPr>
+          <w:lang w:val="en-US"/>
+        </w:rPr>
+      </w:pPr>
+      <w:r>
+        <w:rPr>
+          <w:lang w:val="en-US"/>
+        </w:rPr>
+        <w:t xml:space="preserve">The application itself is designed to be a console-based turn-based game which integrates procedurally generated </w:t>
+      </w:r>
+      <w:proofErr w:type="gramStart"/>
+      <w:r>
+        <w:rPr>
+          <w:lang w:val="en-US"/>
+        </w:rPr>
+        <w:t>map</w:t>
+      </w:r>
+      <w:proofErr w:type="gramEnd"/>
+      <w:r>
+        <w:rPr>
+          <w:lang w:val="en-US"/>
+        </w:rPr>
+        <w:t xml:space="preserve">, artificial intelligence for enemy navigation and behavior, and a combat system that includes actions, spells, items and resource management. </w:t>
+      </w:r>
+      <w:r>
+        <w:rPr>
+          <w:lang w:val="en-US"/>
+        </w:rPr>
+        <w:t xml:space="preserve">Below are the requirements listed </w:t>
+      </w:r>
+      <w:proofErr w:type="gramStart"/>
+      <w:r>
+        <w:rPr>
+          <w:lang w:val="en-US"/>
+        </w:rPr>
+        <w:t>define</w:t>
+      </w:r>
+      <w:proofErr w:type="gramEnd"/>
+      <w:r>
+        <w:rPr>
+          <w:lang w:val="en-US"/>
+        </w:rPr>
+        <w:t xml:space="preserve"> the expected gameplay behavior and perspective.</w:t>
+      </w:r>
+    </w:p>
+    <w:p>
+      <w:pPr>
+        <w:rPr>
+          <w:lang w:val="en-US"/>
+        </w:rPr>
+      </w:pPr>
+    </w:p>
+    <w:p>
+      <w:pPr>
+        <w:pStyle w:val="Heading2"/>
+        <w:rPr>
+          <w:lang w:val="en-US"/>
+        </w:rPr>
+      </w:pPr>
+      <w:bookmarkStart w:id="5" w:name="_Toc224417147"/>
+      <w:r>
+        <w:rPr>
+          <w:lang w:val="en-US"/>
+        </w:rPr>
+        <w:t>Functional Requirements</w:t>
+      </w:r>
+      <w:bookmarkEnd w:id="5"/>
+    </w:p>
+    <w:p>
+      <w:pPr>
+        <w:ind w:left="1080" w:firstLine="360"/>
         <w:rPr>
           <w:lang w:val="en-US"/>
         </w:rPr>
@@ -596,45 +1406,462 @@
         <w:pStyle w:val="ListParagraph"/>
         <w:numPr>
           <w:ilvl w:val="0"/>
-          <w:numId w:val="4"/>
+          <w:numId w:val="11"/>
         </w:numPr>
+        <w:rPr>
+          <w:lang w:val="en-US"/>
+        </w:rPr>
+      </w:pPr>
+      <w:r>
+        <w:rPr>
+          <w:lang w:val="en-US"/>
+        </w:rPr>
+        <w:t>The game map shall be generated through Wave Function Collapse (WFC)</w:t>
+      </w:r>
+    </w:p>
+    <w:p>
+      <w:pPr>
+        <w:pStyle w:val="ListParagraph"/>
+        <w:numPr>
+          <w:ilvl w:val="0"/>
+          <w:numId w:val="11"/>
+        </w:numPr>
+        <w:rPr>
+          <w:lang w:val="en-US"/>
+        </w:rPr>
+      </w:pPr>
+      <w:r>
+        <w:rPr>
+          <w:lang w:val="en-US"/>
+        </w:rPr>
+        <w:lastRenderedPageBreak/>
+        <w:t>The game environment is represented through a grid composed of terrain tiles: Grass (X), Water (S), Mountain (M), Forest (Y)</w:t>
+      </w:r>
+    </w:p>
+    <w:p>
+      <w:pPr>
+        <w:pStyle w:val="ListParagraph"/>
+        <w:numPr>
+          <w:ilvl w:val="0"/>
+          <w:numId w:val="11"/>
+        </w:numPr>
+        <w:rPr>
+          <w:lang w:val="en-US"/>
+        </w:rPr>
+      </w:pPr>
+      <w:r>
+        <w:rPr>
+          <w:lang w:val="en-US"/>
+        </w:rPr>
+        <w:t>The game allows the player to move up, down, left, right</w:t>
+      </w:r>
+    </w:p>
+    <w:p>
+      <w:pPr>
+        <w:pStyle w:val="ListParagraph"/>
+        <w:numPr>
+          <w:ilvl w:val="0"/>
+          <w:numId w:val="11"/>
+        </w:numPr>
+        <w:rPr>
+          <w:lang w:val="en-US"/>
+        </w:rPr>
+      </w:pPr>
+      <w:r>
+        <w:rPr>
+          <w:lang w:val="en-US"/>
+        </w:rPr>
+        <w:t>The player can only move once per turn</w:t>
+      </w:r>
+    </w:p>
+    <w:p>
+      <w:pPr>
+        <w:pStyle w:val="ListParagraph"/>
+        <w:numPr>
+          <w:ilvl w:val="0"/>
+          <w:numId w:val="11"/>
+        </w:numPr>
+        <w:rPr>
+          <w:lang w:val="en-US"/>
+        </w:rPr>
+      </w:pPr>
+      <w:r>
+        <w:rPr>
+          <w:lang w:val="en-US"/>
+        </w:rPr>
+        <w:t>The game will prevent the player from moving through impassable terrain without the required prerequisites (such as items and/or spells)</w:t>
+      </w:r>
+    </w:p>
+    <w:p>
+      <w:pPr>
+        <w:pStyle w:val="ListParagraph"/>
+        <w:numPr>
+          <w:ilvl w:val="0"/>
+          <w:numId w:val="11"/>
+        </w:numPr>
+        <w:rPr>
+          <w:lang w:val="en-US"/>
+        </w:rPr>
+      </w:pPr>
+      <w:r>
+        <w:rPr>
+          <w:lang w:val="en-US"/>
+        </w:rPr>
+        <w:t xml:space="preserve">The game will generate enemy non-playable characters (NPCs) within the map </w:t>
+      </w:r>
+    </w:p>
+    <w:p>
+      <w:pPr>
+        <w:pStyle w:val="ListParagraph"/>
+        <w:numPr>
+          <w:ilvl w:val="0"/>
+          <w:numId w:val="11"/>
+        </w:numPr>
+        <w:rPr>
+          <w:lang w:val="en-US"/>
+        </w:rPr>
+      </w:pPr>
+      <w:r>
+        <w:rPr>
+          <w:lang w:val="en-US"/>
+        </w:rPr>
+        <w:t xml:space="preserve">The enemy will pursue the player using A* </w:t>
+      </w:r>
+      <w:proofErr w:type="gramStart"/>
+      <w:r>
+        <w:rPr>
+          <w:lang w:val="en-US"/>
+        </w:rPr>
+        <w:t>pathfinding</w:t>
+      </w:r>
+      <w:proofErr w:type="gramEnd"/>
+      <w:r>
+        <w:rPr>
+          <w:lang w:val="en-US"/>
+        </w:rPr>
+        <w:t xml:space="preserve"> algorithm that allows the enemies to determine the best possible route to catch the player</w:t>
+      </w:r>
+    </w:p>
+    <w:p>
+      <w:pPr>
+        <w:pStyle w:val="ListParagraph"/>
+        <w:numPr>
+          <w:ilvl w:val="0"/>
+          <w:numId w:val="11"/>
+        </w:numPr>
+        <w:rPr>
+          <w:lang w:val="en-US"/>
+        </w:rPr>
+      </w:pPr>
+      <w:r>
+        <w:rPr>
+          <w:lang w:val="en-US"/>
+        </w:rPr>
+        <w:t>When the enemy catches the player, a battle system will ensue</w:t>
+      </w:r>
+    </w:p>
+    <w:p>
+      <w:pPr>
+        <w:pStyle w:val="ListParagraph"/>
+        <w:numPr>
+          <w:ilvl w:val="0"/>
+          <w:numId w:val="11"/>
+        </w:numPr>
+        <w:rPr>
+          <w:lang w:val="en-US"/>
+        </w:rPr>
+      </w:pPr>
+      <w:r>
+        <w:rPr>
+          <w:lang w:val="en-US"/>
+        </w:rPr>
+        <w:t xml:space="preserve">The battle system will </w:t>
+      </w:r>
+      <w:r>
+        <w:rPr>
+          <w:lang w:val="en-US"/>
+        </w:rPr>
+        <w:t>let</w:t>
+      </w:r>
+      <w:r>
+        <w:rPr>
+          <w:lang w:val="en-US"/>
+        </w:rPr>
+        <w:t xml:space="preserve"> the player have the following actions: attack, spells, items, and run</w:t>
+      </w:r>
+    </w:p>
+    <w:p>
+      <w:pPr>
+        <w:pStyle w:val="ListParagraph"/>
+        <w:numPr>
+          <w:ilvl w:val="0"/>
+          <w:numId w:val="11"/>
+        </w:numPr>
+        <w:rPr>
+          <w:lang w:val="en-US"/>
+        </w:rPr>
+      </w:pPr>
+      <w:r>
+        <w:rPr>
+          <w:lang w:val="en-US"/>
+        </w:rPr>
+        <w:t>The battle system will also have enemies that, depending on the progression of the game, will be more difficult and have more actions to them which include spells and items of their own</w:t>
+      </w:r>
+    </w:p>
+    <w:p>
+      <w:pPr>
+        <w:pStyle w:val="ListParagraph"/>
+        <w:numPr>
+          <w:ilvl w:val="0"/>
+          <w:numId w:val="11"/>
+        </w:numPr>
+        <w:rPr>
+          <w:lang w:val="en-US"/>
+        </w:rPr>
+      </w:pPr>
+      <w:r>
+        <w:rPr>
+          <w:lang w:val="en-US"/>
+        </w:rPr>
+        <w:t>The enemy will be the one deciding what’s the best course of action to attack the player</w:t>
+      </w:r>
+    </w:p>
+    <w:p>
+      <w:pPr>
+        <w:pStyle w:val="ListParagraph"/>
+        <w:numPr>
+          <w:ilvl w:val="0"/>
+          <w:numId w:val="11"/>
+        </w:numPr>
+        <w:rPr>
+          <w:lang w:val="en-US"/>
+        </w:rPr>
+      </w:pPr>
+      <w:r>
+        <w:rPr>
+          <w:lang w:val="en-US"/>
+        </w:rPr>
+        <w:t>The battle system will be a turn-based system where the player and enemy take turns fighting one another</w:t>
+      </w:r>
+    </w:p>
+    <w:p>
+      <w:pPr>
+        <w:pStyle w:val="ListParagraph"/>
+        <w:numPr>
+          <w:ilvl w:val="0"/>
+          <w:numId w:val="11"/>
+        </w:numPr>
+        <w:rPr>
+          <w:lang w:val="en-US"/>
+        </w:rPr>
+      </w:pPr>
+      <w:r>
+        <w:rPr>
+          <w:lang w:val="en-US"/>
+        </w:rPr>
+        <w:t>The player will have a health system that, if it falls to 0 or below, will end the game</w:t>
+      </w:r>
+    </w:p>
+    <w:p>
+      <w:pPr>
+        <w:pStyle w:val="ListParagraph"/>
+        <w:numPr>
+          <w:ilvl w:val="0"/>
+          <w:numId w:val="11"/>
+        </w:numPr>
+        <w:rPr>
+          <w:lang w:val="en-US"/>
+        </w:rPr>
+      </w:pPr>
+      <w:r>
+        <w:rPr>
+          <w:lang w:val="en-US"/>
+        </w:rPr>
+        <w:t xml:space="preserve">The player will also have a </w:t>
+      </w:r>
+      <w:proofErr w:type="spellStart"/>
+      <w:r>
+        <w:rPr>
+          <w:lang w:val="en-US"/>
+        </w:rPr>
+        <w:t>mana</w:t>
+      </w:r>
+      <w:proofErr w:type="spellEnd"/>
+      <w:r>
+        <w:rPr>
+          <w:lang w:val="en-US"/>
+        </w:rPr>
+        <w:t xml:space="preserve"> system that restricts the </w:t>
+      </w:r>
+      <w:proofErr w:type="gramStart"/>
+      <w:r>
+        <w:rPr>
+          <w:lang w:val="en-US"/>
+        </w:rPr>
+        <w:t>amount</w:t>
+      </w:r>
+      <w:proofErr w:type="gramEnd"/>
+      <w:r>
+        <w:rPr>
+          <w:lang w:val="en-US"/>
+        </w:rPr>
+        <w:t xml:space="preserve"> of </w:t>
+      </w:r>
+      <w:proofErr w:type="gramStart"/>
+      <w:r>
+        <w:rPr>
+          <w:lang w:val="en-US"/>
+        </w:rPr>
+        <w:t>times</w:t>
+      </w:r>
+      <w:proofErr w:type="gramEnd"/>
+      <w:r>
+        <w:rPr>
+          <w:lang w:val="en-US"/>
+        </w:rPr>
+        <w:t xml:space="preserve"> the player </w:t>
+      </w:r>
+      <w:proofErr w:type="gramStart"/>
+      <w:r>
+        <w:rPr>
+          <w:lang w:val="en-US"/>
+        </w:rPr>
+        <w:t>is able to</w:t>
+      </w:r>
+      <w:proofErr w:type="gramEnd"/>
+      <w:r>
+        <w:rPr>
+          <w:lang w:val="en-US"/>
+        </w:rPr>
+        <w:t xml:space="preserve"> use a spell</w:t>
+      </w:r>
+    </w:p>
+    <w:p>
+      <w:pPr>
+        <w:pStyle w:val="ListParagraph"/>
+        <w:numPr>
+          <w:ilvl w:val="0"/>
+          <w:numId w:val="11"/>
+        </w:numPr>
+        <w:rPr>
+          <w:lang w:val="en-US"/>
+        </w:rPr>
+      </w:pPr>
+      <w:r>
+        <w:rPr>
+          <w:lang w:val="en-US"/>
+        </w:rPr>
+        <w:t>The player will have an inventory system where items can be collected depending on where they are around the environment or depending on a chest that is randomly shown throughout the game</w:t>
+      </w:r>
+    </w:p>
+    <w:p>
+      <w:pPr>
+        <w:pStyle w:val="ListParagraph"/>
+        <w:numPr>
+          <w:ilvl w:val="0"/>
+          <w:numId w:val="11"/>
+        </w:numPr>
+        <w:rPr>
+          <w:lang w:val="en-US"/>
+        </w:rPr>
+      </w:pPr>
+      <w:r>
+        <w:rPr>
+          <w:lang w:val="en-US"/>
+        </w:rPr>
+        <w:t xml:space="preserve">The player will be able to get spells through a “library” in the game which gives chances for the player to learn new spells in their </w:t>
+      </w:r>
+      <w:proofErr w:type="gramStart"/>
+      <w:r>
+        <w:rPr>
+          <w:lang w:val="en-US"/>
+        </w:rPr>
+        <w:t>spells</w:t>
+      </w:r>
+      <w:proofErr w:type="gramEnd"/>
+      <w:r>
+        <w:rPr>
+          <w:lang w:val="en-US"/>
+        </w:rPr>
+        <w:t xml:space="preserve"> repository</w:t>
+      </w:r>
+    </w:p>
+    <w:p>
+      <w:pPr>
+        <w:pStyle w:val="ListParagraph"/>
+        <w:numPr>
+          <w:ilvl w:val="0"/>
+          <w:numId w:val="11"/>
+        </w:numPr>
+        <w:rPr>
+          <w:lang w:val="en-US"/>
+        </w:rPr>
+      </w:pPr>
+      <w:r>
+        <w:rPr>
+          <w:lang w:val="en-US"/>
+        </w:rPr>
+        <w:t>The game allows the player to interact with the game through the console-based system</w:t>
+      </w:r>
+    </w:p>
+    <w:p>
+      <w:pPr>
+        <w:rPr>
+          <w:lang w:val="en-US"/>
+        </w:rPr>
+      </w:pPr>
+    </w:p>
+    <w:p>
+      <w:pPr>
+        <w:pStyle w:val="Heading1"/>
+        <w:jc w:val="both"/>
+        <w:rPr>
+          <w:rFonts w:asciiTheme="minorBidi" w:hAnsiTheme="minorBidi" w:cstheme="minorBidi"/>
+          <w:lang w:val="en-US"/>
+        </w:rPr>
+      </w:pPr>
+      <w:bookmarkStart w:id="6" w:name="_Toc224417148"/>
+      <w:r>
+        <w:rPr>
+          <w:rFonts w:asciiTheme="minorBidi" w:hAnsiTheme="minorBidi" w:cstheme="minorBidi"/>
+          <w:lang w:val="en-US"/>
+        </w:rPr>
+        <w:lastRenderedPageBreak/>
+        <w:t xml:space="preserve">Game </w:t>
+      </w:r>
+      <w:r>
+        <w:rPr>
+          <w:rFonts w:asciiTheme="minorBidi" w:hAnsiTheme="minorBidi" w:cstheme="minorBidi"/>
+          <w:lang w:val="en-US"/>
+        </w:rPr>
+        <w:t>Design</w:t>
+      </w:r>
+      <w:bookmarkEnd w:id="6"/>
+    </w:p>
+    <w:p>
+      <w:pPr>
+        <w:rPr>
+          <w:lang w:val="en-US"/>
+        </w:rPr>
+      </w:pPr>
+    </w:p>
+    <w:p>
+      <w:pPr>
+        <w:jc w:val="center"/>
+        <w:rPr>
+          <w:lang w:val="en-US"/>
+        </w:rPr>
+      </w:pPr>
+      <w:r>
         <w:rPr>
           <w:b/>
           <w:bCs/>
+          <w:noProof/>
           <w:u w:val="single"/>
           <w:lang w:val="en-US"/>
         </w:rPr>
-      </w:pPr>
-      <w:r>
-        <w:rPr>
-          <w:b/>
-          <w:bCs/>
-          <w:u w:val="single"/>
-          <w:lang w:val="en-US"/>
-        </w:rPr>
-        <w:t>Game Map</w:t>
-      </w:r>
-    </w:p>
-    <w:p>
-      <w:pPr>
-        <w:ind w:left="1080"/>
-        <w:jc w:val="center"/>
-        <w:rPr>
-          <w:b/>
-          <w:bCs/>
-          <w:u w:val="single"/>
-          <w:lang w:val="en-US"/>
-        </w:rPr>
-      </w:pPr>
-      <w:r>
-        <w:rPr>
-          <w:b/>
-          <w:bCs/>
-          <w:u w:val="single"/>
-          <w:lang w:val="en-US"/>
-        </w:rPr>
         <w:drawing>
-          <wp:inline distT="0" distB="0" distL="0" distR="0" wp14:anchorId="7109CA66" wp14:editId="0B3336D1">
+          <wp:inline distT="0" distB="0" distL="0" distR="0" wp14:anchorId="7097E2F4" wp14:editId="0DEA9C03">
             <wp:extent cx="3688080" cy="2695511"/>
             <wp:effectExtent l="0" t="0" r="7620" b="0"/>
             <wp:docPr id="1509473547" name="Picture 1"/>
@@ -686,53 +1913,185 @@
           <w:bCs/>
           <w:lang w:val="en-US"/>
         </w:rPr>
-        <w:t xml:space="preserve">Figure 1: </w:t>
-      </w:r>
-      <w:r>
+        <w:t>Figure 1: An example of the map taken from the Project, the player is represented through the “@” symbol and enemy is represented through “#”</w:t>
+      </w:r>
+    </w:p>
+    <w:p>
+      <w:pPr>
+        <w:ind w:left="1080"/>
+        <w:jc w:val="center"/>
         <w:rPr>
           <w:b/>
           <w:bCs/>
           <w:lang w:val="en-US"/>
         </w:rPr>
-        <w:t xml:space="preserve">An example of the map taken from the Project, the player is represented through the </w:t>
-      </w:r>
-      <w:r>
-        <w:rPr>
-          <w:b/>
-          <w:bCs/>
-          <w:lang w:val="en-US"/>
-        </w:rPr>
-        <w:t>“</w:t>
-      </w:r>
-      <w:r>
-        <w:rPr>
-          <w:b/>
-          <w:bCs/>
-          <w:lang w:val="en-US"/>
-        </w:rPr>
-        <w:t>@</w:t>
-      </w:r>
-      <w:r>
-        <w:rPr>
-          <w:b/>
-          <w:bCs/>
-          <w:lang w:val="en-US"/>
-        </w:rPr>
-        <w:t>”</w:t>
-      </w:r>
-      <w:r>
-        <w:rPr>
-          <w:b/>
-          <w:bCs/>
-          <w:lang w:val="en-US"/>
-        </w:rPr>
-        <w:t xml:space="preserve"> symbol</w:t>
-      </w:r>
-    </w:p>
-    <w:p>
-      <w:pPr>
-        <w:ind w:left="1080"/>
-        <w:jc w:val="center"/>
+      </w:pPr>
+    </w:p>
+    <w:p>
+      <w:pPr>
+        <w:rPr>
+          <w:lang w:val="en-US"/>
+        </w:rPr>
+      </w:pPr>
+      <w:r>
+        <w:rPr>
+          <w:lang w:val="en-US"/>
+        </w:rPr>
+        <w:t xml:space="preserve">This section focuses on the </w:t>
+      </w:r>
+      <w:r>
+        <w:rPr>
+          <w:lang w:val="en-US"/>
+        </w:rPr>
+        <w:t>overall game desig</w:t>
+      </w:r>
+      <w:r>
+        <w:rPr>
+          <w:lang w:val="en-US"/>
+        </w:rPr>
+        <w:t xml:space="preserve">n itself and the main components that interact with the gameplay experience. </w:t>
+      </w:r>
+      <w:r>
+        <w:rPr>
+          <w:lang w:val="en-US"/>
+        </w:rPr>
+        <w:t xml:space="preserve">The game is a grid-based console-based game environment where the player navigates through a procedurally generated map while interacting with enemy entities and other gameplay mechanics. </w:t>
+      </w:r>
+    </w:p>
+    <w:p>
+      <w:pPr>
+        <w:ind w:left="720" w:firstLine="360"/>
+        <w:rPr>
+          <w:lang w:val="en-US"/>
+        </w:rPr>
+      </w:pPr>
+    </w:p>
+    <w:p>
+      <w:pPr>
+        <w:rPr>
+          <w:lang w:val="en-US"/>
+        </w:rPr>
+      </w:pPr>
+      <w:r>
+        <w:rPr>
+          <w:lang w:val="en-US"/>
+        </w:rPr>
+        <w:t xml:space="preserve">The game is designed through an object-oriented architecture that contains different components which have responsibilities for specific aspects of the application. </w:t>
+      </w:r>
+      <w:r>
+        <w:rPr>
+          <w:lang w:val="en-US"/>
+        </w:rPr>
+        <w:t xml:space="preserve">The game environment defines the overall structure of the map and the terrains within the map that influence movement for both the player and enemy. </w:t>
+      </w:r>
+      <w:r>
+        <w:rPr>
+          <w:lang w:val="en-US"/>
+        </w:rPr>
+        <w:t xml:space="preserve">The player’s components include user-controlled navigation, character attributes, and its interaction with the environment. </w:t>
+      </w:r>
+      <w:r>
+        <w:rPr>
+          <w:lang w:val="en-US"/>
+        </w:rPr>
+        <w:t xml:space="preserve">Enemies represent </w:t>
+      </w:r>
+      <w:proofErr w:type="gramStart"/>
+      <w:r>
+        <w:rPr>
+          <w:lang w:val="en-US"/>
+        </w:rPr>
+        <w:t>the hostile</w:t>
+      </w:r>
+      <w:proofErr w:type="gramEnd"/>
+      <w:r>
+        <w:rPr>
+          <w:lang w:val="en-US"/>
+        </w:rPr>
+        <w:t xml:space="preserve"> agents who try to pursue the player through the map via A* pathfinding algorithm</w:t>
+      </w:r>
+      <w:r>
+        <w:rPr>
+          <w:lang w:val="en-US"/>
+        </w:rPr>
+        <w:t xml:space="preserve"> and then during the battle system the enemy’s main objective is to try and defeat the player strategically with the tools and spells that it has within its hands</w:t>
+      </w:r>
+      <w:r>
+        <w:rPr>
+          <w:lang w:val="en-US"/>
+        </w:rPr>
+        <w:t>.</w:t>
+      </w:r>
+    </w:p>
+    <w:p>
+      <w:pPr>
+        <w:ind w:left="720" w:firstLine="360"/>
+        <w:rPr>
+          <w:lang w:val="en-US"/>
+        </w:rPr>
+      </w:pPr>
+    </w:p>
+    <w:p>
+      <w:pPr>
+        <w:rPr>
+          <w:lang w:val="en-US"/>
+        </w:rPr>
+      </w:pPr>
+      <w:r>
+        <w:rPr>
+          <w:lang w:val="en-US"/>
+        </w:rPr>
+        <w:t xml:space="preserve">Together, these components </w:t>
+      </w:r>
+      <w:proofErr w:type="gramStart"/>
+      <w:r>
+        <w:rPr>
+          <w:lang w:val="en-US"/>
+        </w:rPr>
+        <w:t>allows</w:t>
+      </w:r>
+      <w:proofErr w:type="gramEnd"/>
+      <w:r>
+        <w:rPr>
+          <w:lang w:val="en-US"/>
+        </w:rPr>
+        <w:t xml:space="preserve"> the game to make a clear separation of responsibilities and at the same time an intertwined operation which </w:t>
+      </w:r>
+      <w:proofErr w:type="gramStart"/>
+      <w:r>
+        <w:rPr>
+          <w:lang w:val="en-US"/>
+        </w:rPr>
+        <w:t>work</w:t>
+      </w:r>
+      <w:proofErr w:type="gramEnd"/>
+      <w:r>
+        <w:rPr>
+          <w:lang w:val="en-US"/>
+        </w:rPr>
+        <w:t xml:space="preserve"> together given its process of player input, enemy behavior and interactions between entities within the environment.</w:t>
+      </w:r>
+    </w:p>
+    <w:p>
+      <w:pPr>
+        <w:ind w:left="720" w:firstLine="360"/>
+        <w:rPr>
+          <w:lang w:val="en-US"/>
+        </w:rPr>
+      </w:pPr>
+    </w:p>
+    <w:p>
+      <w:pPr>
+        <w:pStyle w:val="Heading2"/>
+      </w:pPr>
+      <w:bookmarkStart w:id="7" w:name="_Toc224417149"/>
+      <w:r>
+        <w:t>Game Map</w:t>
+      </w:r>
+      <w:bookmarkEnd w:id="7"/>
+    </w:p>
+    <w:p>
+      <w:pPr>
         <w:rPr>
           <w:b/>
           <w:bCs/>
@@ -743,16 +2102,14 @@
     </w:p>
     <w:p>
       <w:pPr>
-        <w:ind w:left="1080" w:firstLine="360"/>
-        <w:rPr>
-          <w:lang w:val="en-US"/>
-        </w:rPr>
-      </w:pPr>
-      <w:r>
-        <w:rPr>
-          <w:lang w:val="en-US"/>
-        </w:rPr>
-        <w:lastRenderedPageBreak/>
+        <w:rPr>
+          <w:lang w:val="en-US"/>
+        </w:rPr>
+      </w:pPr>
+      <w:r>
+        <w:rPr>
+          <w:lang w:val="en-US"/>
+        </w:rPr>
         <w:t xml:space="preserve">The Game </w:t>
       </w:r>
       <w:r>
@@ -830,40 +2187,542 @@
     </w:p>
     <w:p>
       <w:pPr>
+        <w:rPr>
+          <w:lang w:val="en-US"/>
+        </w:rPr>
+      </w:pPr>
+      <w:proofErr w:type="gramStart"/>
+      <w:r>
+        <w:rPr>
+          <w:lang w:val="en-US"/>
+        </w:rPr>
+        <w:t>In order to</w:t>
+      </w:r>
+      <w:proofErr w:type="gramEnd"/>
+      <w:r>
+        <w:rPr>
+          <w:lang w:val="en-US"/>
+        </w:rPr>
+        <w:t xml:space="preserve"> generate the map though, the project uses Wave Function Collapse (WFC)</w:t>
+      </w:r>
+      <w:r>
+        <w:rPr>
+          <w:lang w:val="en-US"/>
+        </w:rPr>
+        <w:t xml:space="preserve">. Created by Maxim </w:t>
+      </w:r>
+      <w:proofErr w:type="spellStart"/>
+      <w:r>
+        <w:rPr>
+          <w:lang w:val="en-US"/>
+        </w:rPr>
+        <w:t>Gumin</w:t>
+      </w:r>
+      <w:proofErr w:type="spellEnd"/>
+      <w:r>
+        <w:rPr>
+          <w:lang w:val="en-US"/>
+        </w:rPr>
+        <w:t xml:space="preserve"> and based on work by Paul Merrell, </w:t>
+      </w:r>
+      <w:r>
+        <w:rPr>
+          <w:lang w:val="en-US"/>
+        </w:rPr>
+        <w:t xml:space="preserve">WFC is a procedural </w:t>
+      </w:r>
+      <w:r>
+        <w:rPr>
+          <w:lang w:val="en-US"/>
+        </w:rPr>
+        <w:t>map generation technique that was originally used to develop</w:t>
+      </w:r>
+      <w:r>
+        <w:rPr>
+          <w:lang w:val="en-US"/>
+        </w:rPr>
+        <w:t xml:space="preserve"> </w:t>
+      </w:r>
+      <w:r>
+        <w:rPr>
+          <w:lang w:val="en-US"/>
+        </w:rPr>
+        <w:t>simple configuration</w:t>
+      </w:r>
+      <w:r>
+        <w:rPr>
+          <w:lang w:val="en-US"/>
+        </w:rPr>
+        <w:t xml:space="preserve"> or</w:t>
+      </w:r>
+      <w:r>
+        <w:rPr>
+          <w:lang w:val="en-US"/>
+        </w:rPr>
+        <w:t xml:space="preserve"> sample image</w:t>
+      </w:r>
+      <w:r>
+        <w:rPr>
+          <w:lang w:val="en-US"/>
+        </w:rPr>
+        <w:t xml:space="preserve">s, in video games it has been used to </w:t>
+      </w:r>
+      <w:r>
+        <w:rPr>
+          <w:lang w:val="en-US"/>
+        </w:rPr>
+        <w:t xml:space="preserve">generate </w:t>
+      </w:r>
+      <w:r>
+        <w:rPr>
+          <w:lang w:val="en-US"/>
+        </w:rPr>
+        <w:t>adjacent constraints from element to element</w:t>
+      </w:r>
+      <w:r>
+        <w:rPr>
+          <w:lang w:val="en-US"/>
+        </w:rPr>
+        <w:t xml:space="preserve">. </w:t>
+      </w:r>
+      <w:r>
+        <w:rPr>
+          <w:lang w:val="en-US"/>
+        </w:rPr>
+        <w:t xml:space="preserve">The function </w:t>
+      </w:r>
+      <w:r>
+        <w:rPr>
+          <w:lang w:val="en-US"/>
+        </w:rPr>
+        <w:t>operates through</w:t>
+      </w:r>
+      <w:r>
+        <w:rPr>
+          <w:lang w:val="en-US"/>
+        </w:rPr>
+        <w:t xml:space="preserve"> checking tiles that are adjacent to one another</w:t>
+      </w:r>
+      <w:r>
+        <w:rPr>
+          <w:lang w:val="en-US"/>
+        </w:rPr>
+        <w:t xml:space="preserve">, e.g. grass can be next to </w:t>
+      </w:r>
+      <w:r>
+        <w:rPr>
+          <w:lang w:val="en-US"/>
+        </w:rPr>
+        <w:t>water,</w:t>
+      </w:r>
+      <w:r>
+        <w:rPr>
+          <w:lang w:val="en-US"/>
+        </w:rPr>
+        <w:t xml:space="preserve"> but mountains can</w:t>
+      </w:r>
+      <w:r>
+        <w:rPr>
+          <w:lang w:val="en-US"/>
+        </w:rPr>
+        <w:t xml:space="preserve">not. </w:t>
+      </w:r>
+    </w:p>
+    <w:p>
+      <w:pPr>
         <w:ind w:left="1080" w:firstLine="360"/>
         <w:rPr>
           <w:lang w:val="en-US"/>
         </w:rPr>
       </w:pPr>
-      <w:r>
-        <w:rPr>
-          <w:lang w:val="en-US"/>
-        </w:rPr>
-        <w:t>In order to generate the map though, the project uses Wave Function Collapse (WFC)</w:t>
-      </w:r>
-      <w:r>
-        <w:rPr>
-          <w:lang w:val="en-US"/>
-        </w:rPr>
-        <w:t>. Created by Maxim Gumin</w:t>
-      </w:r>
-      <w:r>
-        <w:rPr>
-          <w:lang w:val="en-US"/>
-        </w:rPr>
-        <w:t xml:space="preserve"> and based on work by Paul Merrell, </w:t>
-      </w:r>
-      <w:r>
-        <w:rPr>
-          <w:lang w:val="en-US"/>
-        </w:rPr>
-        <w:t xml:space="preserve">WFC is a procedural </w:t>
-      </w:r>
-      <w:r>
-        <w:rPr>
-          <w:lang w:val="en-US"/>
-        </w:rPr>
-        <w:t>map generation technique that was originally used to develop</w:t>
+    </w:p>
+    <w:p>
+      <w:pPr>
+        <w:ind w:left="1080"/>
+        <w:jc w:val="center"/>
+        <w:rPr>
+          <w:lang w:val="en-US"/>
+        </w:rPr>
+      </w:pPr>
+      <w:r>
+        <w:rPr>
+          <w:noProof/>
+          <w:lang w:val="en-US"/>
+        </w:rPr>
+        <w:drawing>
+          <wp:inline distT="0" distB="0" distL="0" distR="0" wp14:anchorId="164D0AE3" wp14:editId="4D6EAC26">
+            <wp:extent cx="5043334" cy="2125980"/>
+            <wp:effectExtent l="0" t="0" r="0" b="7620"/>
+            <wp:docPr id="268333725" name="Picture 2"/>
+            <wp:cNvGraphicFramePr>
+              <a:graphicFrameLocks xmlns:a="http://schemas.openxmlformats.org/drawingml/2006/main" noChangeAspect="1"/>
+            </wp:cNvGraphicFramePr>
+            <a:graphic xmlns:a="http://schemas.openxmlformats.org/drawingml/2006/main">
+              <a:graphicData uri="http://schemas.openxmlformats.org/drawingml/2006/picture">
+                <pic:pic xmlns:pic="http://schemas.openxmlformats.org/drawingml/2006/picture">
+                  <pic:nvPicPr>
+                    <pic:cNvPr id="0" name="Picture 2"/>
+                    <pic:cNvPicPr>
+                      <a:picLocks noChangeAspect="1" noChangeArrowheads="1"/>
+                    </pic:cNvPicPr>
+                  </pic:nvPicPr>
+                  <pic:blipFill>
+                    <a:blip r:embed="rId12">
+                      <a:extLst>
+                        <a:ext uri="{28A0092B-C50C-407E-A947-70E740481C1C}">
+                          <a14:useLocalDpi xmlns:a14="http://schemas.microsoft.com/office/drawing/2010/main" val="0"/>
+                        </a:ext>
+                      </a:extLst>
+                    </a:blip>
+                    <a:srcRect/>
+                    <a:stretch>
+                      <a:fillRect/>
+                    </a:stretch>
+                  </pic:blipFill>
+                  <pic:spPr bwMode="auto">
+                    <a:xfrm>
+                      <a:off x="0" y="0"/>
+                      <a:ext cx="5074502" cy="2139119"/>
+                    </a:xfrm>
+                    <a:prstGeom prst="rect">
+                      <a:avLst/>
+                    </a:prstGeom>
+                    <a:noFill/>
+                    <a:ln>
+                      <a:noFill/>
+                    </a:ln>
+                  </pic:spPr>
+                </pic:pic>
+              </a:graphicData>
+            </a:graphic>
+          </wp:inline>
+        </w:drawing>
+      </w:r>
+    </w:p>
+    <w:p>
+      <w:pPr>
+        <w:ind w:left="1080"/>
+        <w:jc w:val="center"/>
+        <w:rPr>
+          <w:b/>
+          <w:bCs/>
+          <w:lang w:val="en-US"/>
+        </w:rPr>
+      </w:pPr>
+      <w:r>
+        <w:rPr>
+          <w:b/>
+          <w:bCs/>
+          <w:lang w:val="en-US"/>
+        </w:rPr>
+        <w:lastRenderedPageBreak/>
+        <w:t>Figure 2: A diagram showcasing the process of the Wave Function Collapse (WFC) in this project, X is grass, Y is tree, S is water, M is mountain</w:t>
+      </w:r>
+    </w:p>
+    <w:p>
+      <w:pPr>
+        <w:ind w:left="1080"/>
+        <w:jc w:val="center"/>
+        <w:rPr>
+          <w:b/>
+          <w:bCs/>
+          <w:lang w:val="en-US"/>
+        </w:rPr>
+      </w:pPr>
+    </w:p>
+    <w:p>
+      <w:pPr>
+        <w:rPr>
+          <w:lang w:val="en-US"/>
+        </w:rPr>
+      </w:pPr>
+      <w:r>
+        <w:rPr>
+          <w:lang w:val="en-US"/>
+        </w:rPr>
+        <w:t xml:space="preserve">Initially, all grid cells are assigned </w:t>
+      </w:r>
+      <w:r>
+        <w:rPr>
+          <w:lang w:val="en-US"/>
+        </w:rPr>
+        <w:t>a set of possible tiles that would be assigned to them</w:t>
+      </w:r>
+      <w:r>
+        <w:rPr>
+          <w:lang w:val="en-US"/>
+        </w:rPr>
+        <w:t xml:space="preserve">. </w:t>
+      </w:r>
+      <w:r>
+        <w:rPr>
+          <w:lang w:val="en-US"/>
+        </w:rPr>
+        <w:t>This is the highest level of entropy, which is the many possible tiles</w:t>
+      </w:r>
+      <w:r>
+        <w:rPr>
+          <w:lang w:val="en-US"/>
+        </w:rPr>
+        <w:t xml:space="preserve"> and the cell that has not been assigned a specific terrain yet. </w:t>
+      </w:r>
+      <w:r>
+        <w:rPr>
+          <w:lang w:val="en-US"/>
+        </w:rPr>
+        <w:t>Then, the function goes on a loop to select the cell that has the lowest entropy cell, meaning the cell with the fewest possible til</w:t>
+      </w:r>
+      <w:r>
+        <w:rPr>
+          <w:lang w:val="en-US"/>
+        </w:rPr>
+        <w:t>es.</w:t>
+      </w:r>
+    </w:p>
+    <w:p>
+      <w:pPr>
+        <w:ind w:left="1080" w:firstLine="360"/>
+        <w:rPr>
+          <w:lang w:val="en-US"/>
+        </w:rPr>
+      </w:pPr>
+    </w:p>
+    <w:p>
+      <w:pPr>
+        <w:rPr>
+          <w:lang w:val="en-US"/>
+        </w:rPr>
+      </w:pPr>
+      <w:r>
+        <w:rPr>
+          <w:lang w:val="en-US"/>
+        </w:rPr>
+        <w:t xml:space="preserve">After that, once a terrain </w:t>
+      </w:r>
+      <w:r>
+        <w:rPr>
+          <w:lang w:val="en-US"/>
+        </w:rPr>
+        <w:t>is chosen for the cell, a constraint propagation is performed</w:t>
+      </w:r>
+      <w:r>
+        <w:rPr>
+          <w:lang w:val="en-US"/>
+        </w:rPr>
+        <w:t>. Constraint propagation updates their possible terrain states based on the defined adjacency</w:t>
+      </w:r>
+      <w:r>
+        <w:rPr>
+          <w:lang w:val="en-US"/>
+        </w:rPr>
+        <w:t xml:space="preserve"> restrictions</w:t>
+      </w:r>
+      <w:r>
+        <w:rPr>
+          <w:lang w:val="en-US"/>
+        </w:rPr>
+        <w:t xml:space="preserve">. </w:t>
+      </w:r>
+      <w:r>
+        <w:rPr>
+          <w:lang w:val="en-US"/>
+        </w:rPr>
+        <w:t xml:space="preserve">These </w:t>
+      </w:r>
+      <w:proofErr w:type="gramStart"/>
+      <w:r>
+        <w:rPr>
+          <w:lang w:val="en-US"/>
+        </w:rPr>
+        <w:t>adjacency</w:t>
+      </w:r>
+      <w:proofErr w:type="gramEnd"/>
+      <w:r>
+        <w:rPr>
+          <w:lang w:val="en-US"/>
+        </w:rPr>
+        <w:t xml:space="preserve"> restrictions </w:t>
+      </w:r>
+      <w:r>
+        <w:rPr>
+          <w:lang w:val="en-US"/>
+        </w:rPr>
+        <w:t xml:space="preserve">define what terrain type is allowed to neighbor next to the other. Therefore, grass can neighbor anything, mountain </w:t>
+      </w:r>
+      <w:proofErr w:type="gramStart"/>
+      <w:r>
+        <w:rPr>
+          <w:lang w:val="en-US"/>
+        </w:rPr>
+        <w:t>neighbors</w:t>
+      </w:r>
+      <w:proofErr w:type="gramEnd"/>
+      <w:r>
+        <w:rPr>
+          <w:lang w:val="en-US"/>
+        </w:rPr>
+        <w:t xml:space="preserve"> grass and itself, the tree neighbors anything but water, and water only neighbors the grass and itself. </w:t>
+      </w:r>
+    </w:p>
+    <w:p>
+      <w:pPr>
+        <w:ind w:left="1080" w:firstLine="360"/>
+        <w:rPr>
+          <w:lang w:val="en-US"/>
+        </w:rPr>
+      </w:pPr>
+    </w:p>
+    <w:p>
+      <w:pPr>
+        <w:rPr>
+          <w:lang w:val="en-US"/>
+        </w:rPr>
+      </w:pPr>
+      <w:r>
+        <w:rPr>
+          <w:lang w:val="en-US"/>
+        </w:rPr>
+        <w:t xml:space="preserve">Through constraint propagation, it allows for the number of possible tiles on a cell to be reduced depending on the neighboring cells. This, in turn, influences the selections made by the function. This entirely continues looping until every cell within the map grid has been assigned a single terrain type which leads to a filled map that has the defined terrain constraints. </w:t>
+      </w:r>
+    </w:p>
+    <w:p>
+      <w:pPr>
+        <w:ind w:left="1080" w:firstLine="360"/>
+        <w:rPr>
+          <w:lang w:val="en-US"/>
+        </w:rPr>
+      </w:pPr>
+    </w:p>
+    <w:p>
+      <w:pPr>
+        <w:rPr>
+          <w:lang w:val="en-US"/>
+        </w:rPr>
+      </w:pPr>
+      <w:r>
+        <w:rPr>
+          <w:lang w:val="en-US"/>
+        </w:rPr>
+        <w:t>Through WFC, this map system does not require a predefined map but rather a random set of tiles that still have a structur</w:t>
+      </w:r>
+      <w:r>
+        <w:rPr>
+          <w:lang w:val="en-US"/>
+        </w:rPr>
+        <w:t xml:space="preserve">al consistency to them. </w:t>
+      </w:r>
+      <w:r>
+        <w:rPr>
+          <w:lang w:val="en-US"/>
+        </w:rPr>
+        <w:t>This leads to the environment having a variety yet at the same time coherency during different game sessions.</w:t>
+      </w:r>
+    </w:p>
+    <w:p>
+      <w:pPr>
+        <w:rPr>
+          <w:lang w:val="en-US"/>
+        </w:rPr>
+      </w:pPr>
+    </w:p>
+    <w:p>
+      <w:pPr>
+        <w:pStyle w:val="Heading2"/>
+        <w:rPr>
+          <w:lang w:val="en-US"/>
+        </w:rPr>
+      </w:pPr>
+      <w:bookmarkStart w:id="8" w:name="_Toc224417150"/>
+      <w:r>
+        <w:rPr>
+          <w:lang w:val="en-US"/>
+        </w:rPr>
+        <w:lastRenderedPageBreak/>
+        <w:t>Player</w:t>
+      </w:r>
+      <w:bookmarkEnd w:id="8"/>
+    </w:p>
+    <w:p>
+      <w:pPr>
+        <w:rPr>
+          <w:lang w:val="en-US"/>
+        </w:rPr>
+      </w:pPr>
+    </w:p>
+    <w:p>
+      <w:pPr>
+        <w:rPr>
+          <w:lang w:val="en-US"/>
+        </w:rPr>
+      </w:pPr>
+      <w:r>
+        <w:rPr>
+          <w:lang w:val="en-US"/>
+        </w:rPr>
+        <w:t xml:space="preserve">The player is </w:t>
+      </w:r>
+      <w:r>
+        <w:rPr>
+          <w:lang w:val="en-US"/>
+        </w:rPr>
+        <w:t xml:space="preserve">practically what the user </w:t>
+      </w:r>
+      <w:r>
+        <w:rPr>
+          <w:lang w:val="en-US"/>
+        </w:rPr>
+        <w:t>controls</w:t>
+      </w:r>
+      <w:r>
+        <w:rPr>
+          <w:lang w:val="en-US"/>
+        </w:rPr>
+        <w:t xml:space="preserve"> within the game environment. </w:t>
+      </w:r>
+      <w:r>
+        <w:rPr>
+          <w:lang w:val="en-US"/>
+        </w:rPr>
+        <w:t>The player</w:t>
+      </w:r>
+      <w:r>
+        <w:rPr>
+          <w:lang w:val="en-US"/>
+        </w:rPr>
+        <w:t xml:space="preserve"> navigates the grid-based procedurally generated map while avoiding the terrain and either avoiding </w:t>
+      </w:r>
+      <w:r>
+        <w:rPr>
+          <w:lang w:val="en-US"/>
+        </w:rPr>
+        <w:t>or</w:t>
+      </w:r>
+      <w:r>
+        <w:rPr>
+          <w:lang w:val="en-US"/>
+        </w:rPr>
+        <w:t xml:space="preserve"> attempting to defeat the enemies. </w:t>
+      </w:r>
+    </w:p>
+    <w:p>
+      <w:pPr>
+        <w:ind w:left="1080" w:firstLine="720"/>
+        <w:rPr>
+          <w:lang w:val="en-US"/>
+        </w:rPr>
+      </w:pPr>
+    </w:p>
+    <w:p>
+      <w:pPr>
+        <w:rPr>
+          <w:lang w:val="en-US"/>
+        </w:rPr>
+      </w:pPr>
+      <w:r>
+        <w:rPr>
+          <w:lang w:val="en-US"/>
+        </w:rPr>
+        <w:t>The player occupies a position on the cell and during each turn of the game loop they can move in four directions: up, down, left, and right.</w:t>
       </w:r>
       <w:r>
         <w:rPr>
@@ -875,37 +2734,34 @@
         <w:rPr>
           <w:lang w:val="en-US"/>
         </w:rPr>
-        <w:t>simple configuration</w:t>
-      </w:r>
-      <w:r>
-        <w:rPr>
-          <w:lang w:val="en-US"/>
-        </w:rPr>
-        <w:t xml:space="preserve"> or</w:t>
-      </w:r>
-      <w:r>
-        <w:rPr>
-          <w:lang w:val="en-US"/>
-        </w:rPr>
-        <w:t xml:space="preserve"> sample image</w:t>
-      </w:r>
-      <w:r>
-        <w:rPr>
-          <w:lang w:val="en-US"/>
-        </w:rPr>
-        <w:t xml:space="preserve">s, in video games it has been used to </w:t>
-      </w:r>
-      <w:r>
-        <w:rPr>
-          <w:lang w:val="en-US"/>
-        </w:rPr>
-        <w:t xml:space="preserve">generate </w:t>
-      </w:r>
-      <w:r>
-        <w:rPr>
-          <w:lang w:val="en-US"/>
-        </w:rPr>
-        <w:t>adjacent constraints from element to element</w:t>
+        <w:t xml:space="preserve">Movement is done through a keyboard input which allows the user to explore the map one step at a time. One step takes a turn within the game map. </w:t>
+      </w:r>
+    </w:p>
+    <w:p>
+      <w:pPr>
+        <w:ind w:left="1080" w:firstLine="720"/>
+        <w:rPr>
+          <w:lang w:val="en-US"/>
+        </w:rPr>
+      </w:pPr>
+    </w:p>
+    <w:p>
+      <w:pPr>
+        <w:rPr>
+          <w:lang w:val="en-US"/>
+        </w:rPr>
+      </w:pPr>
+      <w:r>
+        <w:rPr>
+          <w:lang w:val="en-US"/>
+        </w:rPr>
+        <w:t xml:space="preserve">Like the enemy, the player is constrained by the environmental rules. Terrain types such as mountains and water serve as an obstacle for the </w:t>
+      </w:r>
+      <w:r>
+        <w:rPr>
+          <w:lang w:val="en-US"/>
+        </w:rPr>
+        <w:t>player</w:t>
       </w:r>
       <w:r>
         <w:rPr>
@@ -917,43 +2773,159 @@
         <w:rPr>
           <w:lang w:val="en-US"/>
         </w:rPr>
-        <w:t xml:space="preserve">The function </w:t>
-      </w:r>
-      <w:r>
-        <w:rPr>
-          <w:lang w:val="en-US"/>
-        </w:rPr>
-        <w:t>operates through</w:t>
-      </w:r>
-      <w:r>
-        <w:rPr>
-          <w:lang w:val="en-US"/>
-        </w:rPr>
-        <w:t xml:space="preserve"> checking tiles that are adjacent to one another</w:t>
-      </w:r>
-      <w:r>
-        <w:rPr>
-          <w:lang w:val="en-US"/>
-        </w:rPr>
-        <w:t xml:space="preserve">, e.g. grass can be next to </w:t>
-      </w:r>
-      <w:r>
-        <w:rPr>
-          <w:lang w:val="en-US"/>
-        </w:rPr>
-        <w:t>water,</w:t>
-      </w:r>
-      <w:r>
-        <w:rPr>
-          <w:lang w:val="en-US"/>
-        </w:rPr>
-        <w:t xml:space="preserve"> but mountains can</w:t>
-      </w:r>
-      <w:r>
-        <w:rPr>
-          <w:lang w:val="en-US"/>
-        </w:rPr>
-        <w:t xml:space="preserve">not. </w:t>
+        <w:t>If the player attempts to try to move into a mountain or a water the movement would be preven</w:t>
+      </w:r>
+      <w:r>
+        <w:rPr>
+          <w:lang w:val="en-US"/>
+        </w:rPr>
+        <w:t xml:space="preserve">ted and the player would stay in their current position. </w:t>
+      </w:r>
+      <w:r>
+        <w:rPr>
+          <w:lang w:val="en-US"/>
+        </w:rPr>
+        <w:t>However, unlike the enemy, the player would eventually be able to move through these blocked pathways if they receive the correct item</w:t>
+      </w:r>
+      <w:r>
+        <w:rPr>
+          <w:lang w:val="en-US"/>
+        </w:rPr>
+        <w:t xml:space="preserve"> to pass through mountains and/or manage to acquire the spell that would </w:t>
+      </w:r>
+      <w:r>
+        <w:rPr>
+          <w:lang w:val="en-US"/>
+        </w:rPr>
+        <w:t xml:space="preserve">allow them to </w:t>
+      </w:r>
+      <w:r>
+        <w:rPr>
+          <w:lang w:val="en-US"/>
+        </w:rPr>
+        <w:t xml:space="preserve">pass through water. </w:t>
+      </w:r>
+      <w:r>
+        <w:rPr>
+          <w:lang w:val="en-US"/>
+        </w:rPr>
+        <w:t xml:space="preserve">These constraints make sure that the player is initially navigating an environment according to the initial logical structure of the terrain. The player </w:t>
+      </w:r>
+      <w:r>
+        <w:rPr>
+          <w:lang w:val="en-US"/>
+        </w:rPr>
+        <w:t>will</w:t>
+      </w:r>
+      <w:r>
+        <w:rPr>
+          <w:lang w:val="en-US"/>
+        </w:rPr>
+        <w:t xml:space="preserve"> have to progress through the game further </w:t>
+      </w:r>
+      <w:proofErr w:type="gramStart"/>
+      <w:r>
+        <w:rPr>
+          <w:lang w:val="en-US"/>
+        </w:rPr>
+        <w:t>in order to</w:t>
+      </w:r>
+      <w:proofErr w:type="gramEnd"/>
+      <w:r>
+        <w:rPr>
+          <w:lang w:val="en-US"/>
+        </w:rPr>
+        <w:t xml:space="preserve"> liberate themselves from some of the restrictions if they receive the proper item and/or spell.</w:t>
+      </w:r>
+    </w:p>
+    <w:p>
+      <w:pPr>
+        <w:ind w:left="360"/>
+        <w:rPr>
+          <w:lang w:val="en-US"/>
+        </w:rPr>
+      </w:pPr>
+      <w:r>
+        <w:rPr>
+          <w:lang w:val="en-US"/>
+        </w:rPr>
+        <w:tab/>
+      </w:r>
+      <w:r>
+        <w:rPr>
+          <w:lang w:val="en-US"/>
+        </w:rPr>
+        <w:tab/>
+      </w:r>
+    </w:p>
+    <w:p>
+      <w:pPr>
+        <w:rPr>
+          <w:lang w:val="en-US"/>
+        </w:rPr>
+      </w:pPr>
+      <w:r>
+        <w:rPr>
+          <w:lang w:val="en-US"/>
+        </w:rPr>
+        <w:t xml:space="preserve">In addition to movement, the player has two main important attributes representing their current state during the game: health and mana. </w:t>
+      </w:r>
+      <w:r>
+        <w:rPr>
+          <w:lang w:val="en-US"/>
+        </w:rPr>
+        <w:t xml:space="preserve">Health determines the player’s survival during encounters with the enemy, while </w:t>
+      </w:r>
+      <w:proofErr w:type="gramStart"/>
+      <w:r>
+        <w:rPr>
+          <w:lang w:val="en-US"/>
+        </w:rPr>
+        <w:t>mana</w:t>
+      </w:r>
+      <w:proofErr w:type="gramEnd"/>
+      <w:r>
+        <w:rPr>
+          <w:lang w:val="en-US"/>
+        </w:rPr>
+        <w:t xml:space="preserve"> is a resource used for casting spells</w:t>
+      </w:r>
+      <w:r>
+        <w:rPr>
+          <w:lang w:val="en-US"/>
+        </w:rPr>
+        <w:t xml:space="preserve"> during combat or exploration.</w:t>
+      </w:r>
+      <w:r>
+        <w:rPr>
+          <w:lang w:val="en-US"/>
+        </w:rPr>
+        <w:t xml:space="preserve"> If the player’s health reaches zero, the game ends and the player would have to replay the game starting from where they last saved.</w:t>
+      </w:r>
+      <w:r>
+        <w:rPr>
+          <w:lang w:val="en-US"/>
+        </w:rPr>
+        <w:t xml:space="preserve"> </w:t>
+      </w:r>
+      <w:r>
+        <w:rPr>
+          <w:lang w:val="en-US"/>
+        </w:rPr>
+        <w:t xml:space="preserve">Spells include offensive and defensive abilities, which also include providing buffs during combat. </w:t>
+      </w:r>
+      <w:r>
+        <w:rPr>
+          <w:lang w:val="en-US"/>
+        </w:rPr>
+        <w:t xml:space="preserve">Items serve the same case though it is more a strategic toolkit </w:t>
+      </w:r>
+      <w:r>
+        <w:rPr>
+          <w:lang w:val="en-US"/>
+        </w:rPr>
+        <w:lastRenderedPageBreak/>
+        <w:t xml:space="preserve">that, depending on the lifespan of those items, can disappear from the player’s inventory if it is used more than the maximum amount of uses it has. </w:t>
       </w:r>
     </w:p>
     <w:p>
@@ -966,123 +2938,182 @@
     </w:p>
     <w:p>
       <w:pPr>
-        <w:ind w:left="1080" w:firstLine="360"/>
-        <w:rPr>
-          <w:lang w:val="en-US"/>
-        </w:rPr>
-      </w:pPr>
-      <w:r>
-        <w:rPr>
-          <w:lang w:val="en-US"/>
-        </w:rPr>
-        <w:t xml:space="preserve">Initially, all grid cells are assigned </w:t>
-      </w:r>
-      <w:r>
-        <w:rPr>
-          <w:lang w:val="en-US"/>
-        </w:rPr>
-        <w:t>a set of possible tiles that would be assigned to them</w:t>
-      </w:r>
-      <w:r>
-        <w:rPr>
-          <w:lang w:val="en-US"/>
-        </w:rPr>
-        <w:t xml:space="preserve">. </w:t>
-      </w:r>
-      <w:r>
-        <w:rPr>
-          <w:lang w:val="en-US"/>
-        </w:rPr>
-        <w:t>This is the highest level of entropy, which is the many possible tiles</w:t>
-      </w:r>
-      <w:r>
-        <w:rPr>
-          <w:lang w:val="en-US"/>
-        </w:rPr>
-        <w:t xml:space="preserve"> and the cell that has not been assigned a specific terrain yet. </w:t>
-      </w:r>
-      <w:r>
-        <w:rPr>
-          <w:lang w:val="en-US"/>
-        </w:rPr>
-        <w:t>Then, the function goes on a loop to select the cell that has the lowest entropy cell, meaning the cell with the fewest possible til</w:t>
-      </w:r>
-      <w:r>
-        <w:rPr>
-          <w:lang w:val="en-US"/>
-        </w:rPr>
-        <w:t>es.</w:t>
-      </w:r>
-    </w:p>
-    <w:p>
-      <w:pPr>
-        <w:ind w:left="1080" w:firstLine="360"/>
-        <w:rPr>
-          <w:lang w:val="en-US"/>
-        </w:rPr>
-      </w:pPr>
-    </w:p>
-    <w:p>
-      <w:pPr>
-        <w:ind w:left="1080" w:firstLine="360"/>
-        <w:rPr>
-          <w:lang w:val="en-US"/>
-        </w:rPr>
-      </w:pPr>
-      <w:r>
-        <w:rPr>
-          <w:lang w:val="en-US"/>
-        </w:rPr>
-        <w:t xml:space="preserve">After that, once a terrain </w:t>
-      </w:r>
-      <w:r>
-        <w:rPr>
-          <w:lang w:val="en-US"/>
-        </w:rPr>
-        <w:t>is chosen for the cell, a constraint propagation is performed</w:t>
-      </w:r>
-      <w:r>
-        <w:rPr>
-          <w:lang w:val="en-US"/>
-        </w:rPr>
-        <w:t>. Constraint propagation updates their possible terrain states based on the defined adjacency</w:t>
-      </w:r>
-      <w:r>
-        <w:rPr>
-          <w:lang w:val="en-US"/>
-        </w:rPr>
-        <w:t xml:space="preserve"> restrictions</w:t>
-      </w:r>
-      <w:r>
-        <w:rPr>
-          <w:lang w:val="en-US"/>
-        </w:rPr>
-        <w:t xml:space="preserve">. </w:t>
-      </w:r>
-      <w:r>
-        <w:rPr>
-          <w:lang w:val="en-US"/>
-        </w:rPr>
-        <w:t xml:space="preserve">These adjacency restrictions </w:t>
-      </w:r>
-      <w:r>
-        <w:rPr>
-          <w:lang w:val="en-US"/>
-        </w:rPr>
-        <w:t xml:space="preserve">define what terrain type is allowed to neighbor next to the other. Therefore, grass can neighbor anything, mountain neighbors grass and itself, the tree neighbors anything but water, and water only neighbors the grass and itself. </w:t>
-      </w:r>
-    </w:p>
-    <w:p>
-      <w:pPr>
-        <w:ind w:left="1080" w:firstLine="360"/>
-        <w:rPr>
-          <w:lang w:val="en-US"/>
-        </w:rPr>
-      </w:pPr>
-    </w:p>
-    <w:p>
-      <w:pPr>
-        <w:ind w:left="1080" w:firstLine="360"/>
+        <w:rPr>
+          <w:lang w:val="en-US"/>
+        </w:rPr>
+      </w:pPr>
+      <w:r>
+        <w:rPr>
+          <w:lang w:val="en-US"/>
+        </w:rPr>
+        <w:t xml:space="preserve">With this player system, the player is the central agent of the game, it allows for an interactive user experience and leads to the player having to explore their game environment, navigation, combat, and resource management. </w:t>
+      </w:r>
+    </w:p>
+    <w:p>
+      <w:pPr>
+        <w:ind w:left="720"/>
+        <w:rPr>
+          <w:lang w:val="en-US"/>
+        </w:rPr>
+      </w:pPr>
+      <w:r>
+        <w:rPr>
+          <w:lang w:val="en-US"/>
+        </w:rPr>
+        <w:tab/>
+      </w:r>
+    </w:p>
+    <w:p>
+      <w:pPr>
+        <w:pStyle w:val="Heading2"/>
+        <w:rPr>
+          <w:lang w:val="en-US"/>
+        </w:rPr>
+      </w:pPr>
+      <w:bookmarkStart w:id="9" w:name="_Toc224417151"/>
+      <w:r>
+        <w:rPr>
+          <w:lang w:val="en-US"/>
+        </w:rPr>
+        <w:t>Enemy</w:t>
+      </w:r>
+      <w:bookmarkEnd w:id="9"/>
+    </w:p>
+    <w:p>
+      <w:pPr>
+        <w:ind w:left="1440"/>
+        <w:rPr>
+          <w:lang w:val="en-US"/>
+        </w:rPr>
+      </w:pPr>
+    </w:p>
+    <w:p>
+      <w:pPr>
+        <w:rPr>
+          <w:lang w:val="en-US"/>
+        </w:rPr>
+      </w:pPr>
+      <w:r>
+        <w:rPr>
+          <w:lang w:val="en-US"/>
+        </w:rPr>
+        <w:t xml:space="preserve">Enemies </w:t>
+      </w:r>
+      <w:r>
+        <w:rPr>
+          <w:lang w:val="en-US"/>
+        </w:rPr>
+        <w:t xml:space="preserve">are the hostile entities within the game that pursue the player throughout the environment. </w:t>
+      </w:r>
+      <w:r>
+        <w:rPr>
+          <w:lang w:val="en-US"/>
+        </w:rPr>
+        <w:t xml:space="preserve">Their main mission is to locate and reach the player’s position within the grid-based map. </w:t>
+      </w:r>
+      <w:r>
+        <w:rPr>
+          <w:lang w:val="en-US"/>
+        </w:rPr>
+        <w:t xml:space="preserve">In contrast to the player who is controlled by the user, the enemy is considered a non-playable character (NPC), controlled by an artificial intelligence system. </w:t>
+      </w:r>
+    </w:p>
+    <w:p>
+      <w:pPr>
+        <w:ind w:left="1440"/>
+        <w:rPr>
+          <w:lang w:val="en-US"/>
+        </w:rPr>
+      </w:pPr>
+    </w:p>
+    <w:p>
+      <w:pPr>
+        <w:rPr>
+          <w:lang w:val="en-US"/>
+        </w:rPr>
+      </w:pPr>
+      <w:r>
+        <w:rPr>
+          <w:lang w:val="en-US"/>
+        </w:rPr>
+        <w:t xml:space="preserve">Enemies occupy a position on the cell, and during each turn of the game loop the enemy evaluates the current position of the player and begins determining how to move closer to the player’s position. </w:t>
+      </w:r>
+      <w:r>
+        <w:rPr>
+          <w:lang w:val="en-US"/>
+        </w:rPr>
+        <w:t>This behavior is more efficient and interactive for the player as rather than having the enemy move randomly throughout the environment, they’re instead actively chasing the player.</w:t>
+      </w:r>
+    </w:p>
+    <w:p>
+      <w:pPr>
+        <w:ind w:left="1440"/>
+        <w:rPr>
+          <w:lang w:val="en-US"/>
+        </w:rPr>
+      </w:pPr>
+    </w:p>
+    <w:p>
+      <w:pPr>
+        <w:rPr>
+          <w:lang w:val="en-US"/>
+        </w:rPr>
+      </w:pPr>
+      <w:r>
+        <w:rPr>
+          <w:lang w:val="en-US"/>
+        </w:rPr>
+        <w:t xml:space="preserve">Just like the player, though, the enemy is constrained </w:t>
+      </w:r>
+      <w:r>
+        <w:rPr>
+          <w:lang w:val="en-US"/>
+        </w:rPr>
+        <w:t>by</w:t>
+      </w:r>
+      <w:r>
+        <w:rPr>
+          <w:lang w:val="en-US"/>
+        </w:rPr>
+        <w:t xml:space="preserve"> environmental rules. </w:t>
+      </w:r>
+      <w:r>
+        <w:rPr>
+          <w:lang w:val="en-US"/>
+        </w:rPr>
+        <w:t xml:space="preserve">Terrain types such as mountain serve as an obstacle to the enemy and, therefore, results in the enemy having to navigate around the obstacles </w:t>
+      </w:r>
+      <w:proofErr w:type="gramStart"/>
+      <w:r>
+        <w:rPr>
+          <w:lang w:val="en-US"/>
+        </w:rPr>
+        <w:t>in order to</w:t>
+      </w:r>
+      <w:proofErr w:type="gramEnd"/>
+      <w:r>
+        <w:rPr>
+          <w:lang w:val="en-US"/>
+        </w:rPr>
+        <w:t xml:space="preserve"> reach the player.</w:t>
+      </w:r>
+      <w:r>
+        <w:rPr>
+          <w:lang w:val="en-US"/>
+        </w:rPr>
+        <w:t xml:space="preserve"> To determine an efficient route that would lead the enemy towards the player while also avoiding obstacles that come in their way, the enemy’s movement uses A* pathfinding algorithm. </w:t>
+      </w:r>
+    </w:p>
+    <w:p>
+      <w:pPr>
+        <w:ind w:left="1440"/>
+        <w:rPr>
+          <w:lang w:val="en-US"/>
+        </w:rPr>
+      </w:pPr>
+    </w:p>
+    <w:p>
+      <w:pPr>
         <w:rPr>
           <w:lang w:val="en-US"/>
         </w:rPr>
@@ -1092,80 +3123,566 @@
           <w:lang w:val="en-US"/>
         </w:rPr>
         <w:lastRenderedPageBreak/>
-        <w:t xml:space="preserve">Through constraint propagation, it allows for the number of possible tiles on a cell to be reduced depending on the neighboring cells. This, in turn, influences the selections made by the function. This entirely continues looping until every cell within the map grid has been assigned a single terrain type which leads to a filled map that has the defined terrain constraints. </w:t>
-      </w:r>
-    </w:p>
-    <w:p>
-      <w:pPr>
-        <w:ind w:left="1080" w:firstLine="360"/>
-        <w:rPr>
-          <w:lang w:val="en-US"/>
-        </w:rPr>
-      </w:pPr>
-    </w:p>
-    <w:p>
-      <w:pPr>
-        <w:ind w:left="1080" w:firstLine="360"/>
-        <w:rPr>
-          <w:lang w:val="en-US"/>
-        </w:rPr>
-      </w:pPr>
-      <w:r>
-        <w:rPr>
-          <w:lang w:val="en-US"/>
-        </w:rPr>
-        <w:t>Through WFC, this map system does not require a predefined map but rather a random set of tiles that still have a structur</w:t>
-      </w:r>
-      <w:r>
-        <w:rPr>
-          <w:lang w:val="en-US"/>
-        </w:rPr>
-        <w:t xml:space="preserve">al consistency to them. </w:t>
-      </w:r>
-      <w:r>
-        <w:rPr>
-          <w:lang w:val="en-US"/>
-        </w:rPr>
-        <w:t>This leads to the environment having a variety yet at the same time coherency during different game sessions.</w:t>
-      </w:r>
-    </w:p>
-    <w:p>
-      <w:pPr>
-        <w:rPr>
-          <w:lang w:val="en-US"/>
-        </w:rPr>
-      </w:pPr>
-    </w:p>
-    <w:p>
-      <w:pPr>
-        <w:rPr>
-          <w:lang w:val="en-US"/>
-        </w:rPr>
-      </w:pPr>
-    </w:p>
-    <w:p>
-      <w:pPr>
-        <w:ind w:left="1080" w:firstLine="360"/>
-        <w:rPr>
-          <w:lang w:val="en-US"/>
-        </w:rPr>
-      </w:pPr>
-    </w:p>
-    <w:p>
-      <w:pPr>
-        <w:ind w:left="1080" w:firstLine="360"/>
-        <w:rPr>
-          <w:lang w:val="en-US"/>
-        </w:rPr>
-      </w:pPr>
-    </w:p>
-    <w:p>
-      <w:pPr>
-        <w:ind w:left="1080" w:firstLine="360"/>
-        <w:rPr>
-          <w:lang w:val="en-US"/>
-        </w:rPr>
-      </w:pPr>
+        <w:t xml:space="preserve">A* pathfinding algorithm is </w:t>
+      </w:r>
+      <w:r>
+        <w:rPr>
+          <w:lang w:val="en-US"/>
+        </w:rPr>
+        <w:t xml:space="preserve">an algorithm that finds the shortest path between a starting node and a goal node within a weighted graph. It combines two algorithms, Dijkstra’s algorithm which tries to find the shortest path to all nodes from a single node source and Greedy Best-First Search which explores the node </w:t>
+      </w:r>
+      <w:r>
+        <w:rPr>
+          <w:lang w:val="en-US"/>
+        </w:rPr>
+        <w:t>that appears closest to the goal based on a heuristic functio</w:t>
+      </w:r>
+      <w:r>
+        <w:rPr>
+          <w:lang w:val="en-US"/>
+        </w:rPr>
+        <w:t>n. However, what makes A* more efficient for enemy movement is that A* considers the distance that was already traveled from the start and an estimate of the remaining distance to the goal, this is in comparison to Dijkstra’s algorithm which explores in all directions and Greedy Best-First search which only heads straight towards the destination rather than looking for shortcuts.</w:t>
+      </w:r>
+    </w:p>
+    <w:p>
+      <w:pPr>
+        <w:ind w:left="1440"/>
+        <w:rPr>
+          <w:lang w:val="en-US"/>
+        </w:rPr>
+      </w:pPr>
+    </w:p>
+    <w:p>
+      <w:pPr>
+        <w:rPr>
+          <w:lang w:val="en-US"/>
+        </w:rPr>
+      </w:pPr>
+      <w:r>
+        <w:rPr>
+          <w:lang w:val="en-US"/>
+        </w:rPr>
+        <w:t xml:space="preserve">A* operates through an evaluation of nodes using a cost function which is defined as: </w:t>
+      </w:r>
+    </w:p>
+    <w:p>
+      <w:pPr>
+        <w:rPr>
+          <w:lang w:val="en-US"/>
+        </w:rPr>
+      </w:pPr>
+    </w:p>
+    <w:p>
+      <w:pPr>
+        <w:jc w:val="center"/>
+        <w:rPr>
+          <w:lang w:val="en-US"/>
+        </w:rPr>
+      </w:pPr>
+      <w:r>
+        <w:rPr>
+          <w:lang w:val="en-US"/>
+        </w:rPr>
+        <w:t>f(n) = g(n) + h(n)</w:t>
+      </w:r>
+    </w:p>
+    <w:p>
+      <w:pPr>
+        <w:rPr>
+          <w:lang w:val="en-US"/>
+        </w:rPr>
+      </w:pPr>
+    </w:p>
+    <w:p>
+      <w:pPr>
+        <w:rPr>
+          <w:lang w:val="en-US"/>
+        </w:rPr>
+      </w:pPr>
+      <w:r>
+        <w:rPr>
+          <w:lang w:val="en-US"/>
+        </w:rPr>
+        <w:t xml:space="preserve">While g(n) represents the cost required to reach the node n from the starting position, h(n) represents the heuristic estimate of the distance from node n to the goal. In this instance, the heuristic is calculated through the Manhattan distance which works for a grid-based environment such as this game map where the enemy can move horizontally or vertically. </w:t>
+      </w:r>
+    </w:p>
+    <w:p>
+      <w:pPr>
+        <w:rPr>
+          <w:lang w:val="en-US"/>
+        </w:rPr>
+      </w:pPr>
+    </w:p>
+    <w:p>
+      <w:pPr>
+        <w:rPr>
+          <w:lang w:val="en-US"/>
+        </w:rPr>
+      </w:pPr>
+      <w:r>
+        <w:rPr>
+          <w:lang w:val="en-US"/>
+        </w:rPr>
+        <w:t xml:space="preserve">During execution, A* maintains two main sets of nodes. </w:t>
+      </w:r>
+      <w:r>
+        <w:rPr>
+          <w:lang w:val="en-US"/>
+        </w:rPr>
+        <w:t xml:space="preserve">The open set contains nodes which are still to be explored while the closed set are nodes that have already been explored. </w:t>
+      </w:r>
+      <w:r>
+        <w:rPr>
+          <w:lang w:val="en-US"/>
+        </w:rPr>
+        <w:t xml:space="preserve">Within each step of the algorithm, </w:t>
+      </w:r>
+      <w:r>
+        <w:rPr>
+          <w:lang w:val="en-US"/>
+        </w:rPr>
+        <w:t xml:space="preserve">the node with the estimated lowest total cost of f(n) which is selected from the open set and further expanding when exploring the neighboring nodes. </w:t>
+      </w:r>
+      <w:r>
+        <w:rPr>
+          <w:lang w:val="en-US"/>
+        </w:rPr>
+        <w:t>Mountains, which are an obstacle to the enemy, are excluded from the search.</w:t>
+      </w:r>
+    </w:p>
+    <w:p>
+      <w:pPr>
+        <w:rPr>
+          <w:lang w:val="en-US"/>
+        </w:rPr>
+      </w:pPr>
+    </w:p>
+    <w:p>
+      <w:pPr>
+        <w:rPr>
+          <w:lang w:val="en-US"/>
+        </w:rPr>
+      </w:pPr>
+      <w:r>
+        <w:rPr>
+          <w:lang w:val="en-US"/>
+        </w:rPr>
+        <w:lastRenderedPageBreak/>
+        <w:t xml:space="preserve">Once A* finds the player’s position, it tries to reconstruct the shortest path by tracing the parent nodes from starting position to the goal. </w:t>
+      </w:r>
+      <w:r>
+        <w:rPr>
+          <w:lang w:val="en-US"/>
+        </w:rPr>
+        <w:t>The enemy then moves one step along this path per game turn.</w:t>
+      </w:r>
+      <w:r>
+        <w:rPr>
+          <w:lang w:val="en-US"/>
+        </w:rPr>
+        <w:t xml:space="preserve"> </w:t>
+      </w:r>
+    </w:p>
+    <w:p>
+      <w:pPr>
+        <w:rPr>
+          <w:lang w:val="en-US"/>
+        </w:rPr>
+      </w:pPr>
+    </w:p>
+    <w:p>
+      <w:pPr>
+        <w:rPr>
+          <w:lang w:val="en-US"/>
+        </w:rPr>
+      </w:pPr>
+      <w:r>
+        <w:rPr>
+          <w:lang w:val="en-US"/>
+        </w:rPr>
+        <w:t xml:space="preserve">Through A* program which relies on the grid-based procedurally generated map, enemies can navigate through a complex terrain to try and chase the player. </w:t>
+      </w:r>
+      <w:r>
+        <w:rPr>
+          <w:lang w:val="en-US"/>
+        </w:rPr>
+        <w:t xml:space="preserve">It makes it so that the enemy has a purpose when it decides on its movement and responds to its environment rather than having random movements until it finds the enemy. </w:t>
+      </w:r>
+    </w:p>
+    <w:p>
+      <w:pPr>
+        <w:rPr>
+          <w:lang w:val="en-US"/>
+        </w:rPr>
+      </w:pPr>
+    </w:p>
+    <w:p>
+      <w:pPr>
+        <w:rPr>
+          <w:lang w:val="en-US"/>
+        </w:rPr>
+      </w:pPr>
+      <w:r>
+        <w:rPr>
+          <w:lang w:val="en-US"/>
+        </w:rPr>
+        <w:t xml:space="preserve">When the enemy reaches the player’s position, a turn-based combat encounter begins. During this combat, enemies can perform physical attacks, use their own items, or employ abilities that they would have that </w:t>
+      </w:r>
+      <w:proofErr w:type="gramStart"/>
+      <w:r>
+        <w:rPr>
+          <w:lang w:val="en-US"/>
+        </w:rPr>
+        <w:t>affects</w:t>
+      </w:r>
+      <w:proofErr w:type="gramEnd"/>
+      <w:r>
+        <w:rPr>
+          <w:lang w:val="en-US"/>
+        </w:rPr>
+        <w:t xml:space="preserve"> the </w:t>
+      </w:r>
+      <w:r>
+        <w:rPr>
+          <w:lang w:val="en-US"/>
+        </w:rPr>
+        <w:t xml:space="preserve">battle. </w:t>
+      </w:r>
+    </w:p>
+    <w:p>
+      <w:pPr>
+        <w:rPr>
+          <w:lang w:val="en-US"/>
+        </w:rPr>
+      </w:pPr>
+    </w:p>
+    <w:p>
+      <w:pPr>
+        <w:rPr>
+          <w:lang w:val="en-US"/>
+        </w:rPr>
+      </w:pPr>
+      <w:r>
+        <w:rPr>
+          <w:lang w:val="en-US"/>
+        </w:rPr>
+        <w:t xml:space="preserve">Providing the enemy with similar combat mechanics to the player allows for a fairer and challenging game for the player who would have to strategize in their moves to ensure the enemy’s defeat. </w:t>
+      </w:r>
+      <w:r>
+        <w:rPr>
+          <w:lang w:val="en-US"/>
+        </w:rPr>
+        <w:t>It adds more complexity and depth into the gameplay for the player but maintains a clear relationship in exploration, enemy behavior especially in the sphere of artificial intelligence, and their combat system.</w:t>
+      </w:r>
+    </w:p>
+    <w:p>
+      <w:pPr>
+        <w:rPr>
+          <w:lang w:val="en-US"/>
+        </w:rPr>
+      </w:pPr>
+    </w:p>
+    <w:p>
+      <w:pPr>
+        <w:pStyle w:val="Heading1"/>
+        <w:rPr>
+          <w:lang w:val="en-US"/>
+        </w:rPr>
+      </w:pPr>
+      <w:r>
+        <w:rPr>
+          <w:lang w:val="en-US"/>
+        </w:rPr>
+        <w:t>Implementation</w:t>
+      </w:r>
+    </w:p>
+    <w:p>
+      <w:pPr>
+        <w:rPr>
+          <w:lang w:val="en-US"/>
+        </w:rPr>
+      </w:pPr>
+    </w:p>
+    <w:p>
+      <w:pPr>
+        <w:rPr>
+          <w:lang w:val="en-US"/>
+        </w:rPr>
+      </w:pPr>
+      <w:r>
+        <w:rPr>
+          <w:lang w:val="en-US"/>
+        </w:rPr>
+        <w:t xml:space="preserve">This section </w:t>
+      </w:r>
+      <w:r>
+        <w:rPr>
+          <w:lang w:val="en-US"/>
+        </w:rPr>
+        <w:t xml:space="preserve">describes the implementation </w:t>
+      </w:r>
+      <w:r>
+        <w:rPr>
+          <w:lang w:val="en-US"/>
+        </w:rPr>
+        <w:t>programming</w:t>
+      </w:r>
+      <w:r>
+        <w:rPr>
+          <w:lang w:val="en-US"/>
+        </w:rPr>
+        <w:t xml:space="preserve">, approaches and tools that have been used to develop the game. </w:t>
+      </w:r>
+      <w:r>
+        <w:rPr>
+          <w:lang w:val="en-US"/>
+        </w:rPr>
+        <w:t xml:space="preserve">The game was implemented as a console-based game that integrates procedural map generation, </w:t>
+      </w:r>
+      <w:r>
+        <w:rPr>
+          <w:lang w:val="en-US"/>
+        </w:rPr>
+        <w:t xml:space="preserve">artificial intelligence navigation and behavior, and turn-based gameplay mechanics within an object-oriented system architecture. </w:t>
+      </w:r>
+    </w:p>
+    <w:p>
+      <w:pPr>
+        <w:rPr>
+          <w:lang w:val="en-US"/>
+        </w:rPr>
+      </w:pPr>
+    </w:p>
+    <w:p>
+      <w:pPr>
+        <w:rPr>
+          <w:lang w:val="en-US"/>
+        </w:rPr>
+      </w:pPr>
+      <w:r>
+        <w:rPr>
+          <w:lang w:val="en-US"/>
+        </w:rPr>
+        <w:lastRenderedPageBreak/>
+        <w:t xml:space="preserve">The implementation focuses on turning the system design described in previous sections into a proper game. </w:t>
+      </w:r>
+      <w:r>
+        <w:rPr>
+          <w:lang w:val="en-US"/>
+        </w:rPr>
+        <w:t xml:space="preserve">Core components including the game environment, user-controlled player, enemy behavior system, and combat mechanics were implemented as independent classes which, although separate from each other, interact through the central game loop. </w:t>
+      </w:r>
+    </w:p>
+    <w:p>
+      <w:pPr>
+        <w:rPr>
+          <w:lang w:val="en-US"/>
+        </w:rPr>
+      </w:pPr>
+    </w:p>
+    <w:p>
+      <w:pPr>
+        <w:rPr>
+          <w:lang w:val="en-US"/>
+        </w:rPr>
+      </w:pPr>
+      <w:r>
+        <w:rPr>
+          <w:lang w:val="en-US"/>
+        </w:rPr>
+        <w:t xml:space="preserve">This structure allows the system to remain organized and maintainable yet showcasing a more complex gameplay with challenges for the player during the game. </w:t>
+      </w:r>
+    </w:p>
+    <w:p>
+      <w:pPr>
+        <w:rPr>
+          <w:lang w:val="en-US"/>
+        </w:rPr>
+      </w:pPr>
+    </w:p>
+    <w:p>
+      <w:pPr>
+        <w:pStyle w:val="Heading2"/>
+      </w:pPr>
+      <w:r>
+        <w:t>Programming languages, libraries, and external frameworks</w:t>
+      </w:r>
+    </w:p>
+    <w:p>
+      <w:pPr>
+        <w:rPr>
+          <w:lang w:val="en-US"/>
+        </w:rPr>
+      </w:pPr>
+    </w:p>
+    <w:p>
+      <w:pPr>
+        <w:rPr>
+          <w:lang w:val="en-US"/>
+        </w:rPr>
+      </w:pPr>
+      <w:r>
+        <w:rPr>
+          <w:lang w:val="en-US"/>
+        </w:rPr>
+        <w:t>The game was created through Java. Java was chosen as the programming language due to its strong support for object-oriented programming, extensive standard already-built libraries for data structures, input handling, and implantation of algorithms.</w:t>
+      </w:r>
+    </w:p>
+    <w:p>
+      <w:pPr>
+        <w:rPr>
+          <w:lang w:val="en-US"/>
+        </w:rPr>
+      </w:pPr>
+    </w:p>
+    <w:p>
+      <w:pPr>
+        <w:rPr>
+          <w:lang w:val="en-US"/>
+        </w:rPr>
+      </w:pPr>
+      <w:r>
+        <w:rPr>
+          <w:lang w:val="en-US"/>
+        </w:rPr>
+        <w:t xml:space="preserve">Java is also great if the game is played on different operating systems such as </w:t>
+      </w:r>
+      <w:r>
+        <w:rPr>
+          <w:lang w:val="en-US"/>
+        </w:rPr>
+        <w:t xml:space="preserve">Windows, Linux, and Mac due to the Java Virtual Machine (JVM) which allows itself to be an intermediary between the compiled program and the operating system. </w:t>
+      </w:r>
+      <w:r>
+        <w:rPr>
+          <w:lang w:val="en-US"/>
+        </w:rPr>
+        <w:t>This design allows java programs to be able to be written on one different operating system and run on whichever operating system making it well-suited for cross-platform software and, for this instance, game development.</w:t>
+      </w:r>
+    </w:p>
+    <w:p>
+      <w:pPr>
+        <w:rPr>
+          <w:lang w:val="en-US"/>
+        </w:rPr>
+      </w:pPr>
+    </w:p>
+    <w:p>
+      <w:pPr>
+        <w:rPr>
+          <w:lang w:val="en-US"/>
+        </w:rPr>
+      </w:pPr>
+      <w:r>
+        <w:rPr>
+          <w:lang w:val="en-US"/>
+        </w:rPr>
+        <w:t>The system is fully reliant on Java’s already existing standard library. Java’s Collections Framework is used throughout the program for the sets and lists which are seen in possible tile states via the Wave Function Collapse (WFC) and priority queues in A* pathfinding algorithm to evaluate nodes during the search process.</w:t>
+      </w:r>
+    </w:p>
+    <w:p>
+      <w:pPr>
+        <w:rPr>
+          <w:lang w:val="en-US"/>
+        </w:rPr>
+      </w:pPr>
+    </w:p>
+    <w:p>
+      <w:pPr>
+        <w:rPr>
+          <w:lang w:val="en-US"/>
+        </w:rPr>
+      </w:pPr>
+      <w:r>
+        <w:rPr>
+          <w:lang w:val="en-US"/>
+        </w:rPr>
+        <w:lastRenderedPageBreak/>
+        <w:t xml:space="preserve">No external frameworks or libraries have been used for this </w:t>
+      </w:r>
+      <w:proofErr w:type="gramStart"/>
+      <w:r>
+        <w:rPr>
+          <w:lang w:val="en-US"/>
+        </w:rPr>
+        <w:t>project,</w:t>
+      </w:r>
+      <w:proofErr w:type="gramEnd"/>
+      <w:r>
+        <w:rPr>
+          <w:lang w:val="en-US"/>
+        </w:rPr>
+        <w:t xml:space="preserve"> all the necessary functionalities use Java’s already built-in libraries. </w:t>
+      </w:r>
+    </w:p>
+    <w:p>
+      <w:pPr>
+        <w:rPr>
+          <w:lang w:val="en-US"/>
+        </w:rPr>
+      </w:pPr>
+    </w:p>
+    <w:p>
+      <w:pPr>
+        <w:pStyle w:val="Heading2"/>
+        <w:rPr>
+          <w:lang w:val="en-US"/>
+        </w:rPr>
+      </w:pPr>
+      <w:r>
+        <w:rPr>
+          <w:lang w:val="en-US"/>
+        </w:rPr>
+        <w:t>Installation Requirements</w:t>
+      </w:r>
+    </w:p>
+    <w:p>
+      <w:pPr>
+        <w:rPr>
+          <w:lang w:val="en-US"/>
+        </w:rPr>
+      </w:pPr>
+    </w:p>
+    <w:p>
+      <w:pPr>
+        <w:rPr>
+          <w:lang w:val="en-US"/>
+        </w:rPr>
+      </w:pPr>
+      <w:r>
+        <w:rPr>
+          <w:lang w:val="en-US"/>
+        </w:rPr>
+        <w:t xml:space="preserve">The following </w:t>
+      </w:r>
+      <w:proofErr w:type="gramStart"/>
+      <w:r>
+        <w:rPr>
+          <w:lang w:val="en-US"/>
+        </w:rPr>
+        <w:t>is</w:t>
+      </w:r>
+      <w:proofErr w:type="gramEnd"/>
+      <w:r>
+        <w:rPr>
+          <w:lang w:val="en-US"/>
+        </w:rPr>
+        <w:t xml:space="preserve"> required </w:t>
+      </w:r>
+      <w:proofErr w:type="gramStart"/>
+      <w:r>
+        <w:rPr>
+          <w:lang w:val="en-US"/>
+        </w:rPr>
+        <w:t>in order to</w:t>
+      </w:r>
+      <w:proofErr w:type="gramEnd"/>
+      <w:r>
+        <w:rPr>
+          <w:lang w:val="en-US"/>
+        </w:rPr>
+        <w:t xml:space="preserve"> compile and run the game:</w:t>
+      </w:r>
     </w:p>
     <w:p>
       <w:pPr>
@@ -1176,6 +3693,7 @@
           <w:lang w:val="en-US"/>
         </w:rPr>
       </w:pPr>
+      <w:bookmarkStart w:id="10" w:name="_Toc224417152"/>
       <w:r>
         <w:rPr>
           <w:rFonts w:asciiTheme="minorBidi" w:hAnsiTheme="minorBidi" w:cstheme="minorBidi"/>
@@ -1183,6 +3701,7 @@
         </w:rPr>
         <w:t>Bibliography</w:t>
       </w:r>
+      <w:bookmarkEnd w:id="10"/>
     </w:p>
     <w:p>
       <w:pPr>
@@ -1192,7 +3711,7 @@
           <w:lang w:val="en-US"/>
         </w:rPr>
       </w:pPr>
-      <w:hyperlink r:id="rId12" w:history="1">
+      <w:hyperlink r:id="rId13" w:history="1">
         <w:r>
           <w:rPr>
             <w:rStyle w:val="Hyperlink"/>
@@ -1207,7 +3726,7 @@
       <w:pPr>
         <w:jc w:val="both"/>
       </w:pPr>
-      <w:hyperlink r:id="rId13" w:history="1">
+      <w:hyperlink r:id="rId14" w:history="1">
         <w:r>
           <w:rPr>
             <w:rStyle w:val="Hyperlink"/>
@@ -1226,7 +3745,7 @@
           <w:lang w:val="en-US"/>
         </w:rPr>
       </w:pPr>
-      <w:hyperlink r:id="rId14" w:history="1">
+      <w:hyperlink r:id="rId15" w:history="1">
         <w:r>
           <w:rPr>
             <w:rStyle w:val="Hyperlink"/>
@@ -1245,7 +3764,7 @@
           <w:lang w:val="en-US"/>
         </w:rPr>
       </w:pPr>
-      <w:hyperlink r:id="rId15" w:history="1">
+      <w:hyperlink r:id="rId16" w:history="1">
         <w:r>
           <w:rPr>
             <w:rStyle w:val="Hyperlink"/>
@@ -1259,19 +3778,28 @@
     <w:p>
       <w:pPr>
         <w:jc w:val="both"/>
-        <w:rPr>
-          <w:rFonts w:asciiTheme="minorBidi" w:hAnsiTheme="minorBidi"/>
-          <w:lang w:val="en-US"/>
-        </w:rPr>
-      </w:pPr>
-      <w:hyperlink r:id="rId16" w:history="1">
+      </w:pPr>
+      <w:hyperlink r:id="rId17" w:history="1">
+        <w:r>
+          <w:rPr>
+            <w:rStyle w:val="Hyperlink"/>
+          </w:rPr>
+          <w:t>https://www.datacamp.com/tutorial/a-star-algorithm</w:t>
+        </w:r>
+      </w:hyperlink>
+    </w:p>
+    <w:p>
+      <w:pPr>
+        <w:jc w:val="both"/>
+      </w:pPr>
+      <w:hyperlink r:id="rId18" w:history="1">
         <w:r>
           <w:rPr>
             <w:rStyle w:val="Hyperlink"/>
             <w:rFonts w:asciiTheme="minorBidi" w:hAnsiTheme="minorBidi"/>
             <w:lang w:val="en-US"/>
           </w:rPr>
-          <w:t>https://www.geeksforgeeks.org/dsa/a-search-algorithm/</w:t>
+          <w:t>https://www.baeldung.com/cs/a-star-algorithm</w:t>
         </w:r>
       </w:hyperlink>
     </w:p>
@@ -1283,14 +3811,14 @@
           <w:lang w:val="en-US"/>
         </w:rPr>
       </w:pPr>
-      <w:hyperlink r:id="rId17" w:history="1">
+      <w:hyperlink r:id="rId19" w:history="1">
         <w:r>
           <w:rPr>
             <w:rStyle w:val="Hyperlink"/>
             <w:rFonts w:asciiTheme="minorBidi" w:hAnsiTheme="minorBidi"/>
             <w:lang w:val="en-US"/>
           </w:rPr>
-          <w:t>https://www.baeldung.com/cs/a-star-algorithm</w:t>
+          <w:t>https://docs.oracle.com/javase/8/docs/technotes/guides/vm</w:t>
         </w:r>
       </w:hyperlink>
     </w:p>
@@ -1303,71 +3831,8 @@
         </w:rPr>
       </w:pPr>
     </w:p>
-    <w:p>
-      <w:pPr>
-        <w:jc w:val="both"/>
-        <w:rPr>
-          <w:rFonts w:asciiTheme="minorBidi" w:hAnsiTheme="minorBidi"/>
-          <w:lang w:val="en-US"/>
-        </w:rPr>
-      </w:pPr>
-    </w:p>
-    <w:p>
-      <w:pPr>
-        <w:jc w:val="both"/>
-        <w:rPr>
-          <w:rFonts w:asciiTheme="minorBidi" w:hAnsiTheme="minorBidi"/>
-          <w:lang w:val="en-US"/>
-        </w:rPr>
-      </w:pPr>
-    </w:p>
-    <w:p>
-      <w:pPr>
-        <w:jc w:val="both"/>
-        <w:rPr>
-          <w:rFonts w:asciiTheme="minorBidi" w:hAnsiTheme="minorBidi"/>
-          <w:lang w:val="en-US"/>
-        </w:rPr>
-      </w:pPr>
-    </w:p>
-    <w:p>
-      <w:pPr>
-        <w:jc w:val="both"/>
-        <w:rPr>
-          <w:rFonts w:asciiTheme="minorBidi" w:hAnsiTheme="minorBidi"/>
-          <w:lang w:val="en-US"/>
-        </w:rPr>
-      </w:pPr>
-    </w:p>
-    <w:p>
-      <w:pPr>
-        <w:jc w:val="both"/>
-        <w:rPr>
-          <w:rFonts w:asciiTheme="minorBidi" w:hAnsiTheme="minorBidi"/>
-          <w:lang w:val="en-US"/>
-        </w:rPr>
-      </w:pPr>
-    </w:p>
-    <w:p>
-      <w:pPr>
-        <w:jc w:val="both"/>
-        <w:rPr>
-          <w:rFonts w:asciiTheme="minorBidi" w:hAnsiTheme="minorBidi"/>
-          <w:lang w:val="en-US"/>
-        </w:rPr>
-      </w:pPr>
-    </w:p>
-    <w:p>
-      <w:pPr>
-        <w:jc w:val="both"/>
-        <w:rPr>
-          <w:rFonts w:asciiTheme="minorBidi" w:hAnsiTheme="minorBidi"/>
-          <w:lang w:val="en-US"/>
-        </w:rPr>
-      </w:pPr>
-    </w:p>
     <w:sectPr>
-      <w:footerReference w:type="default" r:id="rId18"/>
+      <w:footerReference w:type="default" r:id="rId20"/>
       <w:pgSz w:w="11906" w:h="16838" w:code="9"/>
       <w:pgMar w:top="1440" w:right="1440" w:bottom="1440" w:left="1440" w:header="720" w:footer="720" w:gutter="0"/>
       <w:pgNumType w:start="0"/>
@@ -1663,6 +4128,318 @@
     </w:lvl>
   </w:abstractNum>
   <w:abstractNum w:abstractNumId="2" w15:restartNumberingAfterBreak="0">
+    <w:nsid w:val="25794EFD"/>
+    <w:multiLevelType w:val="hybridMultilevel"/>
+    <w:tmpl w:val="31D627C8"/>
+    <w:lvl w:ilvl="0" w:tplc="08090001">
+      <w:start w:val="1"/>
+      <w:numFmt w:val="bullet"/>
+      <w:lvlText w:val=""/>
+      <w:lvlJc w:val="left"/>
+      <w:pPr>
+        <w:ind w:left="1800" w:hanging="360"/>
+      </w:pPr>
+      <w:rPr>
+        <w:rFonts w:ascii="Symbol" w:hAnsi="Symbol" w:hint="default"/>
+      </w:rPr>
+    </w:lvl>
+    <w:lvl w:ilvl="1" w:tplc="08090003">
+      <w:start w:val="1"/>
+      <w:numFmt w:val="bullet"/>
+      <w:lvlText w:val="o"/>
+      <w:lvlJc w:val="left"/>
+      <w:pPr>
+        <w:ind w:left="2520" w:hanging="360"/>
+      </w:pPr>
+      <w:rPr>
+        <w:rFonts w:ascii="Courier New" w:hAnsi="Courier New" w:cs="Courier New" w:hint="default"/>
+      </w:rPr>
+    </w:lvl>
+    <w:lvl w:ilvl="2" w:tplc="08090005" w:tentative="1">
+      <w:start w:val="1"/>
+      <w:numFmt w:val="bullet"/>
+      <w:lvlText w:val=""/>
+      <w:lvlJc w:val="left"/>
+      <w:pPr>
+        <w:ind w:left="3240" w:hanging="360"/>
+      </w:pPr>
+      <w:rPr>
+        <w:rFonts w:ascii="Wingdings" w:hAnsi="Wingdings" w:hint="default"/>
+      </w:rPr>
+    </w:lvl>
+    <w:lvl w:ilvl="3" w:tplc="08090001" w:tentative="1">
+      <w:start w:val="1"/>
+      <w:numFmt w:val="bullet"/>
+      <w:lvlText w:val=""/>
+      <w:lvlJc w:val="left"/>
+      <w:pPr>
+        <w:ind w:left="3960" w:hanging="360"/>
+      </w:pPr>
+      <w:rPr>
+        <w:rFonts w:ascii="Symbol" w:hAnsi="Symbol" w:hint="default"/>
+      </w:rPr>
+    </w:lvl>
+    <w:lvl w:ilvl="4" w:tplc="08090003" w:tentative="1">
+      <w:start w:val="1"/>
+      <w:numFmt w:val="bullet"/>
+      <w:lvlText w:val="o"/>
+      <w:lvlJc w:val="left"/>
+      <w:pPr>
+        <w:ind w:left="4680" w:hanging="360"/>
+      </w:pPr>
+      <w:rPr>
+        <w:rFonts w:ascii="Courier New" w:hAnsi="Courier New" w:cs="Courier New" w:hint="default"/>
+      </w:rPr>
+    </w:lvl>
+    <w:lvl w:ilvl="5" w:tplc="08090005" w:tentative="1">
+      <w:start w:val="1"/>
+      <w:numFmt w:val="bullet"/>
+      <w:lvlText w:val=""/>
+      <w:lvlJc w:val="left"/>
+      <w:pPr>
+        <w:ind w:left="5400" w:hanging="360"/>
+      </w:pPr>
+      <w:rPr>
+        <w:rFonts w:ascii="Wingdings" w:hAnsi="Wingdings" w:hint="default"/>
+      </w:rPr>
+    </w:lvl>
+    <w:lvl w:ilvl="6" w:tplc="08090001" w:tentative="1">
+      <w:start w:val="1"/>
+      <w:numFmt w:val="bullet"/>
+      <w:lvlText w:val=""/>
+      <w:lvlJc w:val="left"/>
+      <w:pPr>
+        <w:ind w:left="6120" w:hanging="360"/>
+      </w:pPr>
+      <w:rPr>
+        <w:rFonts w:ascii="Symbol" w:hAnsi="Symbol" w:hint="default"/>
+      </w:rPr>
+    </w:lvl>
+    <w:lvl w:ilvl="7" w:tplc="08090003" w:tentative="1">
+      <w:start w:val="1"/>
+      <w:numFmt w:val="bullet"/>
+      <w:lvlText w:val="o"/>
+      <w:lvlJc w:val="left"/>
+      <w:pPr>
+        <w:ind w:left="6840" w:hanging="360"/>
+      </w:pPr>
+      <w:rPr>
+        <w:rFonts w:ascii="Courier New" w:hAnsi="Courier New" w:cs="Courier New" w:hint="default"/>
+      </w:rPr>
+    </w:lvl>
+    <w:lvl w:ilvl="8" w:tplc="08090005" w:tentative="1">
+      <w:start w:val="1"/>
+      <w:numFmt w:val="bullet"/>
+      <w:lvlText w:val=""/>
+      <w:lvlJc w:val="left"/>
+      <w:pPr>
+        <w:ind w:left="7560" w:hanging="360"/>
+      </w:pPr>
+      <w:rPr>
+        <w:rFonts w:ascii="Wingdings" w:hAnsi="Wingdings" w:hint="default"/>
+      </w:rPr>
+    </w:lvl>
+  </w:abstractNum>
+  <w:abstractNum w:abstractNumId="3" w15:restartNumberingAfterBreak="0">
+    <w:nsid w:val="29CD4E97"/>
+    <w:multiLevelType w:val="hybridMultilevel"/>
+    <w:tmpl w:val="8A14B476"/>
+    <w:lvl w:ilvl="0" w:tplc="3C667F62">
+      <w:start w:val="1"/>
+      <w:numFmt w:val="decimal"/>
+      <w:lvlText w:val="%1."/>
+      <w:lvlJc w:val="left"/>
+      <w:pPr>
+        <w:ind w:left="720" w:hanging="360"/>
+      </w:pPr>
+    </w:lvl>
+    <w:lvl w:ilvl="1" w:tplc="08090019" w:tentative="1">
+      <w:start w:val="1"/>
+      <w:numFmt w:val="lowerLetter"/>
+      <w:lvlText w:val="%2."/>
+      <w:lvlJc w:val="left"/>
+      <w:pPr>
+        <w:ind w:left="1440" w:hanging="360"/>
+      </w:pPr>
+    </w:lvl>
+    <w:lvl w:ilvl="2" w:tplc="0809001B" w:tentative="1">
+      <w:start w:val="1"/>
+      <w:numFmt w:val="lowerRoman"/>
+      <w:lvlText w:val="%3."/>
+      <w:lvlJc w:val="right"/>
+      <w:pPr>
+        <w:ind w:left="2160" w:hanging="180"/>
+      </w:pPr>
+    </w:lvl>
+    <w:lvl w:ilvl="3" w:tplc="0809000F" w:tentative="1">
+      <w:start w:val="1"/>
+      <w:numFmt w:val="decimal"/>
+      <w:lvlText w:val="%4."/>
+      <w:lvlJc w:val="left"/>
+      <w:pPr>
+        <w:ind w:left="2880" w:hanging="360"/>
+      </w:pPr>
+    </w:lvl>
+    <w:lvl w:ilvl="4" w:tplc="08090019" w:tentative="1">
+      <w:start w:val="1"/>
+      <w:numFmt w:val="lowerLetter"/>
+      <w:lvlText w:val="%5."/>
+      <w:lvlJc w:val="left"/>
+      <w:pPr>
+        <w:ind w:left="3600" w:hanging="360"/>
+      </w:pPr>
+    </w:lvl>
+    <w:lvl w:ilvl="5" w:tplc="0809001B" w:tentative="1">
+      <w:start w:val="1"/>
+      <w:numFmt w:val="lowerRoman"/>
+      <w:lvlText w:val="%6."/>
+      <w:lvlJc w:val="right"/>
+      <w:pPr>
+        <w:ind w:left="4320" w:hanging="180"/>
+      </w:pPr>
+    </w:lvl>
+    <w:lvl w:ilvl="6" w:tplc="0809000F" w:tentative="1">
+      <w:start w:val="1"/>
+      <w:numFmt w:val="decimal"/>
+      <w:lvlText w:val="%7."/>
+      <w:lvlJc w:val="left"/>
+      <w:pPr>
+        <w:ind w:left="5040" w:hanging="360"/>
+      </w:pPr>
+    </w:lvl>
+    <w:lvl w:ilvl="7" w:tplc="08090019" w:tentative="1">
+      <w:start w:val="1"/>
+      <w:numFmt w:val="lowerLetter"/>
+      <w:lvlText w:val="%8."/>
+      <w:lvlJc w:val="left"/>
+      <w:pPr>
+        <w:ind w:left="5760" w:hanging="360"/>
+      </w:pPr>
+    </w:lvl>
+    <w:lvl w:ilvl="8" w:tplc="0809001B" w:tentative="1">
+      <w:start w:val="1"/>
+      <w:numFmt w:val="lowerRoman"/>
+      <w:lvlText w:val="%9."/>
+      <w:lvlJc w:val="right"/>
+      <w:pPr>
+        <w:ind w:left="6480" w:hanging="180"/>
+      </w:pPr>
+    </w:lvl>
+  </w:abstractNum>
+  <w:abstractNum w:abstractNumId="4" w15:restartNumberingAfterBreak="0">
+    <w:nsid w:val="35897CDF"/>
+    <w:multiLevelType w:val="hybridMultilevel"/>
+    <w:tmpl w:val="7174DA32"/>
+    <w:lvl w:ilvl="0" w:tplc="08090001">
+      <w:start w:val="1"/>
+      <w:numFmt w:val="bullet"/>
+      <w:lvlText w:val=""/>
+      <w:lvlJc w:val="left"/>
+      <w:pPr>
+        <w:ind w:left="720" w:hanging="360"/>
+      </w:pPr>
+      <w:rPr>
+        <w:rFonts w:ascii="Symbol" w:hAnsi="Symbol" w:hint="default"/>
+      </w:rPr>
+    </w:lvl>
+    <w:lvl w:ilvl="1" w:tplc="08090003" w:tentative="1">
+      <w:start w:val="1"/>
+      <w:numFmt w:val="bullet"/>
+      <w:lvlText w:val="o"/>
+      <w:lvlJc w:val="left"/>
+      <w:pPr>
+        <w:ind w:left="1440" w:hanging="360"/>
+      </w:pPr>
+      <w:rPr>
+        <w:rFonts w:ascii="Courier New" w:hAnsi="Courier New" w:cs="Courier New" w:hint="default"/>
+      </w:rPr>
+    </w:lvl>
+    <w:lvl w:ilvl="2" w:tplc="08090005" w:tentative="1">
+      <w:start w:val="1"/>
+      <w:numFmt w:val="bullet"/>
+      <w:lvlText w:val=""/>
+      <w:lvlJc w:val="left"/>
+      <w:pPr>
+        <w:ind w:left="2160" w:hanging="360"/>
+      </w:pPr>
+      <w:rPr>
+        <w:rFonts w:ascii="Wingdings" w:hAnsi="Wingdings" w:hint="default"/>
+      </w:rPr>
+    </w:lvl>
+    <w:lvl w:ilvl="3" w:tplc="08090001" w:tentative="1">
+      <w:start w:val="1"/>
+      <w:numFmt w:val="bullet"/>
+      <w:lvlText w:val=""/>
+      <w:lvlJc w:val="left"/>
+      <w:pPr>
+        <w:ind w:left="2880" w:hanging="360"/>
+      </w:pPr>
+      <w:rPr>
+        <w:rFonts w:ascii="Symbol" w:hAnsi="Symbol" w:hint="default"/>
+      </w:rPr>
+    </w:lvl>
+    <w:lvl w:ilvl="4" w:tplc="08090003" w:tentative="1">
+      <w:start w:val="1"/>
+      <w:numFmt w:val="bullet"/>
+      <w:lvlText w:val="o"/>
+      <w:lvlJc w:val="left"/>
+      <w:pPr>
+        <w:ind w:left="3600" w:hanging="360"/>
+      </w:pPr>
+      <w:rPr>
+        <w:rFonts w:ascii="Courier New" w:hAnsi="Courier New" w:cs="Courier New" w:hint="default"/>
+      </w:rPr>
+    </w:lvl>
+    <w:lvl w:ilvl="5" w:tplc="08090005" w:tentative="1">
+      <w:start w:val="1"/>
+      <w:numFmt w:val="bullet"/>
+      <w:lvlText w:val=""/>
+      <w:lvlJc w:val="left"/>
+      <w:pPr>
+        <w:ind w:left="4320" w:hanging="360"/>
+      </w:pPr>
+      <w:rPr>
+        <w:rFonts w:ascii="Wingdings" w:hAnsi="Wingdings" w:hint="default"/>
+      </w:rPr>
+    </w:lvl>
+    <w:lvl w:ilvl="6" w:tplc="08090001" w:tentative="1">
+      <w:start w:val="1"/>
+      <w:numFmt w:val="bullet"/>
+      <w:lvlText w:val=""/>
+      <w:lvlJc w:val="left"/>
+      <w:pPr>
+        <w:ind w:left="5040" w:hanging="360"/>
+      </w:pPr>
+      <w:rPr>
+        <w:rFonts w:ascii="Symbol" w:hAnsi="Symbol" w:hint="default"/>
+      </w:rPr>
+    </w:lvl>
+    <w:lvl w:ilvl="7" w:tplc="08090003" w:tentative="1">
+      <w:start w:val="1"/>
+      <w:numFmt w:val="bullet"/>
+      <w:lvlText w:val="o"/>
+      <w:lvlJc w:val="left"/>
+      <w:pPr>
+        <w:ind w:left="5760" w:hanging="360"/>
+      </w:pPr>
+      <w:rPr>
+        <w:rFonts w:ascii="Courier New" w:hAnsi="Courier New" w:cs="Courier New" w:hint="default"/>
+      </w:rPr>
+    </w:lvl>
+    <w:lvl w:ilvl="8" w:tplc="08090005" w:tentative="1">
+      <w:start w:val="1"/>
+      <w:numFmt w:val="bullet"/>
+      <w:lvlText w:val=""/>
+      <w:lvlJc w:val="left"/>
+      <w:pPr>
+        <w:ind w:left="6480" w:hanging="360"/>
+      </w:pPr>
+      <w:rPr>
+        <w:rFonts w:ascii="Wingdings" w:hAnsi="Wingdings" w:hint="default"/>
+      </w:rPr>
+    </w:lvl>
+  </w:abstractNum>
+  <w:abstractNum w:abstractNumId="5" w15:restartNumberingAfterBreak="0">
     <w:nsid w:val="546A2873"/>
     <w:multiLevelType w:val="hybridMultilevel"/>
     <w:tmpl w:val="01A465E6"/>
@@ -1775,7 +4552,7 @@
       </w:rPr>
     </w:lvl>
   </w:abstractNum>
-  <w:abstractNum w:abstractNumId="3" w15:restartNumberingAfterBreak="0">
+  <w:abstractNum w:abstractNumId="6" w15:restartNumberingAfterBreak="0">
     <w:nsid w:val="573E3AD2"/>
     <w:multiLevelType w:val="hybridMultilevel"/>
     <w:tmpl w:val="04AA3AAE"/>
@@ -1888,11 +4665,97 @@
       </w:rPr>
     </w:lvl>
   </w:abstractNum>
-  <w:abstractNum w:abstractNumId="4" w15:restartNumberingAfterBreak="0">
+  <w:abstractNum w:abstractNumId="7" w15:restartNumberingAfterBreak="0">
+    <w:nsid w:val="692327E8"/>
+    <w:multiLevelType w:val="multilevel"/>
+    <w:tmpl w:val="FAECD670"/>
+    <w:lvl w:ilvl="0">
+      <w:start w:val="1"/>
+      <w:numFmt w:val="upperRoman"/>
+      <w:lvlText w:val="%1."/>
+      <w:lvlJc w:val="left"/>
+      <w:pPr>
+        <w:ind w:left="0" w:firstLine="0"/>
+      </w:pPr>
+    </w:lvl>
+    <w:lvl w:ilvl="1">
+      <w:start w:val="1"/>
+      <w:numFmt w:val="upperLetter"/>
+      <w:lvlText w:val="%2."/>
+      <w:lvlJc w:val="left"/>
+      <w:pPr>
+        <w:ind w:left="720" w:firstLine="0"/>
+      </w:pPr>
+    </w:lvl>
+    <w:lvl w:ilvl="2">
+      <w:start w:val="1"/>
+      <w:numFmt w:val="decimal"/>
+      <w:lvlText w:val="%3."/>
+      <w:lvlJc w:val="left"/>
+      <w:pPr>
+        <w:ind w:left="1440" w:firstLine="0"/>
+      </w:pPr>
+    </w:lvl>
+    <w:lvl w:ilvl="3">
+      <w:start w:val="1"/>
+      <w:numFmt w:val="lowerLetter"/>
+      <w:lvlText w:val="%4)"/>
+      <w:lvlJc w:val="left"/>
+      <w:pPr>
+        <w:ind w:left="2160" w:firstLine="0"/>
+      </w:pPr>
+    </w:lvl>
+    <w:lvl w:ilvl="4">
+      <w:start w:val="1"/>
+      <w:numFmt w:val="decimal"/>
+      <w:lvlText w:val="(%5)"/>
+      <w:lvlJc w:val="left"/>
+      <w:pPr>
+        <w:ind w:left="2880" w:firstLine="0"/>
+      </w:pPr>
+    </w:lvl>
+    <w:lvl w:ilvl="5">
+      <w:start w:val="1"/>
+      <w:numFmt w:val="lowerLetter"/>
+      <w:lvlText w:val="(%6)"/>
+      <w:lvlJc w:val="left"/>
+      <w:pPr>
+        <w:ind w:left="3600" w:firstLine="0"/>
+      </w:pPr>
+    </w:lvl>
+    <w:lvl w:ilvl="6">
+      <w:start w:val="1"/>
+      <w:numFmt w:val="lowerRoman"/>
+      <w:lvlText w:val="(%7)"/>
+      <w:lvlJc w:val="left"/>
+      <w:pPr>
+        <w:ind w:left="4320" w:firstLine="0"/>
+      </w:pPr>
+    </w:lvl>
+    <w:lvl w:ilvl="7">
+      <w:start w:val="1"/>
+      <w:numFmt w:val="lowerLetter"/>
+      <w:lvlText w:val="(%8)"/>
+      <w:lvlJc w:val="left"/>
+      <w:pPr>
+        <w:ind w:left="5040" w:firstLine="0"/>
+      </w:pPr>
+    </w:lvl>
+    <w:lvl w:ilvl="8">
+      <w:start w:val="1"/>
+      <w:numFmt w:val="lowerRoman"/>
+      <w:lvlText w:val="(%9)"/>
+      <w:lvlJc w:val="left"/>
+      <w:pPr>
+        <w:ind w:left="5760" w:firstLine="0"/>
+      </w:pPr>
+    </w:lvl>
+  </w:abstractNum>
+  <w:abstractNum w:abstractNumId="8" w15:restartNumberingAfterBreak="0">
     <w:nsid w:val="79307786"/>
     <w:multiLevelType w:val="hybridMultilevel"/>
-    <w:tmpl w:val="2F5094AE"/>
-    <w:lvl w:ilvl="0" w:tplc="FFFFFFFF">
+    <w:tmpl w:val="6888B60A"/>
+    <w:lvl w:ilvl="0" w:tplc="32DCA2BA">
       <w:start w:val="1"/>
       <w:numFmt w:val="decimal"/>
       <w:lvlText w:val="%1."/>
@@ -1977,8 +4840,189 @@
       </w:pPr>
     </w:lvl>
   </w:abstractNum>
+  <w:abstractNum w:abstractNumId="9" w15:restartNumberingAfterBreak="0">
+    <w:nsid w:val="7E7D66F8"/>
+    <w:multiLevelType w:val="multilevel"/>
+    <w:tmpl w:val="08090025"/>
+    <w:lvl w:ilvl="0">
+      <w:start w:val="1"/>
+      <w:numFmt w:val="decimal"/>
+      <w:pStyle w:val="Heading1"/>
+      <w:lvlText w:val="%1"/>
+      <w:lvlJc w:val="left"/>
+      <w:pPr>
+        <w:ind w:left="432" w:hanging="432"/>
+      </w:pPr>
+    </w:lvl>
+    <w:lvl w:ilvl="1">
+      <w:start w:val="1"/>
+      <w:numFmt w:val="decimal"/>
+      <w:pStyle w:val="Heading2"/>
+      <w:lvlText w:val="%1.%2"/>
+      <w:lvlJc w:val="left"/>
+      <w:pPr>
+        <w:ind w:left="576" w:hanging="576"/>
+      </w:pPr>
+    </w:lvl>
+    <w:lvl w:ilvl="2">
+      <w:start w:val="1"/>
+      <w:numFmt w:val="decimal"/>
+      <w:pStyle w:val="Heading3"/>
+      <w:lvlText w:val="%1.%2.%3"/>
+      <w:lvlJc w:val="left"/>
+      <w:pPr>
+        <w:ind w:left="720" w:hanging="720"/>
+      </w:pPr>
+    </w:lvl>
+    <w:lvl w:ilvl="3">
+      <w:start w:val="1"/>
+      <w:numFmt w:val="decimal"/>
+      <w:pStyle w:val="Heading4"/>
+      <w:lvlText w:val="%1.%2.%3.%4"/>
+      <w:lvlJc w:val="left"/>
+      <w:pPr>
+        <w:ind w:left="864" w:hanging="864"/>
+      </w:pPr>
+    </w:lvl>
+    <w:lvl w:ilvl="4">
+      <w:start w:val="1"/>
+      <w:numFmt w:val="decimal"/>
+      <w:pStyle w:val="Heading5"/>
+      <w:lvlText w:val="%1.%2.%3.%4.%5"/>
+      <w:lvlJc w:val="left"/>
+      <w:pPr>
+        <w:ind w:left="1008" w:hanging="1008"/>
+      </w:pPr>
+    </w:lvl>
+    <w:lvl w:ilvl="5">
+      <w:start w:val="1"/>
+      <w:numFmt w:val="decimal"/>
+      <w:pStyle w:val="Heading6"/>
+      <w:lvlText w:val="%1.%2.%3.%4.%5.%6"/>
+      <w:lvlJc w:val="left"/>
+      <w:pPr>
+        <w:ind w:left="1152" w:hanging="1152"/>
+      </w:pPr>
+    </w:lvl>
+    <w:lvl w:ilvl="6">
+      <w:start w:val="1"/>
+      <w:numFmt w:val="decimal"/>
+      <w:pStyle w:val="Heading7"/>
+      <w:lvlText w:val="%1.%2.%3.%4.%5.%6.%7"/>
+      <w:lvlJc w:val="left"/>
+      <w:pPr>
+        <w:ind w:left="1296" w:hanging="1296"/>
+      </w:pPr>
+    </w:lvl>
+    <w:lvl w:ilvl="7">
+      <w:start w:val="1"/>
+      <w:numFmt w:val="decimal"/>
+      <w:pStyle w:val="Heading8"/>
+      <w:lvlText w:val="%1.%2.%3.%4.%5.%6.%7.%8"/>
+      <w:lvlJc w:val="left"/>
+      <w:pPr>
+        <w:ind w:left="1440" w:hanging="1440"/>
+      </w:pPr>
+    </w:lvl>
+    <w:lvl w:ilvl="8">
+      <w:start w:val="1"/>
+      <w:numFmt w:val="decimal"/>
+      <w:pStyle w:val="Heading9"/>
+      <w:lvlText w:val="%1.%2.%3.%4.%5.%6.%7.%8.%9"/>
+      <w:lvlJc w:val="left"/>
+      <w:pPr>
+        <w:ind w:left="1584" w:hanging="1584"/>
+      </w:pPr>
+    </w:lvl>
+  </w:abstractNum>
+  <w:abstractNum w:abstractNumId="10" w15:restartNumberingAfterBreak="0">
+    <w:nsid w:val="7EE9063C"/>
+    <w:multiLevelType w:val="multilevel"/>
+    <w:tmpl w:val="0809001D"/>
+    <w:lvl w:ilvl="0">
+      <w:start w:val="1"/>
+      <w:numFmt w:val="decimal"/>
+      <w:lvlText w:val="%1)"/>
+      <w:lvlJc w:val="left"/>
+      <w:pPr>
+        <w:ind w:left="360" w:hanging="360"/>
+      </w:pPr>
+    </w:lvl>
+    <w:lvl w:ilvl="1">
+      <w:start w:val="1"/>
+      <w:numFmt w:val="lowerLetter"/>
+      <w:lvlText w:val="%2)"/>
+      <w:lvlJc w:val="left"/>
+      <w:pPr>
+        <w:ind w:left="720" w:hanging="360"/>
+      </w:pPr>
+    </w:lvl>
+    <w:lvl w:ilvl="2">
+      <w:start w:val="1"/>
+      <w:numFmt w:val="lowerRoman"/>
+      <w:lvlText w:val="%3)"/>
+      <w:lvlJc w:val="left"/>
+      <w:pPr>
+        <w:ind w:left="1080" w:hanging="360"/>
+      </w:pPr>
+    </w:lvl>
+    <w:lvl w:ilvl="3">
+      <w:start w:val="1"/>
+      <w:numFmt w:val="decimal"/>
+      <w:lvlText w:val="(%4)"/>
+      <w:lvlJc w:val="left"/>
+      <w:pPr>
+        <w:ind w:left="1440" w:hanging="360"/>
+      </w:pPr>
+    </w:lvl>
+    <w:lvl w:ilvl="4">
+      <w:start w:val="1"/>
+      <w:numFmt w:val="lowerLetter"/>
+      <w:lvlText w:val="(%5)"/>
+      <w:lvlJc w:val="left"/>
+      <w:pPr>
+        <w:ind w:left="1800" w:hanging="360"/>
+      </w:pPr>
+    </w:lvl>
+    <w:lvl w:ilvl="5">
+      <w:start w:val="1"/>
+      <w:numFmt w:val="lowerRoman"/>
+      <w:lvlText w:val="(%6)"/>
+      <w:lvlJc w:val="left"/>
+      <w:pPr>
+        <w:ind w:left="2160" w:hanging="360"/>
+      </w:pPr>
+    </w:lvl>
+    <w:lvl w:ilvl="6">
+      <w:start w:val="1"/>
+      <w:numFmt w:val="decimal"/>
+      <w:lvlText w:val="%7."/>
+      <w:lvlJc w:val="left"/>
+      <w:pPr>
+        <w:ind w:left="2520" w:hanging="360"/>
+      </w:pPr>
+    </w:lvl>
+    <w:lvl w:ilvl="7">
+      <w:start w:val="1"/>
+      <w:numFmt w:val="lowerLetter"/>
+      <w:lvlText w:val="%8."/>
+      <w:lvlJc w:val="left"/>
+      <w:pPr>
+        <w:ind w:left="2880" w:hanging="360"/>
+      </w:pPr>
+    </w:lvl>
+    <w:lvl w:ilvl="8">
+      <w:start w:val="1"/>
+      <w:numFmt w:val="lowerRoman"/>
+      <w:lvlText w:val="%9."/>
+      <w:lvlJc w:val="left"/>
+      <w:pPr>
+        <w:ind w:left="3240" w:hanging="360"/>
+      </w:pPr>
+    </w:lvl>
+  </w:abstractNum>
   <w:num w:numId="1" w16cid:durableId="2075082800">
-    <w:abstractNumId w:val="3"/>
+    <w:abstractNumId w:val="6"/>
   </w:num>
   <w:num w:numId="2" w16cid:durableId="1471097875">
     <w:abstractNumId w:val="1"/>
@@ -1987,10 +5031,28 @@
     <w:abstractNumId w:val="0"/>
   </w:num>
   <w:num w:numId="4" w16cid:durableId="469400546">
-    <w:abstractNumId w:val="4"/>
+    <w:abstractNumId w:val="8"/>
   </w:num>
   <w:num w:numId="5" w16cid:durableId="1381977018">
+    <w:abstractNumId w:val="5"/>
+  </w:num>
+  <w:num w:numId="6" w16cid:durableId="2123764200">
+    <w:abstractNumId w:val="3"/>
+  </w:num>
+  <w:num w:numId="7" w16cid:durableId="508104350">
+    <w:abstractNumId w:val="10"/>
+  </w:num>
+  <w:num w:numId="8" w16cid:durableId="1496266118">
     <w:abstractNumId w:val="2"/>
+  </w:num>
+  <w:num w:numId="9" w16cid:durableId="288441440">
+    <w:abstractNumId w:val="7"/>
+  </w:num>
+  <w:num w:numId="10" w16cid:durableId="1292830482">
+    <w:abstractNumId w:val="9"/>
+  </w:num>
+  <w:num w:numId="11" w16cid:durableId="2134787180">
+    <w:abstractNumId w:val="4"/>
   </w:num>
 </w:numbering>
 </file>
@@ -2415,6 +5477,9 @@
     <w:pPr>
       <w:keepNext/>
       <w:keepLines/>
+      <w:numPr>
+        <w:numId w:val="10"/>
+      </w:numPr>
       <w:spacing w:before="360" w:after="80"/>
       <w:outlineLvl w:val="0"/>
     </w:pPr>
@@ -2432,21 +5497,25 @@
     <w:next w:val="Normal"/>
     <w:link w:val="Heading2Char"/>
     <w:uiPriority w:val="9"/>
-    <w:semiHidden/>
     <w:unhideWhenUsed/>
     <w:qFormat/>
-    <w:rsid w:val="007E355F"/>
+    <w:rsid w:val="00103499"/>
     <w:pPr>
       <w:keepNext/>
       <w:keepLines/>
+      <w:numPr>
+        <w:ilvl w:val="1"/>
+        <w:numId w:val="10"/>
+      </w:numPr>
       <w:spacing w:before="160" w:after="80"/>
       <w:outlineLvl w:val="1"/>
     </w:pPr>
     <w:rPr>
-      <w:rFonts w:asciiTheme="majorHAnsi" w:eastAsiaTheme="majorEastAsia" w:hAnsiTheme="majorHAnsi" w:cstheme="majorBidi"/>
-      <w:color w:val="0F4761" w:themeColor="accent1" w:themeShade="BF"/>
-      <w:sz w:val="32"/>
+      <w:rFonts w:eastAsiaTheme="majorEastAsia" w:cstheme="majorBidi"/>
+      <w:b/>
+      <w:sz w:val="28"/>
       <w:szCs w:val="32"/>
+      <w:u w:val="single"/>
     </w:rPr>
   </w:style>
   <w:style w:type="paragraph" w:styleId="Heading3">
@@ -2455,13 +5524,16 @@
     <w:next w:val="Normal"/>
     <w:link w:val="Heading3Char"/>
     <w:uiPriority w:val="9"/>
-    <w:semiHidden/>
     <w:unhideWhenUsed/>
     <w:qFormat/>
     <w:rsid w:val="007E355F"/>
     <w:pPr>
       <w:keepNext/>
       <w:keepLines/>
+      <w:numPr>
+        <w:ilvl w:val="2"/>
+        <w:numId w:val="10"/>
+      </w:numPr>
       <w:spacing w:before="160" w:after="80"/>
       <w:outlineLvl w:val="2"/>
     </w:pPr>
@@ -2478,13 +5550,16 @@
     <w:next w:val="Normal"/>
     <w:link w:val="Heading4Char"/>
     <w:uiPriority w:val="9"/>
-    <w:semiHidden/>
     <w:unhideWhenUsed/>
     <w:qFormat/>
     <w:rsid w:val="007E355F"/>
     <w:pPr>
       <w:keepNext/>
       <w:keepLines/>
+      <w:numPr>
+        <w:ilvl w:val="3"/>
+        <w:numId w:val="10"/>
+      </w:numPr>
       <w:spacing w:before="80" w:after="40"/>
       <w:outlineLvl w:val="3"/>
     </w:pPr>
@@ -2508,6 +5583,10 @@
     <w:pPr>
       <w:keepNext/>
       <w:keepLines/>
+      <w:numPr>
+        <w:ilvl w:val="4"/>
+        <w:numId w:val="10"/>
+      </w:numPr>
       <w:spacing w:before="80" w:after="40"/>
       <w:outlineLvl w:val="4"/>
     </w:pPr>
@@ -2529,6 +5608,10 @@
     <w:pPr>
       <w:keepNext/>
       <w:keepLines/>
+      <w:numPr>
+        <w:ilvl w:val="5"/>
+        <w:numId w:val="10"/>
+      </w:numPr>
       <w:spacing w:before="40" w:after="0"/>
       <w:outlineLvl w:val="5"/>
     </w:pPr>
@@ -2552,6 +5635,10 @@
     <w:pPr>
       <w:keepNext/>
       <w:keepLines/>
+      <w:numPr>
+        <w:ilvl w:val="6"/>
+        <w:numId w:val="10"/>
+      </w:numPr>
       <w:spacing w:before="40" w:after="0"/>
       <w:outlineLvl w:val="6"/>
     </w:pPr>
@@ -2573,6 +5660,10 @@
     <w:pPr>
       <w:keepNext/>
       <w:keepLines/>
+      <w:numPr>
+        <w:ilvl w:val="7"/>
+        <w:numId w:val="10"/>
+      </w:numPr>
       <w:spacing w:after="0"/>
       <w:outlineLvl w:val="7"/>
     </w:pPr>
@@ -2596,6 +5687,10 @@
     <w:pPr>
       <w:keepNext/>
       <w:keepLines/>
+      <w:numPr>
+        <w:ilvl w:val="8"/>
+        <w:numId w:val="10"/>
+      </w:numPr>
       <w:spacing w:after="0"/>
       <w:outlineLvl w:val="8"/>
     </w:pPr>
@@ -2651,13 +5746,13 @@
     <w:basedOn w:val="DefaultParagraphFont"/>
     <w:link w:val="Heading2"/>
     <w:uiPriority w:val="9"/>
-    <w:semiHidden/>
-    <w:rsid w:val="007E355F"/>
+    <w:rsid w:val="00103499"/>
     <w:rPr>
-      <w:rFonts w:asciiTheme="majorHAnsi" w:eastAsiaTheme="majorEastAsia" w:hAnsiTheme="majorHAnsi" w:cstheme="majorBidi"/>
-      <w:color w:val="0F4761" w:themeColor="accent1" w:themeShade="BF"/>
-      <w:sz w:val="32"/>
+      <w:rFonts w:ascii="Arial" w:eastAsiaTheme="majorEastAsia" w:hAnsi="Arial" w:cstheme="majorBidi"/>
+      <w:b/>
+      <w:sz w:val="28"/>
       <w:szCs w:val="32"/>
+      <w:u w:val="single"/>
     </w:rPr>
   </w:style>
   <w:style w:type="character" w:customStyle="1" w:styleId="Heading3Char">
@@ -2665,7 +5760,6 @@
     <w:basedOn w:val="DefaultParagraphFont"/>
     <w:link w:val="Heading3"/>
     <w:uiPriority w:val="9"/>
-    <w:semiHidden/>
     <w:rsid w:val="007E355F"/>
     <w:rPr>
       <w:rFonts w:eastAsiaTheme="majorEastAsia" w:cstheme="majorBidi"/>
@@ -2679,7 +5773,6 @@
     <w:basedOn w:val="DefaultParagraphFont"/>
     <w:link w:val="Heading4"/>
     <w:uiPriority w:val="9"/>
-    <w:semiHidden/>
     <w:rsid w:val="007E355F"/>
     <w:rPr>
       <w:rFonts w:eastAsiaTheme="majorEastAsia" w:cstheme="majorBidi"/>
@@ -3166,6 +6259,25 @@
       <w:color w:val="96607D" w:themeColor="followedHyperlink"/>
       <w:u w:val="single"/>
     </w:rPr>
+  </w:style>
+  <w:style w:type="table" w:styleId="TableGrid">
+    <w:name w:val="Table Grid"/>
+    <w:basedOn w:val="TableNormal"/>
+    <w:uiPriority w:val="39"/>
+    <w:rsid w:val="00E27272"/>
+    <w:pPr>
+      <w:spacing w:after="0" w:line="240" w:lineRule="auto"/>
+    </w:pPr>
+    <w:tblPr>
+      <w:tblBorders>
+        <w:top w:val="single" w:sz="4" w:space="0" w:color="auto"/>
+        <w:left w:val="single" w:sz="4" w:space="0" w:color="auto"/>
+        <w:bottom w:val="single" w:sz="4" w:space="0" w:color="auto"/>
+        <w:right w:val="single" w:sz="4" w:space="0" w:color="auto"/>
+        <w:insideH w:val="single" w:sz="4" w:space="0" w:color="auto"/>
+        <w:insideV w:val="single" w:sz="4" w:space="0" w:color="auto"/>
+      </w:tblBorders>
+    </w:tblPr>
   </w:style>
 </w:styles>
 </file>

</xml_diff>